<commit_message>
feat: refresh skills and update portfolio resume
</commit_message>
<xml_diff>
--- a/client/public/portfolio-assets/Bharath_Raj_P_Resume.docx
+++ b/client/public/portfolio-assets/Bharath_Raj_P_Resume.docx
@@ -4,59 +4,59 @@
   <w:body>
     <w:p>
       <w:pPr>
-        <w:spacing w:after="20"/>
+        <w:spacing w:before="0" w:after="20" w:line="240" w:lineRule="auto"/>
         <w:jc w:val="center"/>
       </w:pPr>
       <w:r>
         <w:rPr>
-          <w:rFonts w:ascii="Aptos" w:hAnsi="Aptos" w:eastAsia="Aptos"/>
+          <w:rFonts w:ascii="Aptos Display" w:hAnsi="Aptos Display"/>
           <w:b/>
-          <w:color w:val="17365D"/>
-          <w:sz w:val="36"/>
+          <w:color w:val="101C1A"/>
+          <w:sz w:val="37"/>
         </w:rPr>
         <w:t>BHARATH RAJ P</w:t>
       </w:r>
     </w:p>
     <w:p>
       <w:pPr>
-        <w:spacing w:after="40"/>
+        <w:spacing w:before="0" w:after="40" w:line="240" w:lineRule="auto"/>
         <w:jc w:val="center"/>
       </w:pPr>
       <w:r>
         <w:rPr>
-          <w:rFonts w:ascii="Aptos" w:hAnsi="Aptos" w:eastAsia="Aptos"/>
+          <w:rFonts w:ascii="Aptos" w:hAnsi="Aptos"/>
           <w:b/>
-          <w:color w:val="444444"/>
-          <w:sz w:val="20"/>
+          <w:color w:val="0A5C48"/>
+          <w:sz w:val="18"/>
         </w:rPr>
-        <w:t>Software Engineer | Backend &amp; AI Systems</w:t>
+        <w:t>Software Development Intern | Backend, Full-Stack &amp; AI Systems</w:t>
       </w:r>
     </w:p>
     <w:p>
       <w:pPr>
-        <w:spacing w:after="80"/>
+        <w:spacing w:before="0" w:after="0" w:line="240" w:lineRule="auto"/>
         <w:jc w:val="center"/>
       </w:pPr>
       <w:r>
         <w:rPr>
-          <w:rFonts w:ascii="Aptos" w:hAnsi="Aptos" w:eastAsia="Aptos"/>
-          <w:b w:val="0"/>
-          <w:color w:val="333333"/>
           <w:sz w:val="16"/>
         </w:rPr>
-        <w:t>+91 93445 18573</w:t>
+        <w:t>Tamil Nadu, India  |  +91 93445 18573  |  bharathraj14120@gmail.com</w:t>
       </w:r>
-      <w:r>
-        <w:t xml:space="preserve">  |  </w:t>
-      </w:r>
+    </w:p>
+    <w:p>
+      <w:pPr>
+        <w:spacing w:before="0" w:after="40" w:line="240" w:lineRule="auto"/>
+        <w:jc w:val="center"/>
+      </w:pPr>
       <w:hyperlink r:id="rId9">
         <w:r>
           <w:rPr>
-            <w:color w:val="1F4E79"/>
-            <w:u w:val="single"/>
-            <w:sz w:val="18"/>
+            <w:rStyle w:val="Hyperlink"/>
+            <w:color w:val="0A5C48"/>
+            <w:u w:val="none"/>
           </w:rPr>
-          <w:t>bharathraj14120@gmail.com</w:t>
+          <w:t>LinkedIn</w:t>
         </w:r>
       </w:hyperlink>
       <w:r>
@@ -65,11 +65,11 @@
       <w:hyperlink r:id="rId10">
         <w:r>
           <w:rPr>
-            <w:color w:val="1F4E79"/>
-            <w:u w:val="single"/>
-            <w:sz w:val="18"/>
+            <w:rStyle w:val="Hyperlink"/>
+            <w:color w:val="0A5C48"/>
+            <w:u w:val="none"/>
           </w:rPr>
-          <w:t>linkedin.com/in/bharathrajp14</w:t>
+          <w:t>GitHub</w:t>
         </w:r>
       </w:hyperlink>
       <w:r>
@@ -78,446 +78,422 @@
       <w:hyperlink r:id="rId11">
         <w:r>
           <w:rPr>
-            <w:color w:val="1F4E79"/>
-            <w:u w:val="single"/>
-            <w:sz w:val="18"/>
+            <w:rStyle w:val="Hyperlink"/>
+            <w:color w:val="0A5C48"/>
+            <w:u w:val="none"/>
           </w:rPr>
-          <w:t>github.com/bharathrajp14</w:t>
+          <w:t>Portfolio</w:t>
+        </w:r>
+      </w:hyperlink>
+      <w:r>
+        <w:t xml:space="preserve">  |  </w:t>
+      </w:r>
+      <w:hyperlink r:id="rId12">
+        <w:r>
+          <w:rPr>
+            <w:rStyle w:val="Hyperlink"/>
+            <w:color w:val="0A5C48"/>
+            <w:u w:val="none"/>
+          </w:rPr>
+          <w:t>Skillrack</w:t>
         </w:r>
       </w:hyperlink>
     </w:p>
     <w:p>
       <w:pPr>
-        <w:pStyle w:val="Heading1"/>
         <w:keepNext/>
+        <w:spacing w:before="80" w:after="20" w:line="240" w:lineRule="auto"/>
+        <w:pBdr>
+          <w:bottom w:val="single" w:sz="6" w:space="2" w:color="0A5C48"/>
+        </w:pBdr>
       </w:pPr>
       <w:r>
         <w:rPr>
-          <w:rFonts w:ascii="Aptos" w:hAnsi="Aptos" w:eastAsia="Aptos"/>
+          <w:rFonts w:ascii="Aptos Display" w:hAnsi="Aptos Display"/>
           <w:b/>
-          <w:color w:val="1F4E79"/>
-          <w:sz w:val="20"/>
+          <w:color w:val="0A5C48"/>
+          <w:sz w:val="19"/>
         </w:rPr>
-        <w:t>SUMMARY</w:t>
+        <w:t>PROFESSIONAL SUMMARY</w:t>
       </w:r>
     </w:p>
     <w:p>
       <w:pPr>
-        <w:spacing w:after="40" w:line="240" w:lineRule="auto"/>
+        <w:pStyle w:val="ResumeBody"/>
+        <w:spacing w:before="0" w:after="10" w:line="230" w:lineRule="auto"/>
       </w:pPr>
       <w:r>
-        <w:rPr>
-          <w:rFonts w:ascii="Aptos" w:hAnsi="Aptos" w:eastAsia="Aptos"/>
-          <w:b w:val="0"/>
-          <w:color w:val="222222"/>
-          <w:sz w:val="17"/>
-        </w:rPr>
-        <w:t>Software Engineering student and Software Development Intern focused on backend engineering, full-stack development, and AI systems. Experience building REST APIs, authentication workflows, asynchronous services, data platforms, and AI-powered automation using Python, FastAPI, React, Node.js, SQL, PostgreSQL, MongoDB, and SQLite. Built BR JARVIS, a local-first AI operating runtime with orchestration, model routing, secure tool execution, persistent memory, multimodal interfaces, and post-condition verification.</w:t>
+        <w:t>Software Development Intern building React modules and REST API–driven workflows. Develops backend, full-stack, and AI-enabled applications with Python, JavaScript, FastAPI, Node.js, Express.js, SQL, and SQLite, with a security-conscious approach to authentication, data handling, and deployed web applications.</w:t>
       </w:r>
     </w:p>
     <w:p>
       <w:pPr>
-        <w:pStyle w:val="Heading1"/>
         <w:keepNext/>
+        <w:spacing w:before="80" w:after="20" w:line="240" w:lineRule="auto"/>
+        <w:pBdr>
+          <w:bottom w:val="single" w:sz="6" w:space="2" w:color="0A5C48"/>
+        </w:pBdr>
       </w:pPr>
       <w:r>
         <w:rPr>
-          <w:rFonts w:ascii="Aptos" w:hAnsi="Aptos" w:eastAsia="Aptos"/>
+          <w:rFonts w:ascii="Aptos Display" w:hAnsi="Aptos Display"/>
           <w:b/>
-          <w:color w:val="1F4E79"/>
-          <w:sz w:val="20"/>
+          <w:color w:val="0A5C48"/>
+          <w:sz w:val="19"/>
         </w:rPr>
         <w:t>EXPERIENCE</w:t>
       </w:r>
     </w:p>
     <w:p>
       <w:pPr>
-        <w:spacing w:after="0"/>
+        <w:spacing w:before="30" w:after="10" w:line="240" w:lineRule="auto"/>
       </w:pPr>
       <w:r>
         <w:rPr>
-          <w:rFonts w:ascii="Aptos" w:hAnsi="Aptos" w:eastAsia="Aptos"/>
           <w:b/>
-          <w:color w:val="222222"/>
-          <w:sz w:val="18"/>
+          <w:sz w:val="20"/>
         </w:rPr>
-        <w:t>Software Development Intern | Kevell Corp</w:t>
+        <w:t>Software Development Intern</w:t>
       </w:r>
       <w:r>
-        <w:rPr>
-          <w:rFonts w:ascii="Aptos" w:hAnsi="Aptos" w:eastAsia="Aptos"/>
-          <w:b w:val="0"/>
-          <w:color w:val="555555"/>
-          <w:sz w:val="17"/>
-        </w:rPr>
-        <w:t xml:space="preserve">  |  Present</w:t>
+        <w:t xml:space="preserve">  |  Kevell Corp  |  Present</w:t>
       </w:r>
     </w:p>
     <w:p>
       <w:pPr>
-        <w:pStyle w:val="ListBullet"/>
-        <w:spacing w:after="20" w:line="240" w:lineRule="auto"/>
-        <w:ind w:left="216" w:hanging="144"/>
+        <w:pStyle w:val="ResumeBullet"/>
+        <w:spacing w:before="0" w:after="5" w:line="226" w:lineRule="auto"/>
       </w:pPr>
       <w:r>
-        <w:rPr>
-          <w:rFonts w:ascii="Aptos" w:hAnsi="Aptos" w:eastAsia="Aptos"/>
-          <w:b w:val="0"/>
-          <w:color w:val="222222"/>
-          <w:sz w:val="17"/>
-        </w:rPr>
-        <w:t>Developed React.js modules and integrated REST APIs across authentication, vendor management, notifications, payments, and wallet workflows.</w:t>
+        <w:t>Develop React modules and integrate REST API workflows across authentication, vendor management, notifications, payments, and wallet functionality.</w:t>
       </w:r>
     </w:p>
     <w:p>
       <w:pPr>
-        <w:pStyle w:val="ListBullet"/>
-        <w:spacing w:after="20" w:line="240" w:lineRule="auto"/>
-        <w:ind w:left="216" w:hanging="144"/>
+        <w:pStyle w:val="ResumeBullet"/>
+        <w:spacing w:before="0" w:after="5" w:line="226" w:lineRule="auto"/>
       </w:pPr>
       <w:r>
-        <w:rPr>
-          <w:rFonts w:ascii="Aptos" w:hAnsi="Aptos" w:eastAsia="Aptos"/>
-          <w:b w:val="0"/>
-          <w:color w:val="222222"/>
-          <w:sz w:val="17"/>
-        </w:rPr>
-        <w:t>Worked with backend developers to connect frontend components with business logic, API services, and application workflows.</w:t>
+        <w:t>Collaborate with backend developers to validate API-driven user journeys, debug full-stack workflows, and manage changes through Git-based team practices.</w:t>
       </w:r>
     </w:p>
     <w:p>
       <w:pPr>
-        <w:pStyle w:val="ListBullet"/>
-        <w:spacing w:after="20" w:line="240" w:lineRule="auto"/>
-        <w:ind w:left="216" w:hanging="144"/>
+        <w:spacing w:before="30" w:after="10" w:line="240" w:lineRule="auto"/>
       </w:pPr>
       <w:r>
         <w:rPr>
-          <w:rFonts w:ascii="Aptos" w:hAnsi="Aptos" w:eastAsia="Aptos"/>
-          <w:b w:val="0"/>
-          <w:color w:val="222222"/>
-          <w:sz w:val="17"/>
+          <w:b/>
+          <w:sz w:val="20"/>
         </w:rPr>
-        <w:t>Used Git and collaborative development workflows for version control, debugging, and team-based software delivery.</w:t>
+        <w:t>Cybersecurity Intern</w:t>
+      </w:r>
+      <w:r>
+        <w:t xml:space="preserve">  |  NullClass  |  Jun 2025 – Jul 2025</w:t>
       </w:r>
     </w:p>
     <w:p>
       <w:pPr>
-        <w:spacing w:after="0"/>
+        <w:pStyle w:val="ResumeBullet"/>
+        <w:spacing w:before="0" w:after="5" w:line="226" w:lineRule="auto"/>
       </w:pPr>
       <w:r>
-        <w:rPr>
-          <w:rFonts w:ascii="Aptos" w:hAnsi="Aptos" w:eastAsia="Aptos"/>
-          <w:b/>
-          <w:color w:val="222222"/>
-          <w:sz w:val="18"/>
-        </w:rPr>
-        <w:t>Cybersecurity Intern | NullClass</w:t>
-      </w:r>
-      <w:r>
-        <w:rPr>
-          <w:rFonts w:ascii="Aptos" w:hAnsi="Aptos" w:eastAsia="Aptos"/>
-          <w:b w:val="0"/>
-          <w:color w:val="555555"/>
-          <w:sz w:val="17"/>
-        </w:rPr>
-        <w:t xml:space="preserve">  |  Jul 2024 - Aug 2024</w:t>
-      </w:r>
-    </w:p>
-    <w:p>
-      <w:pPr>
-        <w:pStyle w:val="ListBullet"/>
-        <w:spacing w:after="20" w:line="240" w:lineRule="auto"/>
-        <w:ind w:left="216" w:hanging="144"/>
-      </w:pPr>
-      <w:r>
-        <w:rPr>
-          <w:rFonts w:ascii="Aptos" w:hAnsi="Aptos" w:eastAsia="Aptos"/>
-          <w:b w:val="0"/>
-          <w:color w:val="222222"/>
-          <w:sz w:val="17"/>
-        </w:rPr>
-        <w:t>Studied common web vulnerabilities including SQL Injection, Cross-Site Scripting, and CSRF; practiced introductory penetration-testing workflows in controlled lab environments.</w:t>
-      </w:r>
-    </w:p>
-    <w:p>
-      <w:pPr>
-        <w:pStyle w:val="Heading1"/>
-        <w:keepNext/>
-      </w:pPr>
-      <w:r>
-        <w:rPr>
-          <w:rFonts w:ascii="Aptos" w:hAnsi="Aptos" w:eastAsia="Aptos"/>
-          <w:b/>
-          <w:color w:val="1F4E79"/>
-          <w:sz w:val="20"/>
-        </w:rPr>
-        <w:t>PROJECTS</w:t>
+        <w:t>Completed controlled training in ethical-hacking fundamentals, SQL injection, cross-site scripting, cross-site request forgery, and vulnerability reporting concepts.</w:t>
       </w:r>
     </w:p>
     <w:p>
       <w:pPr>
         <w:keepNext/>
-        <w:spacing w:after="0"/>
+        <w:spacing w:before="80" w:after="20" w:line="240" w:lineRule="auto"/>
+        <w:pBdr>
+          <w:bottom w:val="single" w:sz="6" w:space="2" w:color="0A5C48"/>
+        </w:pBdr>
       </w:pPr>
       <w:r>
         <w:rPr>
-          <w:rFonts w:ascii="Aptos" w:hAnsi="Aptos" w:eastAsia="Aptos"/>
+          <w:rFonts w:ascii="Aptos Display" w:hAnsi="Aptos Display"/>
           <w:b/>
-          <w:color w:val="222222"/>
-          <w:sz w:val="18"/>
+          <w:color w:val="0A5C48"/>
+          <w:sz w:val="19"/>
+        </w:rPr>
+        <w:t>SELECTED PROJECTS</w:t>
+      </w:r>
+    </w:p>
+    <w:p>
+      <w:pPr>
+        <w:keepNext/>
+        <w:spacing w:before="30" w:after="0" w:line="240" w:lineRule="auto"/>
+      </w:pPr>
+      <w:r>
+        <w:rPr>
+          <w:b/>
+          <w:sz w:val="20"/>
         </w:rPr>
         <w:t>BR JARVIS</w:t>
       </w:r>
       <w:r>
         <w:rPr>
-          <w:rFonts w:ascii="Aptos" w:hAnsi="Aptos" w:eastAsia="Aptos"/>
-          <w:b w:val="0"/>
-          <w:color w:val="666666"/>
-          <w:sz w:val="16"/>
+          <w:i/>
+          <w:color w:val="565656"/>
+          <w:sz w:val="17"/>
         </w:rPr>
-        <w:t xml:space="preserve"> | Python, FastAPI, SQLite, LLM APIs, Automation</w:t>
+        <w:t xml:space="preserve">  |  Python, FastAPI, SQLite, LLM Routing</w:t>
       </w:r>
     </w:p>
     <w:p>
       <w:pPr>
-        <w:pStyle w:val="ListBullet"/>
-        <w:spacing w:after="20" w:line="240" w:lineRule="auto"/>
-        <w:ind w:left="216" w:hanging="144"/>
+        <w:spacing w:before="0" w:after="5" w:line="240" w:lineRule="auto"/>
       </w:pPr>
-      <w:r>
-        <w:rPr>
-          <w:rFonts w:ascii="Aptos" w:hAnsi="Aptos" w:eastAsia="Aptos"/>
-          <w:b w:val="0"/>
-          <w:color w:val="222222"/>
-          <w:sz w:val="17"/>
-        </w:rPr>
-        <w:t>Built a local-first autonomous AI runtime with a unified orchestrator connecting CLI, GUI, web, voice, and automation interfaces.</w:t>
-      </w:r>
+      <w:hyperlink r:id="rId13">
+        <w:r>
+          <w:rPr>
+            <w:rStyle w:val="Hyperlink"/>
+            <w:color w:val="0A5C48"/>
+            <w:u w:val="none"/>
+          </w:rPr>
+          <w:t>GitHub</w:t>
+        </w:r>
+      </w:hyperlink>
     </w:p>
     <w:p>
       <w:pPr>
-        <w:pStyle w:val="ListBullet"/>
-        <w:spacing w:after="20" w:line="240" w:lineRule="auto"/>
-        <w:ind w:left="216" w:hanging="144"/>
+        <w:pStyle w:val="ResumeBullet"/>
+        <w:spacing w:before="0" w:after="5" w:line="226" w:lineRule="auto"/>
       </w:pPr>
       <w:r>
-        <w:rPr>
-          <w:rFonts w:ascii="Aptos" w:hAnsi="Aptos" w:eastAsia="Aptos"/>
-          <w:b w:val="0"/>
-          <w:color w:val="222222"/>
-          <w:sz w:val="17"/>
-        </w:rPr>
-        <w:t>Implemented provider-neutral model gateway and smart routing for multiple LLM providers and local inference, with normalized responses and privacy controls.</w:t>
-      </w:r>
-    </w:p>
-    <w:p>
-      <w:pPr>
-        <w:pStyle w:val="ListBullet"/>
-        <w:spacing w:after="20" w:line="240" w:lineRule="auto"/>
-        <w:ind w:left="216" w:hanging="144"/>
-      </w:pPr>
-      <w:r>
-        <w:rPr>
-          <w:rFonts w:ascii="Aptos" w:hAnsi="Aptos" w:eastAsia="Aptos"/>
-          <w:b w:val="0"/>
-          <w:color w:val="222222"/>
-          <w:sz w:val="17"/>
-        </w:rPr>
-        <w:t>Designed deterministic tool authorization and post-condition verification so filesystem, process, browser, and artifact state are checked before reporting completion.</w:t>
-      </w:r>
-    </w:p>
-    <w:p>
-      <w:pPr>
-        <w:pStyle w:val="ListBullet"/>
-        <w:spacing w:after="20" w:line="240" w:lineRule="auto"/>
-        <w:ind w:left="216" w:hanging="144"/>
-      </w:pPr>
-      <w:r>
-        <w:rPr>
-          <w:rFonts w:ascii="Aptos" w:hAnsi="Aptos" w:eastAsia="Aptos"/>
-          <w:b w:val="0"/>
-          <w:color w:val="222222"/>
-          <w:sz w:val="17"/>
-        </w:rPr>
-        <w:t>Developed persistent memory using canonical SQLite WAL storage with temporal state, conflict resolution, hybrid retrieval, caching, lessons, and experience replay.</w:t>
+        <w:t>Engineered a local-first AI operating runtime with provider-neutral routing, capability filtering, tool authorization, persistent memory, and post-condition verification across CLI, web, voice, and automation interfaces.</w:t>
       </w:r>
     </w:p>
     <w:p>
       <w:pPr>
         <w:keepNext/>
-        <w:spacing w:after="0"/>
+        <w:spacing w:before="30" w:after="0" w:line="240" w:lineRule="auto"/>
       </w:pPr>
       <w:r>
         <w:rPr>
-          <w:rFonts w:ascii="Aptos" w:hAnsi="Aptos" w:eastAsia="Aptos"/>
           <w:b/>
-          <w:color w:val="222222"/>
-          <w:sz w:val="18"/>
+          <w:sz w:val="20"/>
         </w:rPr>
         <w:t>NEXORA</w:t>
       </w:r>
       <w:r>
         <w:rPr>
-          <w:rFonts w:ascii="Aptos" w:hAnsi="Aptos" w:eastAsia="Aptos"/>
-          <w:b w:val="0"/>
-          <w:color w:val="666666"/>
-          <w:sz w:val="16"/>
+          <w:i/>
+          <w:color w:val="565656"/>
+          <w:sz w:val="17"/>
         </w:rPr>
-        <w:t xml:space="preserve"> | FastAPI, Async SQLAlchemy, React, TypeScript, PostgreSQL</w:t>
+        <w:t xml:space="preserve">  |  React, TypeScript, FastAPI, PostgreSQL, SQLAlchemy</w:t>
       </w:r>
     </w:p>
     <w:p>
       <w:pPr>
-        <w:pStyle w:val="ListBullet"/>
-        <w:spacing w:after="20" w:line="240" w:lineRule="auto"/>
-        <w:ind w:left="216" w:hanging="144"/>
+        <w:spacing w:before="0" w:after="5" w:line="240" w:lineRule="auto"/>
       </w:pPr>
+      <w:hyperlink r:id="rId14">
+        <w:r>
+          <w:rPr>
+            <w:rStyle w:val="Hyperlink"/>
+            <w:color w:val="0A5C48"/>
+            <w:u w:val="none"/>
+          </w:rPr>
+          <w:t>Live deployment</w:t>
+        </w:r>
+      </w:hyperlink>
       <w:r>
         <w:rPr>
-          <w:rFonts w:ascii="Aptos" w:hAnsi="Aptos" w:eastAsia="Aptos"/>
-          <w:b w:val="0"/>
-          <w:color w:val="222222"/>
-          <w:sz w:val="17"/>
+          <w:color w:val="6E6E6E"/>
         </w:rPr>
-        <w:t>Built a full-stack digital workspace platform with JWT authentication, refresh tokens, OTP, Google OAuth, role-based access, and secure API workflows.</w:t>
+        <w:t xml:space="preserve">  ·  </w:t>
       </w:r>
+      <w:hyperlink r:id="rId15">
+        <w:r>
+          <w:rPr>
+            <w:rStyle w:val="Hyperlink"/>
+            <w:color w:val="0A5C48"/>
+            <w:u w:val="none"/>
+          </w:rPr>
+          <w:t>GitHub</w:t>
+        </w:r>
+      </w:hyperlink>
     </w:p>
     <w:p>
       <w:pPr>
-        <w:pStyle w:val="ListBullet"/>
-        <w:spacing w:after="20" w:line="240" w:lineRule="auto"/>
-        <w:ind w:left="216" w:hanging="144"/>
+        <w:pStyle w:val="ResumeBullet"/>
+        <w:spacing w:before="0" w:after="5" w:line="226" w:lineRule="auto"/>
       </w:pPr>
       <w:r>
-        <w:rPr>
-          <w:rFonts w:ascii="Aptos" w:hAnsi="Aptos" w:eastAsia="Aptos"/>
-          <w:b w:val="0"/>
-          <w:color w:val="222222"/>
-          <w:sz w:val="17"/>
-        </w:rPr>
-        <w:t>Implemented asynchronous REST services, database migrations, CSV/Excel import, validation, rate limiting, audit logging, and responsive React UI.</w:t>
+        <w:t>Built a multi-user React and FastAPI workspace for imports, auditability, and workflow building, with OTP/Google OAuth, JWT refresh-token rotation, rate controls, and audit logging.</w:t>
       </w:r>
     </w:p>
     <w:p>
       <w:pPr>
         <w:keepNext/>
-        <w:spacing w:after="0"/>
+        <w:spacing w:before="30" w:after="0" w:line="240" w:lineRule="auto"/>
       </w:pPr>
       <w:r>
         <w:rPr>
-          <w:rFonts w:ascii="Aptos" w:hAnsi="Aptos" w:eastAsia="Aptos"/>
           <w:b/>
-          <w:color w:val="222222"/>
-          <w:sz w:val="18"/>
+          <w:sz w:val="20"/>
         </w:rPr>
-        <w:t>Farmaa</w:t>
+        <w:t>XSECQRE Password Manager</w:t>
       </w:r>
       <w:r>
         <w:rPr>
-          <w:rFonts w:ascii="Aptos" w:hAnsi="Aptos" w:eastAsia="Aptos"/>
-          <w:b w:val="0"/>
-          <w:color w:val="666666"/>
-          <w:sz w:val="16"/>
+          <w:i/>
+          <w:color w:val="565656"/>
+          <w:sz w:val="17"/>
         </w:rPr>
-        <w:t xml:space="preserve"> | FastAPI, PostgreSQL/Supabase, SQLAlchemy, Flutter, Firebase</w:t>
+        <w:t xml:space="preserve">  |  Python, Flask, SQLite</w:t>
       </w:r>
     </w:p>
     <w:p>
       <w:pPr>
-        <w:pStyle w:val="ListBullet"/>
-        <w:spacing w:after="20" w:line="240" w:lineRule="auto"/>
-        <w:ind w:left="216" w:hanging="144"/>
+        <w:spacing w:before="0" w:after="5" w:line="240" w:lineRule="auto"/>
+      </w:pPr>
+      <w:hyperlink r:id="rId16">
+        <w:r>
+          <w:rPr>
+            <w:rStyle w:val="Hyperlink"/>
+            <w:color w:val="0A5C48"/>
+            <w:u w:val="none"/>
+          </w:rPr>
+          <w:t>Live deployment</w:t>
+        </w:r>
+      </w:hyperlink>
+      <w:r>
+        <w:rPr>
+          <w:color w:val="6E6E6E"/>
+        </w:rPr>
+        <w:t xml:space="preserve">  ·  </w:t>
+      </w:r>
+      <w:hyperlink r:id="rId17">
+        <w:r>
+          <w:rPr>
+            <w:rStyle w:val="Hyperlink"/>
+            <w:color w:val="0A5C48"/>
+            <w:u w:val="none"/>
+          </w:rPr>
+          <w:t>GitHub</w:t>
+        </w:r>
+      </w:hyperlink>
+    </w:p>
+    <w:p>
+      <w:pPr>
+        <w:pStyle w:val="ResumeBullet"/>
+        <w:spacing w:before="0" w:after="5" w:line="226" w:lineRule="auto"/>
       </w:pPr>
       <w:r>
-        <w:rPr>
-          <w:rFonts w:ascii="Aptos" w:hAnsi="Aptos" w:eastAsia="Aptos"/>
-          <w:b w:val="0"/>
-          <w:color w:val="222222"/>
-          <w:sz w:val="17"/>
-        </w:rPr>
-        <w:t>Developed a digital agriculture marketplace combining a FastAPI backend with Flutter mobile application workflows for authentication, inventory, orders, and marketplace operations.</w:t>
+        <w:t>Developed a deployed password manager with authentication, validated private credential CRUD, and PBKDF2-SHA256 password hashing.</w:t>
       </w:r>
     </w:p>
     <w:p>
       <w:pPr>
-        <w:pStyle w:val="ListBullet"/>
-        <w:spacing w:after="20" w:line="240" w:lineRule="auto"/>
-        <w:ind w:left="216" w:hanging="144"/>
+        <w:keepNext/>
+        <w:spacing w:before="30" w:after="0" w:line="240" w:lineRule="auto"/>
       </w:pPr>
       <w:r>
         <w:rPr>
-          <w:rFonts w:ascii="Aptos" w:hAnsi="Aptos" w:eastAsia="Aptos"/>
-          <w:b w:val="0"/>
-          <w:color w:val="222222"/>
+          <w:b/>
+          <w:sz w:val="20"/>
+        </w:rPr>
+        <w:t>Flask URL Shortener</w:t>
+      </w:r>
+      <w:r>
+        <w:rPr>
+          <w:i/>
+          <w:color w:val="565656"/>
           <w:sz w:val="17"/>
         </w:rPr>
-        <w:t>Integrated PostgreSQL/Supabase, Firebase authentication, role-based data access, and AI-assisted agricultural features.</w:t>
+        <w:t xml:space="preserve">  |  Python, Flask, SQLAlchemy, SQLite</w:t>
       </w:r>
     </w:p>
     <w:p>
       <w:pPr>
-        <w:pStyle w:val="Heading1"/>
+        <w:spacing w:before="0" w:after="5" w:line="240" w:lineRule="auto"/>
+      </w:pPr>
+      <w:hyperlink r:id="rId18">
+        <w:r>
+          <w:rPr>
+            <w:rStyle w:val="Hyperlink"/>
+            <w:color w:val="0A5C48"/>
+            <w:u w:val="none"/>
+          </w:rPr>
+          <w:t>Live deployment</w:t>
+        </w:r>
+      </w:hyperlink>
+      <w:r>
+        <w:rPr>
+          <w:color w:val="6E6E6E"/>
+        </w:rPr>
+        <w:t xml:space="preserve">  ·  </w:t>
+      </w:r>
+      <w:hyperlink r:id="rId19">
+        <w:r>
+          <w:rPr>
+            <w:rStyle w:val="Hyperlink"/>
+            <w:color w:val="0A5C48"/>
+            <w:u w:val="none"/>
+          </w:rPr>
+          <w:t>GitHub</w:t>
+        </w:r>
+      </w:hyperlink>
+    </w:p>
+    <w:p>
+      <w:pPr>
+        <w:pStyle w:val="ResumeBullet"/>
+        <w:spacing w:before="0" w:after="5" w:line="226" w:lineRule="auto"/>
+      </w:pPr>
+      <w:r>
+        <w:t>Built a deployed utility that creates and persists unique short-URL mappings with SQLite-backed storage and environment-aware configuration.</w:t>
+      </w:r>
+    </w:p>
+    <w:p>
+      <w:pPr>
         <w:keepNext/>
+        <w:spacing w:before="80" w:after="20" w:line="240" w:lineRule="auto"/>
+        <w:pBdr>
+          <w:bottom w:val="single" w:sz="6" w:space="2" w:color="0A5C48"/>
+        </w:pBdr>
       </w:pPr>
       <w:r>
         <w:rPr>
-          <w:rFonts w:ascii="Aptos" w:hAnsi="Aptos" w:eastAsia="Aptos"/>
+          <w:rFonts w:ascii="Aptos Display" w:hAnsi="Aptos Display"/>
           <w:b/>
-          <w:color w:val="1F4E79"/>
-          <w:sz w:val="20"/>
+          <w:color w:val="0A5C48"/>
+          <w:sz w:val="19"/>
         </w:rPr>
         <w:t>EDUCATION</w:t>
       </w:r>
     </w:p>
     <w:p>
       <w:pPr>
-        <w:spacing w:after="0"/>
+        <w:spacing w:before="40" w:after="20" w:line="240" w:lineRule="auto"/>
       </w:pPr>
       <w:r>
         <w:rPr>
-          <w:rFonts w:ascii="Aptos" w:hAnsi="Aptos" w:eastAsia="Aptos"/>
           <w:b/>
-          <w:color w:val="222222"/>
-          <w:sz w:val="18"/>
+          <w:sz w:val="20"/>
         </w:rPr>
-        <w:t>B.E. Computer Science and Engineering | PSNA College of Engineering and Technology</w:t>
+        <w:t>B.E. Computer Science &amp; Engineering</w:t>
       </w:r>
       <w:r>
-        <w:rPr>
-          <w:rFonts w:ascii="Aptos" w:hAnsi="Aptos" w:eastAsia="Aptos"/>
-          <w:b w:val="0"/>
-          <w:color w:val="555555"/>
-          <w:sz w:val="17"/>
-        </w:rPr>
-        <w:t xml:space="preserve">  |  CGPA: 7.0/10.0</w:t>
+        <w:t xml:space="preserve">  |  PSNA College of Engineering and Technology  |  CGPA: 7.0 / 10.0</w:t>
       </w:r>
     </w:p>
     <w:p>
       <w:pPr>
-        <w:spacing w:after="0"/>
+        <w:keepNext/>
+        <w:spacing w:before="80" w:after="20" w:line="240" w:lineRule="auto"/>
+        <w:pBdr>
+          <w:bottom w:val="single" w:sz="6" w:space="2" w:color="0A5C48"/>
+        </w:pBdr>
       </w:pPr>
       <w:r>
         <w:rPr>
-          <w:rFonts w:ascii="Aptos" w:hAnsi="Aptos" w:eastAsia="Aptos"/>
-          <w:b w:val="0"/>
-          <w:color w:val="444444"/>
-          <w:sz w:val="16"/>
-        </w:rPr>
-        <w:t>HSC | R.C. Matric Hr. Sec. School, Natham - 60%    |    SSLC - 64%</w:t>
-      </w:r>
-    </w:p>
-    <w:p>
-      <w:pPr>
-        <w:pStyle w:val="Heading1"/>
-        <w:keepNext/>
-      </w:pPr>
-      <w:r>
-        <w:rPr>
-          <w:rFonts w:ascii="Aptos" w:hAnsi="Aptos" w:eastAsia="Aptos"/>
+          <w:rFonts w:ascii="Aptos Display" w:hAnsi="Aptos Display"/>
           <w:b/>
-          <w:color w:val="1F4E79"/>
-          <w:sz w:val="20"/>
+          <w:color w:val="0A5C48"/>
+          <w:sz w:val="19"/>
         </w:rPr>
         <w:t>TECHNICAL SKILLS</w:t>
       </w:r>
@@ -529,32 +505,29 @@
         <w:tblLook w:firstColumn="1" w:firstRow="1" w:lastColumn="0" w:lastRow="0" w:noHBand="0" w:noVBand="1" w:val="04A0"/>
       </w:tblPr>
       <w:tblGrid>
-        <w:gridCol w:w="1699"/>
-        <w:gridCol w:w="9576"/>
+        <w:gridCol w:w="1944"/>
+        <w:gridCol w:w="8136"/>
       </w:tblGrid>
       <w:tr>
         <w:tc>
           <w:tcPr>
-            <w:tcW w:type="dxa" w:w="1699"/>
-            <w:shd w:fill="F2F2F2"/>
+            <w:tcW w:type="dxa" w:w="1944"/>
+            <w:vAlign w:val="center"/>
             <w:tcBorders>
               <w:top w:val="nil"/>
               <w:left w:val="nil"/>
               <w:bottom w:val="nil"/>
               <w:right w:val="nil"/>
-              <w:insideH w:val="nil"/>
-              <w:insideV w:val="nil"/>
             </w:tcBorders>
           </w:tcPr>
           <w:p>
             <w:pPr>
-              <w:spacing w:after="0"/>
+              <w:spacing w:before="0" w:after="0" w:line="240" w:lineRule="auto"/>
             </w:pPr>
             <w:r>
               <w:rPr>
-                <w:rFonts w:ascii="Aptos" w:hAnsi="Aptos" w:eastAsia="Aptos"/>
                 <w:b/>
-                <w:color w:val="1F4E79"/>
+                <w:color w:val="0A5C48"/>
                 <w:sz w:val="16"/>
               </w:rPr>
               <w:t>Languages</w:t>
@@ -563,28 +536,24 @@
         </w:tc>
         <w:tc>
           <w:tcPr>
-            <w:tcW w:type="dxa" w:w="9576"/>
+            <w:tcW w:type="dxa" w:w="8136"/>
+            <w:vAlign w:val="center"/>
             <w:tcBorders>
               <w:top w:val="nil"/>
               <w:left w:val="nil"/>
               <w:bottom w:val="nil"/>
               <w:right w:val="nil"/>
-              <w:insideH w:val="nil"/>
-              <w:insideV w:val="nil"/>
             </w:tcBorders>
           </w:tcPr>
           <w:p>
             <w:pPr>
-              <w:spacing w:after="0"/>
+              <w:spacing w:before="0" w:after="0" w:line="240" w:lineRule="auto"/>
             </w:pPr>
             <w:r>
               <w:rPr>
-                <w:rFonts w:ascii="Aptos" w:hAnsi="Aptos" w:eastAsia="Aptos"/>
-                <w:b w:val="0"/>
-                <w:color w:val="222222"/>
                 <w:sz w:val="16"/>
               </w:rPr>
-              <w:t>Python, JavaScript, TypeScript, SQL</w:t>
+              <w:t>Python, JavaScript, C, Java, SQL</w:t>
             </w:r>
           </w:p>
         </w:tc>
@@ -592,26 +561,73 @@
       <w:tr>
         <w:tc>
           <w:tcPr>
-            <w:tcW w:type="dxa" w:w="1699"/>
-            <w:shd w:fill="F2F2F2"/>
+            <w:tcW w:type="dxa" w:w="1944"/>
+            <w:vAlign w:val="center"/>
             <w:tcBorders>
               <w:top w:val="nil"/>
               <w:left w:val="nil"/>
               <w:bottom w:val="nil"/>
               <w:right w:val="nil"/>
-              <w:insideH w:val="nil"/>
-              <w:insideV w:val="nil"/>
             </w:tcBorders>
           </w:tcPr>
           <w:p>
             <w:pPr>
-              <w:spacing w:after="0"/>
+              <w:spacing w:before="0" w:after="0" w:line="240" w:lineRule="auto"/>
             </w:pPr>
             <w:r>
               <w:rPr>
-                <w:rFonts w:ascii="Aptos" w:hAnsi="Aptos" w:eastAsia="Aptos"/>
                 <w:b/>
-                <w:color w:val="1F4E79"/>
+                <w:color w:val="0A5C48"/>
+                <w:sz w:val="16"/>
+              </w:rPr>
+              <w:t>Frontend</w:t>
+            </w:r>
+          </w:p>
+        </w:tc>
+        <w:tc>
+          <w:tcPr>
+            <w:tcW w:type="dxa" w:w="8136"/>
+            <w:vAlign w:val="center"/>
+            <w:tcBorders>
+              <w:top w:val="nil"/>
+              <w:left w:val="nil"/>
+              <w:bottom w:val="nil"/>
+              <w:right w:val="nil"/>
+            </w:tcBorders>
+          </w:tcPr>
+          <w:p>
+            <w:pPr>
+              <w:spacing w:before="0" w:after="0" w:line="240" w:lineRule="auto"/>
+            </w:pPr>
+            <w:r>
+              <w:rPr>
+                <w:sz w:val="16"/>
+              </w:rPr>
+              <w:t>React, HTML5, CSS3</w:t>
+            </w:r>
+          </w:p>
+        </w:tc>
+      </w:tr>
+      <w:tr>
+        <w:tc>
+          <w:tcPr>
+            <w:tcW w:type="dxa" w:w="1944"/>
+            <w:vAlign w:val="center"/>
+            <w:tcBorders>
+              <w:top w:val="nil"/>
+              <w:left w:val="nil"/>
+              <w:bottom w:val="nil"/>
+              <w:right w:val="nil"/>
+            </w:tcBorders>
+          </w:tcPr>
+          <w:p>
+            <w:pPr>
+              <w:spacing w:before="0" w:after="0" w:line="240" w:lineRule="auto"/>
+            </w:pPr>
+            <w:r>
+              <w:rPr>
+                <w:b/>
+                <w:color w:val="0A5C48"/>
                 <w:sz w:val="16"/>
               </w:rPr>
               <w:t>Backend</w:t>
@@ -620,28 +636,24 @@
         </w:tc>
         <w:tc>
           <w:tcPr>
-            <w:tcW w:type="dxa" w:w="9576"/>
+            <w:tcW w:type="dxa" w:w="8136"/>
+            <w:vAlign w:val="center"/>
             <w:tcBorders>
               <w:top w:val="nil"/>
               <w:left w:val="nil"/>
               <w:bottom w:val="nil"/>
               <w:right w:val="nil"/>
-              <w:insideH w:val="nil"/>
-              <w:insideV w:val="nil"/>
             </w:tcBorders>
           </w:tcPr>
           <w:p>
             <w:pPr>
-              <w:spacing w:after="0"/>
+              <w:spacing w:before="0" w:after="0" w:line="240" w:lineRule="auto"/>
             </w:pPr>
             <w:r>
               <w:rPr>
-                <w:rFonts w:ascii="Aptos" w:hAnsi="Aptos" w:eastAsia="Aptos"/>
-                <w:b w:val="0"/>
-                <w:color w:val="222222"/>
                 <w:sz w:val="16"/>
               </w:rPr>
-              <w:t>FastAPI, Node.js, Express.js, REST APIs, Async Programming, JWT, OAuth</w:t>
+              <w:t>REST APIs, Express.js, Node.js</w:t>
             </w:r>
           </w:p>
         </w:tc>
@@ -649,56 +661,49 @@
       <w:tr>
         <w:tc>
           <w:tcPr>
-            <w:tcW w:type="dxa" w:w="1699"/>
-            <w:shd w:fill="F2F2F2"/>
+            <w:tcW w:type="dxa" w:w="1944"/>
+            <w:vAlign w:val="center"/>
             <w:tcBorders>
               <w:top w:val="nil"/>
               <w:left w:val="nil"/>
               <w:bottom w:val="nil"/>
               <w:right w:val="nil"/>
-              <w:insideH w:val="nil"/>
-              <w:insideV w:val="nil"/>
             </w:tcBorders>
           </w:tcPr>
           <w:p>
             <w:pPr>
-              <w:spacing w:after="0"/>
+              <w:spacing w:before="0" w:after="0" w:line="240" w:lineRule="auto"/>
             </w:pPr>
             <w:r>
               <w:rPr>
-                <w:rFonts w:ascii="Aptos" w:hAnsi="Aptos" w:eastAsia="Aptos"/>
                 <w:b/>
-                <w:color w:val="1F4E79"/>
+                <w:color w:val="0A5C48"/>
                 <w:sz w:val="16"/>
               </w:rPr>
-              <w:t>Frontend</w:t>
+              <w:t>Database</w:t>
             </w:r>
           </w:p>
         </w:tc>
         <w:tc>
           <w:tcPr>
-            <w:tcW w:type="dxa" w:w="9576"/>
+            <w:tcW w:type="dxa" w:w="8136"/>
+            <w:vAlign w:val="center"/>
             <w:tcBorders>
               <w:top w:val="nil"/>
               <w:left w:val="nil"/>
               <w:bottom w:val="nil"/>
               <w:right w:val="nil"/>
-              <w:insideH w:val="nil"/>
-              <w:insideV w:val="nil"/>
             </w:tcBorders>
           </w:tcPr>
           <w:p>
             <w:pPr>
-              <w:spacing w:after="0"/>
+              <w:spacing w:before="0" w:after="0" w:line="240" w:lineRule="auto"/>
             </w:pPr>
             <w:r>
               <w:rPr>
-                <w:rFonts w:ascii="Aptos" w:hAnsi="Aptos" w:eastAsia="Aptos"/>
-                <w:b w:val="0"/>
-                <w:color w:val="222222"/>
                 <w:sz w:val="16"/>
               </w:rPr>
-              <w:t>React, HTML, CSS, Tailwind CSS</w:t>
+              <w:t>MongoDB, DBMS</w:t>
             </w:r>
           </w:p>
         </w:tc>
@@ -706,56 +711,49 @@
       <w:tr>
         <w:tc>
           <w:tcPr>
-            <w:tcW w:type="dxa" w:w="1699"/>
-            <w:shd w:fill="F2F2F2"/>
+            <w:tcW w:type="dxa" w:w="1944"/>
+            <w:vAlign w:val="center"/>
             <w:tcBorders>
               <w:top w:val="nil"/>
               <w:left w:val="nil"/>
               <w:bottom w:val="nil"/>
               <w:right w:val="nil"/>
-              <w:insideH w:val="nil"/>
-              <w:insideV w:val="nil"/>
             </w:tcBorders>
           </w:tcPr>
           <w:p>
             <w:pPr>
-              <w:spacing w:after="0"/>
+              <w:spacing w:before="0" w:after="0" w:line="240" w:lineRule="auto"/>
             </w:pPr>
             <w:r>
               <w:rPr>
-                <w:rFonts w:ascii="Aptos" w:hAnsi="Aptos" w:eastAsia="Aptos"/>
                 <w:b/>
-                <w:color w:val="1F4E79"/>
+                <w:color w:val="0A5C48"/>
                 <w:sz w:val="16"/>
               </w:rPr>
-              <w:t>Databases</w:t>
+              <w:t>Tools &amp; Platforms</w:t>
             </w:r>
           </w:p>
         </w:tc>
         <w:tc>
           <w:tcPr>
-            <w:tcW w:type="dxa" w:w="9576"/>
+            <w:tcW w:type="dxa" w:w="8136"/>
+            <w:vAlign w:val="center"/>
             <w:tcBorders>
               <w:top w:val="nil"/>
               <w:left w:val="nil"/>
               <w:bottom w:val="nil"/>
               <w:right w:val="nil"/>
-              <w:insideH w:val="nil"/>
-              <w:insideV w:val="nil"/>
             </w:tcBorders>
           </w:tcPr>
           <w:p>
             <w:pPr>
-              <w:spacing w:after="0"/>
+              <w:spacing w:before="0" w:after="0" w:line="240" w:lineRule="auto"/>
             </w:pPr>
             <w:r>
               <w:rPr>
-                <w:rFonts w:ascii="Aptos" w:hAnsi="Aptos" w:eastAsia="Aptos"/>
-                <w:b w:val="0"/>
-                <w:color w:val="222222"/>
                 <w:sz w:val="16"/>
               </w:rPr>
-              <w:t>PostgreSQL, MongoDB, SQLite, SQLAlchemy, Supabase</w:t>
+              <w:t>Git, GitHub, Postman, VS Code, Claude, Linux/Unix</w:t>
             </w:r>
           </w:p>
         </w:tc>
@@ -763,113 +761,49 @@
       <w:tr>
         <w:tc>
           <w:tcPr>
-            <w:tcW w:type="dxa" w:w="1699"/>
-            <w:shd w:fill="F2F2F2"/>
+            <w:tcW w:type="dxa" w:w="1944"/>
+            <w:vAlign w:val="center"/>
             <w:tcBorders>
               <w:top w:val="nil"/>
               <w:left w:val="nil"/>
               <w:bottom w:val="nil"/>
               <w:right w:val="nil"/>
-              <w:insideH w:val="nil"/>
-              <w:insideV w:val="nil"/>
             </w:tcBorders>
           </w:tcPr>
           <w:p>
             <w:pPr>
-              <w:spacing w:after="0"/>
+              <w:spacing w:before="0" w:after="0" w:line="240" w:lineRule="auto"/>
             </w:pPr>
             <w:r>
               <w:rPr>
-                <w:rFonts w:ascii="Aptos" w:hAnsi="Aptos" w:eastAsia="Aptos"/>
                 <w:b/>
-                <w:color w:val="1F4E79"/>
+                <w:color w:val="0A5C48"/>
                 <w:sz w:val="16"/>
               </w:rPr>
-              <w:t>AI &amp; Systems</w:t>
+              <w:t>Soft Skills</w:t>
             </w:r>
           </w:p>
         </w:tc>
         <w:tc>
           <w:tcPr>
-            <w:tcW w:type="dxa" w:w="9576"/>
+            <w:tcW w:type="dxa" w:w="8136"/>
+            <w:vAlign w:val="center"/>
             <w:tcBorders>
               <w:top w:val="nil"/>
               <w:left w:val="nil"/>
               <w:bottom w:val="nil"/>
               <w:right w:val="nil"/>
-              <w:insideH w:val="nil"/>
-              <w:insideV w:val="nil"/>
             </w:tcBorders>
           </w:tcPr>
           <w:p>
             <w:pPr>
-              <w:spacing w:after="0"/>
+              <w:spacing w:before="0" w:after="0" w:line="240" w:lineRule="auto"/>
             </w:pPr>
             <w:r>
               <w:rPr>
-                <w:rFonts w:ascii="Aptos" w:hAnsi="Aptos" w:eastAsia="Aptos"/>
-                <w:b w:val="0"/>
-                <w:color w:val="222222"/>
                 <w:sz w:val="16"/>
               </w:rPr>
-              <w:t>LLM Integration, AI Agents, Tool Execution, Model Routing, Persistent Memory, Automation</w:t>
-            </w:r>
-          </w:p>
-        </w:tc>
-      </w:tr>
-      <w:tr>
-        <w:tc>
-          <w:tcPr>
-            <w:tcW w:type="dxa" w:w="1699"/>
-            <w:shd w:fill="F2F2F2"/>
-            <w:tcBorders>
-              <w:top w:val="nil"/>
-              <w:left w:val="nil"/>
-              <w:bottom w:val="nil"/>
-              <w:right w:val="nil"/>
-              <w:insideH w:val="nil"/>
-              <w:insideV w:val="nil"/>
-            </w:tcBorders>
-          </w:tcPr>
-          <w:p>
-            <w:pPr>
-              <w:spacing w:after="0"/>
-            </w:pPr>
-            <w:r>
-              <w:rPr>
-                <w:rFonts w:ascii="Aptos" w:hAnsi="Aptos" w:eastAsia="Aptos"/>
-                <w:b/>
-                <w:color w:val="1F4E79"/>
-                <w:sz w:val="16"/>
-              </w:rPr>
-              <w:t>Security &amp; Tools</w:t>
-            </w:r>
-          </w:p>
-        </w:tc>
-        <w:tc>
-          <w:tcPr>
-            <w:tcW w:type="dxa" w:w="9576"/>
-            <w:tcBorders>
-              <w:top w:val="nil"/>
-              <w:left w:val="nil"/>
-              <w:bottom w:val="nil"/>
-              <w:right w:val="nil"/>
-              <w:insideH w:val="nil"/>
-              <w:insideV w:val="nil"/>
-            </w:tcBorders>
-          </w:tcPr>
-          <w:p>
-            <w:pPr>
-              <w:spacing w:after="0"/>
-            </w:pPr>
-            <w:r>
-              <w:rPr>
-                <w:rFonts w:ascii="Aptos" w:hAnsi="Aptos" w:eastAsia="Aptos"/>
-                <w:b w:val="0"/>
-                <w:color w:val="222222"/>
-                <w:sz w:val="16"/>
-              </w:rPr>
-              <w:t>API Security, Input Validation, Rate Limiting, Git, GitHub, Postman, Linux</w:t>
+              <w:t>Problem solving, quick learning, team collaboration, responsible AI tool usage</w:t>
             </w:r>
           </w:p>
         </w:tc>
@@ -877,112 +811,75 @@
     </w:tbl>
     <w:p>
       <w:pPr>
-        <w:pStyle w:val="Heading1"/>
         <w:keepNext/>
+        <w:spacing w:before="80" w:after="20" w:line="240" w:lineRule="auto"/>
+        <w:pBdr>
+          <w:bottom w:val="single" w:sz="6" w:space="2" w:color="0A5C48"/>
+        </w:pBdr>
       </w:pPr>
       <w:r>
         <w:rPr>
-          <w:rFonts w:ascii="Aptos" w:hAnsi="Aptos" w:eastAsia="Aptos"/>
+          <w:rFonts w:ascii="Aptos Display" w:hAnsi="Aptos Display"/>
           <w:b/>
-          <w:color w:val="1F4E79"/>
-          <w:sz w:val="20"/>
+          <w:color w:val="0A5C48"/>
+          <w:sz w:val="19"/>
         </w:rPr>
-        <w:t>CERTIFICATIONS</w:t>
+        <w:t>CERTIFICATIONS &amp; PROGRAMMING PRACTICE</w:t>
       </w:r>
     </w:p>
     <w:p>
       <w:pPr>
-        <w:pStyle w:val="ListBullet"/>
-        <w:spacing w:after="20" w:line="240" w:lineRule="auto"/>
-        <w:ind w:left="216" w:hanging="144"/>
+        <w:pStyle w:val="ResumeBullet"/>
+        <w:spacing w:before="0" w:after="5" w:line="226" w:lineRule="auto"/>
       </w:pPr>
       <w:r>
-        <w:rPr>
-          <w:rFonts w:ascii="Aptos" w:hAnsi="Aptos" w:eastAsia="Aptos"/>
-          <w:b w:val="0"/>
-          <w:color w:val="222222"/>
-          <w:sz w:val="17"/>
-        </w:rPr>
-        <w:t>Cloud Security Fundamentals - Palo Alto Networks Cybersecurity Academy</w:t>
+        <w:t>Cloud Security Fundamentals — Palo Alto Networks Cybersecurity Academy, Feb 2025.</w:t>
       </w:r>
     </w:p>
     <w:p>
       <w:pPr>
-        <w:pStyle w:val="ListBullet"/>
-        <w:spacing w:after="20" w:line="240" w:lineRule="auto"/>
-        <w:ind w:left="216" w:hanging="144"/>
+        <w:pStyle w:val="ResumeBullet"/>
+        <w:spacing w:before="0" w:after="5" w:line="226" w:lineRule="auto"/>
       </w:pPr>
       <w:r>
-        <w:rPr>
-          <w:rFonts w:ascii="Aptos" w:hAnsi="Aptos" w:eastAsia="Aptos"/>
-          <w:b w:val="0"/>
-          <w:color w:val="222222"/>
-          <w:sz w:val="17"/>
-        </w:rPr>
-        <w:t>Introduction to IoT and Digital Transformation - Cisco Networking Academy</w:t>
+        <w:t>Introduction to IoT and Digital Transformation — Cisco Networking Academy, Apr 2025.</w:t>
       </w:r>
     </w:p>
     <w:p>
       <w:pPr>
-        <w:pStyle w:val="ListBullet"/>
-        <w:spacing w:after="20" w:line="240" w:lineRule="auto"/>
-        <w:ind w:left="216" w:hanging="144"/>
+        <w:pStyle w:val="ResumeBullet"/>
+        <w:spacing w:before="0" w:after="5" w:line="226" w:lineRule="auto"/>
       </w:pPr>
       <w:r>
-        <w:rPr>
-          <w:rFonts w:ascii="Aptos" w:hAnsi="Aptos" w:eastAsia="Aptos"/>
-          <w:b w:val="0"/>
-          <w:color w:val="222222"/>
-          <w:sz w:val="17"/>
-        </w:rPr>
-        <w:t>Database Programming with SQL - Oracle Academy</w:t>
+        <w:t>Git Training — EduPyramids, SINE, IIT Bombay, Nov 2025; 1 credit, 76.67% score.</w:t>
       </w:r>
     </w:p>
     <w:p>
       <w:pPr>
-        <w:pStyle w:val="ListBullet"/>
-        <w:spacing w:after="20" w:line="240" w:lineRule="auto"/>
-        <w:ind w:left="216" w:hanging="144"/>
+        <w:pStyle w:val="ResumeBullet"/>
+        <w:spacing w:before="0" w:after="5" w:line="226" w:lineRule="auto"/>
       </w:pPr>
       <w:r>
-        <w:rPr>
-          <w:rFonts w:ascii="Aptos" w:hAnsi="Aptos" w:eastAsia="Aptos"/>
-          <w:b w:val="0"/>
-          <w:color w:val="222222"/>
-          <w:sz w:val="17"/>
-        </w:rPr>
-        <w:t>Introduction to API Pentesting &amp; Bug Bounty - Cappriciosec University</w:t>
+        <w:t>Database Programming with SQL — Oracle Academy, Jun 2024.</w:t>
+      </w:r>
+    </w:p>
+    <w:p>
+      <w:pPr>
+        <w:pStyle w:val="ResumeBullet"/>
+        <w:spacing w:before="0" w:after="5" w:line="226" w:lineRule="auto"/>
+      </w:pPr>
+      <w:r>
+        <w:t>Digilabs Python Basic and Java Basic programs, May 2024; Skillrack: 116 programs solved, including 77 in C and 39 in Python3, with 19 bronze badges.</w:t>
       </w:r>
     </w:p>
     <w:sectPr>
-      <w:footerReference w:type="default" r:id="rId12"/>
       <w:pgSz w:w="12240" w:h="15840"/>
-      <w:pgMar w:top="605" w:right="835" w:bottom="605" w:left="835" w:header="720" w:footer="720" w:gutter="0"/>
+      <w:pgMar w:top="490" w:right="792" w:bottom="490" w:left="792" w:header="720" w:footer="720" w:gutter="0"/>
       <w:cols w:space="720"/>
       <w:docGrid w:linePitch="360"/>
     </w:sectPr>
   </w:body>
 </w:document>
-</file>
-
-<file path=word/footer1.xml><?xml version="1.0" encoding="utf-8"?>
-<w:ftr xmlns:m="http://schemas.openxmlformats.org/officeDocument/2006/math" xmlns:mc="http://schemas.openxmlformats.org/markup-compatibility/2006" xmlns:mo="http://schemas.microsoft.com/office/mac/office/2008/main" xmlns:mv="urn:schemas-microsoft-com:mac:vml" xmlns:o="urn:schemas-microsoft-com:office:office" xmlns:r="http://schemas.openxmlformats.org/officeDocument/2006/relationships" xmlns:v="urn:schemas-microsoft-com:vml" xmlns:w10="urn:schemas-microsoft-com:office:word" xmlns:w14="http://schemas.microsoft.com/office/word/2010/wordml" xmlns:w="http://schemas.openxmlformats.org/wordprocessingml/2006/main" xmlns:wne="http://schemas.microsoft.com/office/word/2006/wordml" xmlns:wp14="http://schemas.microsoft.com/office/word/2010/wordprocessingDrawing" xmlns:wp="http://schemas.openxmlformats.org/drawingml/2006/wordprocessingDrawing" xmlns:wpc="http://schemas.microsoft.com/office/word/2010/wordprocessingCanvas" xmlns:wpg="http://schemas.microsoft.com/office/word/2010/wordprocessingGroup" xmlns:wpi="http://schemas.microsoft.com/office/word/2010/wordprocessingInk" xmlns:wps="http://schemas.microsoft.com/office/word/2010/wordprocessingShape" mc:Ignorable="w14 wp14">
-  <w:p>
-    <w:pPr>
-      <w:pStyle w:val="Footer"/>
-      <w:jc w:val="center"/>
-    </w:pPr>
-    <w:r>
-      <w:rPr>
-        <w:rFonts w:ascii="Aptos" w:hAnsi="Aptos" w:eastAsia="Aptos"/>
-        <w:b w:val="0"/>
-        <w:color w:val="666666"/>
-        <w:sz w:val="15"/>
-      </w:rPr>
-      <w:t>GitHub: github.com/bharathrajp14  |  LinkedIn: linkedin.com/in/bharathrajp14</w:t>
-    </w:r>
-  </w:p>
-</w:ftr>
 </file>
 
 <file path=word/numbering.xml><?xml version="1.0" encoding="utf-8"?>
@@ -1348,12 +1245,9 @@
     <w:name w:val="Normal"/>
     <w:qFormat/>
     <w:rsid w:val="00FC693F"/>
-    <w:pPr>
-      <w:spacing w:after="40"/>
-    </w:pPr>
     <w:rPr>
-      <w:rFonts w:ascii="Aptos" w:hAnsi="Aptos" w:eastAsia="Aptos"/>
-      <w:sz w:val="18"/>
+      <w:rFonts w:ascii="Aptos" w:hAnsi="Aptos"/>
+      <w:sz w:val="17"/>
     </w:rPr>
   </w:style>
   <w:style w:type="paragraph" w:styleId="Header">
@@ -1411,15 +1305,15 @@
     <w:pPr>
       <w:keepNext/>
       <w:keepLines/>
-      <w:spacing w:before="80" w:after="40"/>
+      <w:spacing w:before="480" w:after="0"/>
       <w:outlineLvl w:val="0"/>
     </w:pPr>
     <w:rPr>
-      <w:rFonts w:asciiTheme="majorHAnsi" w:eastAsiaTheme="majorEastAsia" w:hAnsiTheme="majorHAnsi" w:cstheme="majorBidi" w:ascii="Aptos Display" w:hAnsi="Aptos Display" w:eastAsia="Aptos Display"/>
+      <w:rFonts w:asciiTheme="majorHAnsi" w:eastAsiaTheme="majorEastAsia" w:hAnsiTheme="majorHAnsi" w:cstheme="majorBidi"/>
       <w:b/>
       <w:bCs/>
-      <w:color w:val="1F4E79"/>
-      <w:sz w:val="21"/>
+      <w:color w:val="365F91" w:themeColor="accent1" w:themeShade="BF"/>
+      <w:sz w:val="28"/>
       <w:szCs w:val="28"/>
     </w:rPr>
   </w:style>
@@ -1435,15 +1329,15 @@
     <w:pPr>
       <w:keepNext/>
       <w:keepLines/>
-      <w:spacing w:before="80" w:after="40"/>
+      <w:spacing w:before="200" w:after="0"/>
       <w:outlineLvl w:val="1"/>
     </w:pPr>
     <w:rPr>
-      <w:rFonts w:asciiTheme="majorHAnsi" w:eastAsiaTheme="majorEastAsia" w:hAnsiTheme="majorHAnsi" w:cstheme="majorBidi" w:ascii="Aptos Display" w:hAnsi="Aptos Display" w:eastAsia="Aptos Display"/>
+      <w:rFonts w:asciiTheme="majorHAnsi" w:eastAsiaTheme="majorEastAsia" w:hAnsiTheme="majorHAnsi" w:cstheme="majorBidi"/>
       <w:b/>
       <w:bCs/>
-      <w:color w:val="1F4E79"/>
-      <w:sz w:val="19"/>
+      <w:color w:val="4F81BD" w:themeColor="accent1"/>
+      <w:sz w:val="26"/>
       <w:szCs w:val="26"/>
     </w:rPr>
   </w:style>
@@ -13037,6 +12931,28 @@
         <w:shd w:val="clear" w:color="auto" w:fill="FBCAA2" w:themeFill="accent6" w:themeFillTint="7F"/>
       </w:tcPr>
     </w:tblStylePr>
+  </w:style>
+  <w:style w:type="paragraph" w:customStyle="1" w:styleId="ResumeBody">
+    <w:name w:val="Resume Body"/>
+    <w:basedOn w:val="Normal"/>
+    <w:rPr>
+      <w:rFonts w:ascii="Aptos" w:hAnsi="Aptos"/>
+      <w:sz w:val="17"/>
+    </w:rPr>
+  </w:style>
+  <w:style w:type="paragraph" w:customStyle="1" w:styleId="ResumeBullet">
+    <w:name w:val="Resume Bullet"/>
+    <w:basedOn w:val="Normal"/>
+    <w:pPr>
+      <w:tabs>
+        <w:tab w:pos="216" w:val="left"/>
+      </w:tabs>
+      <w:ind w:left="216" w:hanging="173"/>
+    </w:pPr>
+    <w:rPr>
+      <w:rFonts w:ascii="Aptos" w:hAnsi="Aptos"/>
+      <w:sz w:val="16"/>
+    </w:rPr>
   </w:style>
 </w:styles>
 </file>

</xml_diff>

<commit_message>
docs: update downloadable A4 resume
</commit_message>
<xml_diff>
--- a/client/public/portfolio-assets/Bharath_Raj_P_Resume.docx
+++ b/client/public/portfolio-assets/Bharath_Raj_P_Resume.docx
@@ -2,6 +2,21 @@
 <file path=word/document.xml><?xml version="1.0" encoding="utf-8"?>
 <w:document xmlns:wpc="http://schemas.microsoft.com/office/word/2010/wordprocessingCanvas" xmlns:mo="http://schemas.microsoft.com/office/mac/office/2008/main" xmlns:mc="http://schemas.openxmlformats.org/markup-compatibility/2006" xmlns:mv="urn:schemas-microsoft-com:mac:vml" xmlns:o="urn:schemas-microsoft-com:office:office" xmlns:r="http://schemas.openxmlformats.org/officeDocument/2006/relationships" xmlns:m="http://schemas.openxmlformats.org/officeDocument/2006/math" xmlns:v="urn:schemas-microsoft-com:vml" xmlns:wp14="http://schemas.microsoft.com/office/word/2010/wordprocessingDrawing" xmlns:wp="http://schemas.openxmlformats.org/drawingml/2006/wordprocessingDrawing" xmlns:w10="urn:schemas-microsoft-com:office:word" xmlns:w="http://schemas.openxmlformats.org/wordprocessingml/2006/main" xmlns:w14="http://schemas.microsoft.com/office/word/2010/wordml" xmlns:wpg="http://schemas.microsoft.com/office/word/2010/wordprocessingGroup" xmlns:wpi="http://schemas.microsoft.com/office/word/2010/wordprocessingInk" xmlns:wne="http://schemas.microsoft.com/office/word/2006/wordml" xmlns:wps="http://schemas.microsoft.com/office/word/2010/wordprocessingShape" mc:Ignorable="w14 wp14">
   <w:body>
+    <w:p>
+      <w:pPr>
+        <w:spacing w:before="0" w:after="0" w:line="240" w:lineRule="auto"/>
+        <w:jc w:val="center"/>
+      </w:pPr>
+      <w:r>
+        <w:rPr>
+          <w:rFonts w:ascii="Aptos Display" w:hAnsi="Aptos Display"/>
+          <w:b/>
+          <w:color w:val="18201F"/>
+          <w:sz w:val="44"/>
+        </w:rPr>
+        <w:t>BHARATH RAJ P</w:t>
+      </w:r>
+    </w:p>
     <w:p>
       <w:pPr>
         <w:spacing w:before="0" w:after="20" w:line="240" w:lineRule="auto"/>
@@ -9,12 +24,24 @@
       </w:pPr>
       <w:r>
         <w:rPr>
-          <w:rFonts w:ascii="Aptos Display" w:hAnsi="Aptos Display"/>
           <w:b/>
-          <w:color w:val="101C1A"/>
-          <w:sz w:val="37"/>
+          <w:color w:val="0A5C48"/>
+          <w:sz w:val="20"/>
         </w:rPr>
-        <w:t>BHARATH RAJ P</w:t>
+        <w:t>Software Development Intern  |  Backend, Full-Stack &amp; AI Systems</w:t>
+      </w:r>
+    </w:p>
+    <w:p>
+      <w:pPr>
+        <w:spacing w:before="0" w:after="10" w:line="240" w:lineRule="auto"/>
+        <w:jc w:val="center"/>
+      </w:pPr>
+      <w:r>
+        <w:rPr>
+          <w:color w:val="18201F"/>
+          <w:sz w:val="18"/>
+        </w:rPr>
+        <w:t>Tamil Nadu, India  |  +91 93445 18573  |  bharathraj14120@gmail.com</w:t>
       </w:r>
     </w:p>
     <w:p>
@@ -24,478 +51,10 @@
       </w:pPr>
       <w:r>
         <w:rPr>
-          <w:rFonts w:ascii="Aptos" w:hAnsi="Aptos"/>
-          <w:b/>
           <w:color w:val="0A5C48"/>
-          <w:sz w:val="18"/>
-        </w:rPr>
-        <w:t>Software Development Intern | Backend, Full-Stack &amp; AI Systems</w:t>
-      </w:r>
-    </w:p>
-    <w:p>
-      <w:pPr>
-        <w:spacing w:before="0" w:after="0" w:line="240" w:lineRule="auto"/>
-        <w:jc w:val="center"/>
-      </w:pPr>
-      <w:r>
-        <w:rPr>
           <w:sz w:val="16"/>
         </w:rPr>
-        <w:t>Tamil Nadu, India  |  +91 93445 18573  |  bharathraj14120@gmail.com</w:t>
-      </w:r>
-    </w:p>
-    <w:p>
-      <w:pPr>
-        <w:spacing w:before="0" w:after="40" w:line="240" w:lineRule="auto"/>
-        <w:jc w:val="center"/>
-      </w:pPr>
-      <w:hyperlink r:id="rId9">
-        <w:r>
-          <w:rPr>
-            <w:rStyle w:val="Hyperlink"/>
-            <w:color w:val="0A5C48"/>
-            <w:u w:val="none"/>
-          </w:rPr>
-          <w:t>LinkedIn</w:t>
-        </w:r>
-      </w:hyperlink>
-      <w:r>
-        <w:t xml:space="preserve">  |  </w:t>
-      </w:r>
-      <w:hyperlink r:id="rId10">
-        <w:r>
-          <w:rPr>
-            <w:rStyle w:val="Hyperlink"/>
-            <w:color w:val="0A5C48"/>
-            <w:u w:val="none"/>
-          </w:rPr>
-          <w:t>GitHub</w:t>
-        </w:r>
-      </w:hyperlink>
-      <w:r>
-        <w:t xml:space="preserve">  |  </w:t>
-      </w:r>
-      <w:hyperlink r:id="rId11">
-        <w:r>
-          <w:rPr>
-            <w:rStyle w:val="Hyperlink"/>
-            <w:color w:val="0A5C48"/>
-            <w:u w:val="none"/>
-          </w:rPr>
-          <w:t>Portfolio</w:t>
-        </w:r>
-      </w:hyperlink>
-      <w:r>
-        <w:t xml:space="preserve">  |  </w:t>
-      </w:r>
-      <w:hyperlink r:id="rId12">
-        <w:r>
-          <w:rPr>
-            <w:rStyle w:val="Hyperlink"/>
-            <w:color w:val="0A5C48"/>
-            <w:u w:val="none"/>
-          </w:rPr>
-          <w:t>Skillrack</w:t>
-        </w:r>
-      </w:hyperlink>
-    </w:p>
-    <w:p>
-      <w:pPr>
-        <w:keepNext/>
-        <w:spacing w:before="80" w:after="20" w:line="240" w:lineRule="auto"/>
-        <w:pBdr>
-          <w:bottom w:val="single" w:sz="6" w:space="2" w:color="0A5C48"/>
-        </w:pBdr>
-      </w:pPr>
-      <w:r>
-        <w:rPr>
-          <w:rFonts w:ascii="Aptos Display" w:hAnsi="Aptos Display"/>
-          <w:b/>
-          <w:color w:val="0A5C48"/>
-          <w:sz w:val="19"/>
-        </w:rPr>
-        <w:t>PROFESSIONAL SUMMARY</w:t>
-      </w:r>
-    </w:p>
-    <w:p>
-      <w:pPr>
-        <w:pStyle w:val="ResumeBody"/>
-        <w:spacing w:before="0" w:after="10" w:line="230" w:lineRule="auto"/>
-      </w:pPr>
-      <w:r>
-        <w:t>Software Development Intern building React modules and REST API–driven workflows. Develops backend, full-stack, and AI-enabled applications with Python, JavaScript, FastAPI, Node.js, Express.js, SQL, and SQLite, with a security-conscious approach to authentication, data handling, and deployed web applications.</w:t>
-      </w:r>
-    </w:p>
-    <w:p>
-      <w:pPr>
-        <w:keepNext/>
-        <w:spacing w:before="80" w:after="20" w:line="240" w:lineRule="auto"/>
-        <w:pBdr>
-          <w:bottom w:val="single" w:sz="6" w:space="2" w:color="0A5C48"/>
-        </w:pBdr>
-      </w:pPr>
-      <w:r>
-        <w:rPr>
-          <w:rFonts w:ascii="Aptos Display" w:hAnsi="Aptos Display"/>
-          <w:b/>
-          <w:color w:val="0A5C48"/>
-          <w:sz w:val="19"/>
-        </w:rPr>
-        <w:t>EXPERIENCE</w:t>
-      </w:r>
-    </w:p>
-    <w:p>
-      <w:pPr>
-        <w:spacing w:before="30" w:after="10" w:line="240" w:lineRule="auto"/>
-      </w:pPr>
-      <w:r>
-        <w:rPr>
-          <w:b/>
-          <w:sz w:val="20"/>
-        </w:rPr>
-        <w:t>Software Development Intern</w:t>
-      </w:r>
-      <w:r>
-        <w:t xml:space="preserve">  |  Kevell Corp  |  Present</w:t>
-      </w:r>
-    </w:p>
-    <w:p>
-      <w:pPr>
-        <w:pStyle w:val="ResumeBullet"/>
-        <w:spacing w:before="0" w:after="5" w:line="226" w:lineRule="auto"/>
-      </w:pPr>
-      <w:r>
-        <w:t>Develop React modules and integrate REST API workflows across authentication, vendor management, notifications, payments, and wallet functionality.</w:t>
-      </w:r>
-    </w:p>
-    <w:p>
-      <w:pPr>
-        <w:pStyle w:val="ResumeBullet"/>
-        <w:spacing w:before="0" w:after="5" w:line="226" w:lineRule="auto"/>
-      </w:pPr>
-      <w:r>
-        <w:t>Collaborate with backend developers to validate API-driven user journeys, debug full-stack workflows, and manage changes through Git-based team practices.</w:t>
-      </w:r>
-    </w:p>
-    <w:p>
-      <w:pPr>
-        <w:spacing w:before="30" w:after="10" w:line="240" w:lineRule="auto"/>
-      </w:pPr>
-      <w:r>
-        <w:rPr>
-          <w:b/>
-          <w:sz w:val="20"/>
-        </w:rPr>
-        <w:t>Cybersecurity Intern</w:t>
-      </w:r>
-      <w:r>
-        <w:t xml:space="preserve">  |  NullClass  |  Jun 2025 – Jul 2025</w:t>
-      </w:r>
-    </w:p>
-    <w:p>
-      <w:pPr>
-        <w:pStyle w:val="ResumeBullet"/>
-        <w:spacing w:before="0" w:after="5" w:line="226" w:lineRule="auto"/>
-      </w:pPr>
-      <w:r>
-        <w:t>Completed controlled training in ethical-hacking fundamentals, SQL injection, cross-site scripting, cross-site request forgery, and vulnerability reporting concepts.</w:t>
-      </w:r>
-    </w:p>
-    <w:p>
-      <w:pPr>
-        <w:keepNext/>
-        <w:spacing w:before="80" w:after="20" w:line="240" w:lineRule="auto"/>
-        <w:pBdr>
-          <w:bottom w:val="single" w:sz="6" w:space="2" w:color="0A5C48"/>
-        </w:pBdr>
-      </w:pPr>
-      <w:r>
-        <w:rPr>
-          <w:rFonts w:ascii="Aptos Display" w:hAnsi="Aptos Display"/>
-          <w:b/>
-          <w:color w:val="0A5C48"/>
-          <w:sz w:val="19"/>
-        </w:rPr>
-        <w:t>SELECTED PROJECTS</w:t>
-      </w:r>
-    </w:p>
-    <w:p>
-      <w:pPr>
-        <w:keepNext/>
-        <w:spacing w:before="30" w:after="0" w:line="240" w:lineRule="auto"/>
-      </w:pPr>
-      <w:r>
-        <w:rPr>
-          <w:b/>
-          <w:sz w:val="20"/>
-        </w:rPr>
-        <w:t>BR JARVIS</w:t>
-      </w:r>
-      <w:r>
-        <w:rPr>
-          <w:i/>
-          <w:color w:val="565656"/>
-          <w:sz w:val="17"/>
-        </w:rPr>
-        <w:t xml:space="preserve">  |  Python, FastAPI, SQLite, LLM Routing</w:t>
-      </w:r>
-    </w:p>
-    <w:p>
-      <w:pPr>
-        <w:spacing w:before="0" w:after="5" w:line="240" w:lineRule="auto"/>
-      </w:pPr>
-      <w:hyperlink r:id="rId13">
-        <w:r>
-          <w:rPr>
-            <w:rStyle w:val="Hyperlink"/>
-            <w:color w:val="0A5C48"/>
-            <w:u w:val="none"/>
-          </w:rPr>
-          <w:t>GitHub</w:t>
-        </w:r>
-      </w:hyperlink>
-    </w:p>
-    <w:p>
-      <w:pPr>
-        <w:pStyle w:val="ResumeBullet"/>
-        <w:spacing w:before="0" w:after="5" w:line="226" w:lineRule="auto"/>
-      </w:pPr>
-      <w:r>
-        <w:t>Engineered a local-first AI operating runtime with provider-neutral routing, capability filtering, tool authorization, persistent memory, and post-condition verification across CLI, web, voice, and automation interfaces.</w:t>
-      </w:r>
-    </w:p>
-    <w:p>
-      <w:pPr>
-        <w:keepNext/>
-        <w:spacing w:before="30" w:after="0" w:line="240" w:lineRule="auto"/>
-      </w:pPr>
-      <w:r>
-        <w:rPr>
-          <w:b/>
-          <w:sz w:val="20"/>
-        </w:rPr>
-        <w:t>NEXORA</w:t>
-      </w:r>
-      <w:r>
-        <w:rPr>
-          <w:i/>
-          <w:color w:val="565656"/>
-          <w:sz w:val="17"/>
-        </w:rPr>
-        <w:t xml:space="preserve">  |  React, TypeScript, FastAPI, PostgreSQL, SQLAlchemy</w:t>
-      </w:r>
-    </w:p>
-    <w:p>
-      <w:pPr>
-        <w:spacing w:before="0" w:after="5" w:line="240" w:lineRule="auto"/>
-      </w:pPr>
-      <w:hyperlink r:id="rId14">
-        <w:r>
-          <w:rPr>
-            <w:rStyle w:val="Hyperlink"/>
-            <w:color w:val="0A5C48"/>
-            <w:u w:val="none"/>
-          </w:rPr>
-          <w:t>Live deployment</w:t>
-        </w:r>
-      </w:hyperlink>
-      <w:r>
-        <w:rPr>
-          <w:color w:val="6E6E6E"/>
-        </w:rPr>
-        <w:t xml:space="preserve">  ·  </w:t>
-      </w:r>
-      <w:hyperlink r:id="rId15">
-        <w:r>
-          <w:rPr>
-            <w:rStyle w:val="Hyperlink"/>
-            <w:color w:val="0A5C48"/>
-            <w:u w:val="none"/>
-          </w:rPr>
-          <w:t>GitHub</w:t>
-        </w:r>
-      </w:hyperlink>
-    </w:p>
-    <w:p>
-      <w:pPr>
-        <w:pStyle w:val="ResumeBullet"/>
-        <w:spacing w:before="0" w:after="5" w:line="226" w:lineRule="auto"/>
-      </w:pPr>
-      <w:r>
-        <w:t>Built a multi-user React and FastAPI workspace for imports, auditability, and workflow building, with OTP/Google OAuth, JWT refresh-token rotation, rate controls, and audit logging.</w:t>
-      </w:r>
-    </w:p>
-    <w:p>
-      <w:pPr>
-        <w:keepNext/>
-        <w:spacing w:before="30" w:after="0" w:line="240" w:lineRule="auto"/>
-      </w:pPr>
-      <w:r>
-        <w:rPr>
-          <w:b/>
-          <w:sz w:val="20"/>
-        </w:rPr>
-        <w:t>XSECQRE Password Manager</w:t>
-      </w:r>
-      <w:r>
-        <w:rPr>
-          <w:i/>
-          <w:color w:val="565656"/>
-          <w:sz w:val="17"/>
-        </w:rPr>
-        <w:t xml:space="preserve">  |  Python, Flask, SQLite</w:t>
-      </w:r>
-    </w:p>
-    <w:p>
-      <w:pPr>
-        <w:spacing w:before="0" w:after="5" w:line="240" w:lineRule="auto"/>
-      </w:pPr>
-      <w:hyperlink r:id="rId16">
-        <w:r>
-          <w:rPr>
-            <w:rStyle w:val="Hyperlink"/>
-            <w:color w:val="0A5C48"/>
-            <w:u w:val="none"/>
-          </w:rPr>
-          <w:t>Live deployment</w:t>
-        </w:r>
-      </w:hyperlink>
-      <w:r>
-        <w:rPr>
-          <w:color w:val="6E6E6E"/>
-        </w:rPr>
-        <w:t xml:space="preserve">  ·  </w:t>
-      </w:r>
-      <w:hyperlink r:id="rId17">
-        <w:r>
-          <w:rPr>
-            <w:rStyle w:val="Hyperlink"/>
-            <w:color w:val="0A5C48"/>
-            <w:u w:val="none"/>
-          </w:rPr>
-          <w:t>GitHub</w:t>
-        </w:r>
-      </w:hyperlink>
-    </w:p>
-    <w:p>
-      <w:pPr>
-        <w:pStyle w:val="ResumeBullet"/>
-        <w:spacing w:before="0" w:after="5" w:line="226" w:lineRule="auto"/>
-      </w:pPr>
-      <w:r>
-        <w:t>Developed a deployed password manager with authentication, validated private credential CRUD, and PBKDF2-SHA256 password hashing.</w:t>
-      </w:r>
-    </w:p>
-    <w:p>
-      <w:pPr>
-        <w:keepNext/>
-        <w:spacing w:before="30" w:after="0" w:line="240" w:lineRule="auto"/>
-      </w:pPr>
-      <w:r>
-        <w:rPr>
-          <w:b/>
-          <w:sz w:val="20"/>
-        </w:rPr>
-        <w:t>Flask URL Shortener</w:t>
-      </w:r>
-      <w:r>
-        <w:rPr>
-          <w:i/>
-          <w:color w:val="565656"/>
-          <w:sz w:val="17"/>
-        </w:rPr>
-        <w:t xml:space="preserve">  |  Python, Flask, SQLAlchemy, SQLite</w:t>
-      </w:r>
-    </w:p>
-    <w:p>
-      <w:pPr>
-        <w:spacing w:before="0" w:after="5" w:line="240" w:lineRule="auto"/>
-      </w:pPr>
-      <w:hyperlink r:id="rId18">
-        <w:r>
-          <w:rPr>
-            <w:rStyle w:val="Hyperlink"/>
-            <w:color w:val="0A5C48"/>
-            <w:u w:val="none"/>
-          </w:rPr>
-          <w:t>Live deployment</w:t>
-        </w:r>
-      </w:hyperlink>
-      <w:r>
-        <w:rPr>
-          <w:color w:val="6E6E6E"/>
-        </w:rPr>
-        <w:t xml:space="preserve">  ·  </w:t>
-      </w:r>
-      <w:hyperlink r:id="rId19">
-        <w:r>
-          <w:rPr>
-            <w:rStyle w:val="Hyperlink"/>
-            <w:color w:val="0A5C48"/>
-            <w:u w:val="none"/>
-          </w:rPr>
-          <w:t>GitHub</w:t>
-        </w:r>
-      </w:hyperlink>
-    </w:p>
-    <w:p>
-      <w:pPr>
-        <w:pStyle w:val="ResumeBullet"/>
-        <w:spacing w:before="0" w:after="5" w:line="226" w:lineRule="auto"/>
-      </w:pPr>
-      <w:r>
-        <w:t>Built a deployed utility that creates and persists unique short-URL mappings with SQLite-backed storage and environment-aware configuration.</w:t>
-      </w:r>
-    </w:p>
-    <w:p>
-      <w:pPr>
-        <w:keepNext/>
-        <w:spacing w:before="80" w:after="20" w:line="240" w:lineRule="auto"/>
-        <w:pBdr>
-          <w:bottom w:val="single" w:sz="6" w:space="2" w:color="0A5C48"/>
-        </w:pBdr>
-      </w:pPr>
-      <w:r>
-        <w:rPr>
-          <w:rFonts w:ascii="Aptos Display" w:hAnsi="Aptos Display"/>
-          <w:b/>
-          <w:color w:val="0A5C48"/>
-          <w:sz w:val="19"/>
-        </w:rPr>
-        <w:t>EDUCATION</w:t>
-      </w:r>
-    </w:p>
-    <w:p>
-      <w:pPr>
-        <w:spacing w:before="40" w:after="20" w:line="240" w:lineRule="auto"/>
-      </w:pPr>
-      <w:r>
-        <w:rPr>
-          <w:b/>
-          <w:sz w:val="20"/>
-        </w:rPr>
-        <w:t>B.E. Computer Science &amp; Engineering</w:t>
-      </w:r>
-      <w:r>
-        <w:t xml:space="preserve">  |  PSNA College of Engineering and Technology  |  CGPA: 7.0 / 10.0</w:t>
-      </w:r>
-    </w:p>
-    <w:p>
-      <w:pPr>
-        <w:keepNext/>
-        <w:spacing w:before="80" w:after="20" w:line="240" w:lineRule="auto"/>
-        <w:pBdr>
-          <w:bottom w:val="single" w:sz="6" w:space="2" w:color="0A5C48"/>
-        </w:pBdr>
-      </w:pPr>
-      <w:r>
-        <w:rPr>
-          <w:rFonts w:ascii="Aptos Display" w:hAnsi="Aptos Display"/>
-          <w:b/>
-          <w:color w:val="0A5C48"/>
-          <w:sz w:val="19"/>
-        </w:rPr>
-        <w:t>TECHNICAL SKILLS</w:t>
+        <w:t>linkedin.com/in/bharathrajp14  |  github.com/bharathrajp14  |  portfolio-ten-teal-25.vercel.app  |  Skillrack</w:t>
       </w:r>
     </w:p>
     <w:tbl>
@@ -503,378 +62,810 @@
         <w:tblW w:type="auto" w:w="0"/>
         <w:tblLayout w:type="fixed"/>
         <w:tblLook w:firstColumn="1" w:firstRow="1" w:lastColumn="0" w:lastRow="0" w:noHBand="0" w:noVBand="1" w:val="04A0"/>
+        <w:tblBorders>
+          <w:top w:val="nil"/>
+          <w:left w:val="nil"/>
+          <w:bottom w:val="nil"/>
+          <w:right w:val="nil"/>
+          <w:insideH w:val="nil"/>
+          <w:insideV w:val="nil"/>
+        </w:tblBorders>
       </w:tblPr>
       <w:tblGrid>
-        <w:gridCol w:w="1944"/>
-        <w:gridCol w:w="8136"/>
+        <w:gridCol w:w="5292"/>
+        <w:gridCol w:w="5292"/>
       </w:tblGrid>
       <w:tr>
         <w:tc>
           <w:tcPr>
-            <w:tcW w:type="dxa" w:w="1944"/>
-            <w:vAlign w:val="center"/>
-            <w:tcBorders>
-              <w:top w:val="nil"/>
-              <w:left w:val="nil"/>
-              <w:bottom w:val="nil"/>
-              <w:right w:val="nil"/>
-            </w:tcBorders>
+            <w:tcW w:type="dxa" w:w="3211"/>
+            <w:vAlign w:val="top"/>
+            <w:tcMar>
+              <w:top w:w="0" w:type="dxa"/>
+              <w:start w:w="60" w:type="dxa"/>
+              <w:bottom w:w="0" w:type="dxa"/>
+              <w:end w:w="60" w:type="dxa"/>
+            </w:tcMar>
           </w:tcPr>
           <w:p>
             <w:pPr>
-              <w:spacing w:before="0" w:after="0" w:line="240" w:lineRule="auto"/>
+              <w:keepNext/>
+              <w:spacing w:before="0" w:after="40" w:line="240" w:lineRule="auto"/>
+              <w:pBdr>
+                <w:bottom w:val="single" w:sz="6" w:space="2" w:color="0A5C48"/>
+              </w:pBdr>
+            </w:pPr>
+            <w:r>
+              <w:rPr>
+                <w:rFonts w:ascii="Aptos Display" w:hAnsi="Aptos Display"/>
+                <w:b/>
+                <w:color w:val="0A5C48"/>
+                <w:sz w:val="20"/>
+              </w:rPr>
+              <w:t>TECHNICAL SKILLS</w:t>
+            </w:r>
+          </w:p>
+          <w:p>
+            <w:pPr>
+              <w:spacing w:before="0" w:after="28" w:line="240" w:lineRule="auto"/>
             </w:pPr>
             <w:r>
               <w:rPr>
                 <w:b/>
                 <w:color w:val="0A5C48"/>
-                <w:sz w:val="16"/>
+                <w:sz w:val="17"/>
               </w:rPr>
-              <w:t>Languages</w:t>
+              <w:t xml:space="preserve">Languages: </w:t>
+            </w:r>
+            <w:r>
+              <w:rPr>
+                <w:color w:val="18201F"/>
+                <w:sz w:val="17"/>
+              </w:rPr>
+              <w:t>Python, JavaScript, C, Java, SQL</w:t>
+            </w:r>
+          </w:p>
+          <w:p>
+            <w:pPr>
+              <w:spacing w:before="0" w:after="28" w:line="240" w:lineRule="auto"/>
+            </w:pPr>
+            <w:r>
+              <w:rPr>
+                <w:b/>
+                <w:color w:val="0A5C48"/>
+                <w:sz w:val="17"/>
+              </w:rPr>
+              <w:t xml:space="preserve">Frontend: </w:t>
+            </w:r>
+            <w:r>
+              <w:rPr>
+                <w:color w:val="18201F"/>
+                <w:sz w:val="17"/>
+              </w:rPr>
+              <w:t>React, HTML5, CSS3</w:t>
+            </w:r>
+          </w:p>
+          <w:p>
+            <w:pPr>
+              <w:spacing w:before="0" w:after="28" w:line="240" w:lineRule="auto"/>
+            </w:pPr>
+            <w:r>
+              <w:rPr>
+                <w:b/>
+                <w:color w:val="0A5C48"/>
+                <w:sz w:val="17"/>
+              </w:rPr>
+              <w:t xml:space="preserve">Backend: </w:t>
+            </w:r>
+            <w:r>
+              <w:rPr>
+                <w:color w:val="18201F"/>
+                <w:sz w:val="17"/>
+              </w:rPr>
+              <w:t>REST APIs, Express.js, Node.js</w:t>
+            </w:r>
+          </w:p>
+          <w:p>
+            <w:pPr>
+              <w:spacing w:before="0" w:after="28" w:line="240" w:lineRule="auto"/>
+            </w:pPr>
+            <w:r>
+              <w:rPr>
+                <w:b/>
+                <w:color w:val="0A5C48"/>
+                <w:sz w:val="17"/>
+              </w:rPr>
+              <w:t xml:space="preserve">Database: </w:t>
+            </w:r>
+            <w:r>
+              <w:rPr>
+                <w:color w:val="18201F"/>
+                <w:sz w:val="17"/>
+              </w:rPr>
+              <w:t>MongoDB, DBMS</w:t>
+            </w:r>
+          </w:p>
+          <w:p>
+            <w:pPr>
+              <w:spacing w:before="0" w:after="28" w:line="240" w:lineRule="auto"/>
+            </w:pPr>
+            <w:r>
+              <w:rPr>
+                <w:b/>
+                <w:color w:val="0A5C48"/>
+                <w:sz w:val="17"/>
+              </w:rPr>
+              <w:t xml:space="preserve">Tools: </w:t>
+            </w:r>
+            <w:r>
+              <w:rPr>
+                <w:color w:val="18201F"/>
+                <w:sz w:val="17"/>
+              </w:rPr>
+              <w:t>Git, GitHub, Postman, VS Code, Claude, Linux/Unix</w:t>
+            </w:r>
+          </w:p>
+          <w:p>
+            <w:pPr>
+              <w:spacing w:before="0" w:after="28" w:line="240" w:lineRule="auto"/>
+            </w:pPr>
+            <w:r>
+              <w:rPr>
+                <w:b/>
+                <w:color w:val="0A5C48"/>
+                <w:sz w:val="17"/>
+              </w:rPr>
+              <w:t xml:space="preserve">Soft Skills: </w:t>
+            </w:r>
+            <w:r>
+              <w:rPr>
+                <w:color w:val="18201F"/>
+                <w:sz w:val="17"/>
+              </w:rPr>
+              <w:t>Problem solving, quick learning, team collaboration, responsible AI tool usage</w:t>
+            </w:r>
+          </w:p>
+          <w:p>
+            <w:pPr>
+              <w:keepNext/>
+              <w:spacing w:before="140" w:after="40" w:line="240" w:lineRule="auto"/>
+              <w:pBdr>
+                <w:bottom w:val="single" w:sz="6" w:space="2" w:color="0A5C48"/>
+              </w:pBdr>
+            </w:pPr>
+            <w:r>
+              <w:rPr>
+                <w:rFonts w:ascii="Aptos Display" w:hAnsi="Aptos Display"/>
+                <w:b/>
+                <w:color w:val="0A5C48"/>
+                <w:sz w:val="20"/>
+              </w:rPr>
+              <w:t>EDUCATION</w:t>
+            </w:r>
+          </w:p>
+          <w:p>
+            <w:pPr>
+              <w:spacing w:before="0" w:after="24" w:line="247" w:lineRule="auto"/>
+            </w:pPr>
+            <w:r>
+              <w:rPr>
+                <w:b/>
+                <w:color w:val="18201F"/>
+                <w:sz w:val="18"/>
+              </w:rPr>
+              <w:t>B.E. Computer Science &amp; Engineering</w:t>
+            </w:r>
+            <w:r>
+              <w:rPr>
+                <w:color w:val="18201F"/>
+                <w:sz w:val="18"/>
+              </w:rPr>
+            </w:r>
+          </w:p>
+          <w:p>
+            <w:pPr>
+              <w:spacing w:before="0" w:after="30" w:line="247" w:lineRule="auto"/>
+            </w:pPr>
+            <w:r>
+              <w:rPr>
+                <w:color w:val="545B5A"/>
+                <w:sz w:val="17"/>
+              </w:rPr>
+              <w:t>PSNA College of Engineering and Technology</w:t>
+              <w:br/>
+              <w:t>CGPA: 7.0 / 10.0</w:t>
+            </w:r>
+          </w:p>
+          <w:p>
+            <w:pPr>
+              <w:keepNext/>
+              <w:spacing w:before="140" w:after="40" w:line="240" w:lineRule="auto"/>
+              <w:pBdr>
+                <w:bottom w:val="single" w:sz="6" w:space="2" w:color="0A5C48"/>
+              </w:pBdr>
+            </w:pPr>
+            <w:r>
+              <w:rPr>
+                <w:rFonts w:ascii="Aptos Display" w:hAnsi="Aptos Display"/>
+                <w:b/>
+                <w:color w:val="0A5C48"/>
+                <w:sz w:val="20"/>
+              </w:rPr>
+              <w:t>CERTIFICATIONS</w:t>
+            </w:r>
+          </w:p>
+          <w:p>
+            <w:pPr>
+              <w:spacing w:before="0" w:after="20" w:line="240" w:lineRule="auto"/>
+              <w:ind w:left="202" w:hanging="173"/>
+            </w:pPr>
+            <w:r>
+              <w:rPr>
+                <w:color w:val="0A5C48"/>
+                <w:sz w:val="17"/>
+              </w:rPr>
+              <w:t xml:space="preserve">• </w:t>
+            </w:r>
+            <w:r>
+              <w:rPr>
+                <w:color w:val="18201F"/>
+                <w:sz w:val="17"/>
+              </w:rPr>
+              <w:t>Cloud Security Fundamentals — Palo Alto Networks Cybersecurity Academy, Feb 2025.</w:t>
+            </w:r>
+          </w:p>
+          <w:p>
+            <w:pPr>
+              <w:spacing w:before="0" w:after="20" w:line="240" w:lineRule="auto"/>
+              <w:ind w:left="202" w:hanging="173"/>
+            </w:pPr>
+            <w:r>
+              <w:rPr>
+                <w:color w:val="0A5C48"/>
+                <w:sz w:val="17"/>
+              </w:rPr>
+              <w:t xml:space="preserve">• </w:t>
+            </w:r>
+            <w:r>
+              <w:rPr>
+                <w:color w:val="18201F"/>
+                <w:sz w:val="17"/>
+              </w:rPr>
+              <w:t>Introduction to IoT and Digital Transformation — Cisco Networking Academy, Apr 2025.</w:t>
+            </w:r>
+          </w:p>
+          <w:p>
+            <w:pPr>
+              <w:spacing w:before="0" w:after="20" w:line="240" w:lineRule="auto"/>
+              <w:ind w:left="202" w:hanging="173"/>
+            </w:pPr>
+            <w:r>
+              <w:rPr>
+                <w:color w:val="0A5C48"/>
+                <w:sz w:val="17"/>
+              </w:rPr>
+              <w:t xml:space="preserve">• </w:t>
+            </w:r>
+            <w:r>
+              <w:rPr>
+                <w:color w:val="18201F"/>
+                <w:sz w:val="17"/>
+              </w:rPr>
+              <w:t>Git Training — EduPyramids, SINE, IIT Bombay, Nov 2025; 1 credit, 76.67%.</w:t>
+            </w:r>
+          </w:p>
+          <w:p>
+            <w:pPr>
+              <w:spacing w:before="0" w:after="20" w:line="240" w:lineRule="auto"/>
+              <w:ind w:left="202" w:hanging="173"/>
+            </w:pPr>
+            <w:r>
+              <w:rPr>
+                <w:color w:val="0A5C48"/>
+                <w:sz w:val="17"/>
+              </w:rPr>
+              <w:t xml:space="preserve">• </w:t>
+            </w:r>
+            <w:r>
+              <w:rPr>
+                <w:color w:val="18201F"/>
+                <w:sz w:val="17"/>
+              </w:rPr>
+              <w:t>Database Programming with SQL — Oracle Academy, Jun 2024.</w:t>
+            </w:r>
+          </w:p>
+          <w:p>
+            <w:pPr>
+              <w:spacing w:before="0" w:after="20" w:line="240" w:lineRule="auto"/>
+              <w:ind w:left="202" w:hanging="173"/>
+            </w:pPr>
+            <w:r>
+              <w:rPr>
+                <w:color w:val="0A5C48"/>
+                <w:sz w:val="17"/>
+              </w:rPr>
+              <w:t xml:space="preserve">• </w:t>
+            </w:r>
+            <w:r>
+              <w:rPr>
+                <w:color w:val="18201F"/>
+                <w:sz w:val="17"/>
+              </w:rPr>
+              <w:t>Python Basic and Java Basic — Digilabs, May 2024.</w:t>
+            </w:r>
+          </w:p>
+          <w:p>
+            <w:pPr>
+              <w:spacing w:before="0" w:after="20" w:line="240" w:lineRule="auto"/>
+              <w:ind w:left="202" w:hanging="173"/>
+            </w:pPr>
+            <w:r>
+              <w:rPr>
+                <w:color w:val="0A5C48"/>
+                <w:sz w:val="17"/>
+              </w:rPr>
+              <w:t xml:space="preserve">• </w:t>
+            </w:r>
+            <w:r>
+              <w:rPr>
+                <w:color w:val="18201F"/>
+                <w:sz w:val="17"/>
+              </w:rPr>
+              <w:t>CyberFreaks: Live Demo Session on Real Life Cyber Threats, Jul 2023.</w:t>
+            </w:r>
+          </w:p>
+          <w:p>
+            <w:pPr>
+              <w:keepNext/>
+              <w:spacing w:before="140" w:after="40" w:line="240" w:lineRule="auto"/>
+              <w:pBdr>
+                <w:bottom w:val="single" w:sz="6" w:space="2" w:color="0A5C48"/>
+              </w:pBdr>
+            </w:pPr>
+            <w:r>
+              <w:rPr>
+                <w:rFonts w:ascii="Aptos Display" w:hAnsi="Aptos Display"/>
+                <w:b/>
+                <w:color w:val="0A5C48"/>
+                <w:sz w:val="20"/>
+              </w:rPr>
+              <w:t>PROGRAMMING PRACTICE</w:t>
+            </w:r>
+          </w:p>
+          <w:p>
+            <w:pPr>
+              <w:spacing w:before="0" w:after="0" w:line="247" w:lineRule="auto"/>
+            </w:pPr>
+            <w:r>
+              <w:rPr>
+                <w:color w:val="18201F"/>
+                <w:sz w:val="17"/>
+              </w:rPr>
+              <w:t>Skillrack: 116 programs solved, including 77 in C and 39 in Python3; 19 bronze badges.</w:t>
             </w:r>
           </w:p>
         </w:tc>
         <w:tc>
           <w:tcPr>
-            <w:tcW w:type="dxa" w:w="8136"/>
-            <w:vAlign w:val="center"/>
-            <w:tcBorders>
-              <w:top w:val="nil"/>
-              <w:left w:val="nil"/>
-              <w:bottom w:val="nil"/>
-              <w:right w:val="nil"/>
-            </w:tcBorders>
+            <w:tcW w:type="dxa" w:w="7214"/>
+            <w:vAlign w:val="top"/>
+            <w:tcMar>
+              <w:top w:w="0" w:type="dxa"/>
+              <w:start w:w="60" w:type="dxa"/>
+              <w:bottom w:w="0" w:type="dxa"/>
+              <w:end w:w="60" w:type="dxa"/>
+            </w:tcMar>
           </w:tcPr>
           <w:p>
             <w:pPr>
-              <w:spacing w:before="0" w:after="0" w:line="240" w:lineRule="auto"/>
+              <w:keepNext/>
+              <w:spacing w:before="0" w:after="40" w:line="240" w:lineRule="auto"/>
+              <w:pBdr>
+                <w:bottom w:val="single" w:sz="6" w:space="2" w:color="0A5C48"/>
+              </w:pBdr>
             </w:pPr>
             <w:r>
               <w:rPr>
-                <w:sz w:val="16"/>
+                <w:rFonts w:ascii="Aptos Display" w:hAnsi="Aptos Display"/>
+                <w:b/>
+                <w:color w:val="0A5C48"/>
+                <w:sz w:val="20"/>
               </w:rPr>
-              <w:t>Python, JavaScript, C, Java, SQL</w:t>
+              <w:t>PROFESSIONAL SUMMARY</w:t>
             </w:r>
           </w:p>
-        </w:tc>
-      </w:tr>
-      <w:tr>
-        <w:tc>
-          <w:tcPr>
-            <w:tcW w:type="dxa" w:w="1944"/>
-            <w:vAlign w:val="center"/>
-            <w:tcBorders>
-              <w:top w:val="nil"/>
-              <w:left w:val="nil"/>
-              <w:bottom w:val="nil"/>
-              <w:right w:val="nil"/>
-            </w:tcBorders>
-          </w:tcPr>
           <w:p>
             <w:pPr>
-              <w:spacing w:before="0" w:after="0" w:line="240" w:lineRule="auto"/>
+              <w:spacing w:before="0" w:after="30" w:line="247" w:lineRule="auto"/>
+            </w:pPr>
+            <w:r>
+              <w:rPr>
+                <w:color w:val="18201F"/>
+                <w:sz w:val="18"/>
+              </w:rPr>
+              <w:t>Software Development Intern with hands-on experience building React modules and REST API–driven workflows. Develops backend, full-stack, and AI-enabled applications using Python, JavaScript, FastAPI, Node.js, Express.js, SQL, and SQLite, with a security-conscious approach to authentication, data handling, and deployed web applications.</w:t>
+            </w:r>
+          </w:p>
+          <w:p>
+            <w:pPr>
+              <w:keepNext/>
+              <w:spacing w:before="140" w:after="40" w:line="240" w:lineRule="auto"/>
+              <w:pBdr>
+                <w:bottom w:val="single" w:sz="6" w:space="2" w:color="0A5C48"/>
+              </w:pBdr>
+            </w:pPr>
+            <w:r>
+              <w:rPr>
+                <w:rFonts w:ascii="Aptos Display" w:hAnsi="Aptos Display"/>
+                <w:b/>
+                <w:color w:val="0A5C48"/>
+                <w:sz w:val="20"/>
+              </w:rPr>
+              <w:t>EXPERIENCE</w:t>
+            </w:r>
+          </w:p>
+          <w:p>
+            <w:pPr>
+              <w:keepNext/>
+              <w:spacing w:before="60" w:after="10" w:line="240" w:lineRule="auto"/>
             </w:pPr>
             <w:r>
               <w:rPr>
                 <w:b/>
-                <w:color w:val="0A5C48"/>
-                <w:sz w:val="16"/>
+                <w:color w:val="18201F"/>
+                <w:sz w:val="21"/>
               </w:rPr>
-              <w:t>Frontend</w:t>
+              <w:t>Software Development Intern</w:t>
+            </w:r>
+            <w:r>
+              <w:rPr>
+                <w:color w:val="545B5A"/>
+                <w:sz w:val="17"/>
+              </w:rPr>
+              <w:t xml:space="preserve">  |  Kevell Corp  |  Present</w:t>
             </w:r>
           </w:p>
-        </w:tc>
-        <w:tc>
-          <w:tcPr>
-            <w:tcW w:type="dxa" w:w="8136"/>
-            <w:vAlign w:val="center"/>
-            <w:tcBorders>
-              <w:top w:val="nil"/>
-              <w:left w:val="nil"/>
-              <w:bottom w:val="nil"/>
-              <w:right w:val="nil"/>
-            </w:tcBorders>
-          </w:tcPr>
           <w:p>
             <w:pPr>
-              <w:spacing w:before="0" w:after="0" w:line="240" w:lineRule="auto"/>
+              <w:spacing w:before="0" w:after="20" w:line="240" w:lineRule="auto"/>
+              <w:ind w:left="202" w:hanging="173"/>
             </w:pPr>
             <w:r>
               <w:rPr>
-                <w:sz w:val="16"/>
+                <w:color w:val="0A5C48"/>
+                <w:sz w:val="18"/>
               </w:rPr>
-              <w:t>React, HTML5, CSS3</w:t>
+              <w:t xml:space="preserve">• </w:t>
+            </w:r>
+            <w:r>
+              <w:rPr>
+                <w:color w:val="18201F"/>
+                <w:sz w:val="18"/>
+              </w:rPr>
+              <w:t>Develop React modules and integrate REST API workflows across authentication, vendor management, notifications, payments, and wallet functionality.</w:t>
             </w:r>
           </w:p>
-        </w:tc>
-      </w:tr>
-      <w:tr>
-        <w:tc>
-          <w:tcPr>
-            <w:tcW w:type="dxa" w:w="1944"/>
-            <w:vAlign w:val="center"/>
-            <w:tcBorders>
-              <w:top w:val="nil"/>
-              <w:left w:val="nil"/>
-              <w:bottom w:val="nil"/>
-              <w:right w:val="nil"/>
-            </w:tcBorders>
-          </w:tcPr>
           <w:p>
             <w:pPr>
-              <w:spacing w:before="0" w:after="0" w:line="240" w:lineRule="auto"/>
+              <w:spacing w:before="0" w:after="20" w:line="240" w:lineRule="auto"/>
+              <w:ind w:left="202" w:hanging="173"/>
+            </w:pPr>
+            <w:r>
+              <w:rPr>
+                <w:color w:val="0A5C48"/>
+                <w:sz w:val="18"/>
+              </w:rPr>
+              <w:t xml:space="preserve">• </w:t>
+            </w:r>
+            <w:r>
+              <w:rPr>
+                <w:color w:val="18201F"/>
+                <w:sz w:val="18"/>
+              </w:rPr>
+              <w:t>Collaborate with backend developers to validate API-driven user journeys, debug full-stack workflows, and manage changes through Git-based team practices.</w:t>
+            </w:r>
+          </w:p>
+          <w:p>
+            <w:pPr>
+              <w:keepNext/>
+              <w:spacing w:before="60" w:after="10" w:line="240" w:lineRule="auto"/>
             </w:pPr>
             <w:r>
               <w:rPr>
                 <w:b/>
-                <w:color w:val="0A5C48"/>
-                <w:sz w:val="16"/>
+                <w:color w:val="18201F"/>
+                <w:sz w:val="21"/>
               </w:rPr>
-              <w:t>Backend</w:t>
+              <w:t>Cybersecurity Intern</w:t>
+            </w:r>
+            <w:r>
+              <w:rPr>
+                <w:color w:val="545B5A"/>
+                <w:sz w:val="17"/>
+              </w:rPr>
+              <w:t xml:space="preserve">  |  NullClass  |  Jun 2025 – Jul 2025</w:t>
             </w:r>
           </w:p>
-        </w:tc>
-        <w:tc>
-          <w:tcPr>
-            <w:tcW w:type="dxa" w:w="8136"/>
-            <w:vAlign w:val="center"/>
-            <w:tcBorders>
-              <w:top w:val="nil"/>
-              <w:left w:val="nil"/>
-              <w:bottom w:val="nil"/>
-              <w:right w:val="nil"/>
-            </w:tcBorders>
-          </w:tcPr>
           <w:p>
             <w:pPr>
-              <w:spacing w:before="0" w:after="0" w:line="240" w:lineRule="auto"/>
+              <w:spacing w:before="0" w:after="20" w:line="240" w:lineRule="auto"/>
+              <w:ind w:left="202" w:hanging="173"/>
             </w:pPr>
             <w:r>
               <w:rPr>
-                <w:sz w:val="16"/>
+                <w:color w:val="0A5C48"/>
+                <w:sz w:val="18"/>
               </w:rPr>
-              <w:t>REST APIs, Express.js, Node.js</w:t>
+              <w:t xml:space="preserve">• </w:t>
+            </w:r>
+            <w:r>
+              <w:rPr>
+                <w:color w:val="18201F"/>
+                <w:sz w:val="18"/>
+              </w:rPr>
+              <w:t>Completed controlled training in ethical-hacking fundamentals, SQL injection, cross-site scripting, cross-site request forgery, and vulnerability reporting concepts.</w:t>
             </w:r>
           </w:p>
-        </w:tc>
-      </w:tr>
-      <w:tr>
-        <w:tc>
-          <w:tcPr>
-            <w:tcW w:type="dxa" w:w="1944"/>
-            <w:vAlign w:val="center"/>
-            <w:tcBorders>
-              <w:top w:val="nil"/>
-              <w:left w:val="nil"/>
-              <w:bottom w:val="nil"/>
-              <w:right w:val="nil"/>
-            </w:tcBorders>
-          </w:tcPr>
           <w:p>
             <w:pPr>
-              <w:spacing w:before="0" w:after="0" w:line="240" w:lineRule="auto"/>
+              <w:spacing w:before="0" w:after="20" w:line="240" w:lineRule="auto"/>
+              <w:ind w:left="202" w:hanging="173"/>
+            </w:pPr>
+            <w:r>
+              <w:rPr>
+                <w:color w:val="0A5C48"/>
+                <w:sz w:val="18"/>
+              </w:rPr>
+              <w:t xml:space="preserve">• </w:t>
+            </w:r>
+            <w:r>
+              <w:rPr>
+                <w:color w:val="18201F"/>
+                <w:sz w:val="18"/>
+              </w:rPr>
+              <w:t>Applied web-security concepts through structured lab practice and documented foundational observations for safer application development.</w:t>
+            </w:r>
+          </w:p>
+          <w:p>
+            <w:pPr>
+              <w:keepNext/>
+              <w:spacing w:before="140" w:after="40" w:line="240" w:lineRule="auto"/>
+              <w:pBdr>
+                <w:bottom w:val="single" w:sz="6" w:space="2" w:color="0A5C48"/>
+              </w:pBdr>
+            </w:pPr>
+            <w:r>
+              <w:rPr>
+                <w:rFonts w:ascii="Aptos Display" w:hAnsi="Aptos Display"/>
+                <w:b/>
+                <w:color w:val="0A5C48"/>
+                <w:sz w:val="20"/>
+              </w:rPr>
+              <w:t>SELECTED PROJECTS</w:t>
+            </w:r>
+          </w:p>
+          <w:p>
+            <w:pPr>
+              <w:keepNext/>
+              <w:spacing w:before="70" w:after="0" w:line="240" w:lineRule="auto"/>
             </w:pPr>
             <w:r>
               <w:rPr>
                 <w:b/>
-                <w:color w:val="0A5C48"/>
-                <w:sz w:val="16"/>
+                <w:color w:val="18201F"/>
+                <w:sz w:val="20"/>
               </w:rPr>
-              <w:t>Database</w:t>
+              <w:t>NEXORA</w:t>
+            </w:r>
+            <w:r>
+              <w:rPr>
+                <w:i/>
+                <w:color w:val="545B5A"/>
+                <w:sz w:val="17"/>
+              </w:rPr>
+              <w:t xml:space="preserve">  |  React, TypeScript, FastAPI, PostgreSQL</w:t>
             </w:r>
           </w:p>
-        </w:tc>
-        <w:tc>
-          <w:tcPr>
-            <w:tcW w:type="dxa" w:w="8136"/>
-            <w:vAlign w:val="center"/>
-            <w:tcBorders>
-              <w:top w:val="nil"/>
-              <w:left w:val="nil"/>
-              <w:bottom w:val="nil"/>
-              <w:right w:val="nil"/>
-            </w:tcBorders>
-          </w:tcPr>
           <w:p>
             <w:pPr>
-              <w:spacing w:before="0" w:after="0" w:line="240" w:lineRule="auto"/>
+              <w:spacing w:before="0" w:after="10" w:line="240" w:lineRule="auto"/>
             </w:pPr>
             <w:r>
               <w:rPr>
-                <w:sz w:val="16"/>
+                <w:color w:val="0A5C48"/>
+                <w:sz w:val="17"/>
               </w:rPr>
-              <w:t>MongoDB, DBMS</w:t>
+              <w:t>Live: nexora-sb16.onrender.com  ·  GitHub: github.com/bharathrajp14/nexora</w:t>
             </w:r>
           </w:p>
-        </w:tc>
-      </w:tr>
-      <w:tr>
-        <w:tc>
-          <w:tcPr>
-            <w:tcW w:type="dxa" w:w="1944"/>
-            <w:vAlign w:val="center"/>
-            <w:tcBorders>
-              <w:top w:val="nil"/>
-              <w:left w:val="nil"/>
-              <w:bottom w:val="nil"/>
-              <w:right w:val="nil"/>
-            </w:tcBorders>
-          </w:tcPr>
           <w:p>
             <w:pPr>
-              <w:spacing w:before="0" w:after="0" w:line="240" w:lineRule="auto"/>
+              <w:spacing w:before="0" w:after="20" w:line="240" w:lineRule="auto"/>
+              <w:ind w:left="202" w:hanging="173"/>
+            </w:pPr>
+            <w:r>
+              <w:rPr>
+                <w:color w:val="0A5C48"/>
+                <w:sz w:val="17"/>
+              </w:rPr>
+              <w:t xml:space="preserve">• </w:t>
+            </w:r>
+            <w:r>
+              <w:rPr>
+                <w:color w:val="18201F"/>
+                <w:sz w:val="17"/>
+              </w:rPr>
+              <w:t>Built a multi-user React and FastAPI workspace for imports, auditability, and workflow building, with OTP/Google OAuth, JWT refresh-token rotation, rate controls, and audit logging.</w:t>
+            </w:r>
+          </w:p>
+          <w:p>
+            <w:pPr>
+              <w:keepNext/>
+              <w:spacing w:before="70" w:after="0" w:line="240" w:lineRule="auto"/>
             </w:pPr>
             <w:r>
               <w:rPr>
                 <w:b/>
-                <w:color w:val="0A5C48"/>
-                <w:sz w:val="16"/>
+                <w:color w:val="18201F"/>
+                <w:sz w:val="20"/>
               </w:rPr>
-              <w:t>Tools &amp; Platforms</w:t>
+              <w:t>BR JARVIS</w:t>
+            </w:r>
+            <w:r>
+              <w:rPr>
+                <w:i/>
+                <w:color w:val="545B5A"/>
+                <w:sz w:val="17"/>
+              </w:rPr>
+              <w:t xml:space="preserve">  |  Python, FastAPI, SQLite, LLM Routing</w:t>
             </w:r>
           </w:p>
-        </w:tc>
-        <w:tc>
-          <w:tcPr>
-            <w:tcW w:type="dxa" w:w="8136"/>
-            <w:vAlign w:val="center"/>
-            <w:tcBorders>
-              <w:top w:val="nil"/>
-              <w:left w:val="nil"/>
-              <w:bottom w:val="nil"/>
-              <w:right w:val="nil"/>
-            </w:tcBorders>
-          </w:tcPr>
           <w:p>
             <w:pPr>
-              <w:spacing w:before="0" w:after="0" w:line="240" w:lineRule="auto"/>
+              <w:spacing w:before="0" w:after="10" w:line="240" w:lineRule="auto"/>
             </w:pPr>
             <w:r>
               <w:rPr>
-                <w:sz w:val="16"/>
+                <w:color w:val="0A5C48"/>
+                <w:sz w:val="17"/>
               </w:rPr>
-              <w:t>Git, GitHub, Postman, VS Code, Claude, Linux/Unix</w:t>
+              <w:t>GitHub: github.com/bharathrajp14/BrJarvis</w:t>
             </w:r>
           </w:p>
-        </w:tc>
-      </w:tr>
-      <w:tr>
-        <w:tc>
-          <w:tcPr>
-            <w:tcW w:type="dxa" w:w="1944"/>
-            <w:vAlign w:val="center"/>
-            <w:tcBorders>
-              <w:top w:val="nil"/>
-              <w:left w:val="nil"/>
-              <w:bottom w:val="nil"/>
-              <w:right w:val="nil"/>
-            </w:tcBorders>
-          </w:tcPr>
           <w:p>
             <w:pPr>
-              <w:spacing w:before="0" w:after="0" w:line="240" w:lineRule="auto"/>
+              <w:spacing w:before="0" w:after="20" w:line="240" w:lineRule="auto"/>
+              <w:ind w:left="202" w:hanging="173"/>
+            </w:pPr>
+            <w:r>
+              <w:rPr>
+                <w:color w:val="0A5C48"/>
+                <w:sz w:val="17"/>
+              </w:rPr>
+              <w:t xml:space="preserve">• </w:t>
+            </w:r>
+            <w:r>
+              <w:rPr>
+                <w:color w:val="18201F"/>
+                <w:sz w:val="17"/>
+              </w:rPr>
+              <w:t>Engineered a local-first AI operating runtime with provider-neutral routing, capability filtering, tool authorization, persistent memory, and post-condition verification across CLI, web, voice, and automation interfaces.</w:t>
+            </w:r>
+          </w:p>
+          <w:p>
+            <w:pPr>
+              <w:keepNext/>
+              <w:spacing w:before="70" w:after="0" w:line="240" w:lineRule="auto"/>
             </w:pPr>
             <w:r>
               <w:rPr>
                 <w:b/>
-                <w:color w:val="0A5C48"/>
-                <w:sz w:val="16"/>
+                <w:color w:val="18201F"/>
+                <w:sz w:val="20"/>
               </w:rPr>
-              <w:t>Soft Skills</w:t>
+              <w:t>XSECQRE Password Manager</w:t>
+            </w:r>
+            <w:r>
+              <w:rPr>
+                <w:i/>
+                <w:color w:val="545B5A"/>
+                <w:sz w:val="17"/>
+              </w:rPr>
+              <w:t xml:space="preserve">  |  Python, Flask, SQLite</w:t>
             </w:r>
           </w:p>
-        </w:tc>
-        <w:tc>
-          <w:tcPr>
-            <w:tcW w:type="dxa" w:w="8136"/>
-            <w:vAlign w:val="center"/>
-            <w:tcBorders>
-              <w:top w:val="nil"/>
-              <w:left w:val="nil"/>
-              <w:bottom w:val="nil"/>
-              <w:right w:val="nil"/>
-            </w:tcBorders>
-          </w:tcPr>
           <w:p>
             <w:pPr>
-              <w:spacing w:before="0" w:after="0" w:line="240" w:lineRule="auto"/>
+              <w:spacing w:before="0" w:after="10" w:line="240" w:lineRule="auto"/>
             </w:pPr>
             <w:r>
               <w:rPr>
-                <w:sz w:val="16"/>
+                <w:color w:val="0A5C48"/>
+                <w:sz w:val="17"/>
               </w:rPr>
-              <w:t>Problem solving, quick learning, team collaboration, responsible AI tool usage</w:t>
+              <w:t>Live: xsecqre.onrender.com  ·  GitHub: github.com/bharathrajp14/XSECQRE-Password-Manager-Web-App</w:t>
+            </w:r>
+          </w:p>
+          <w:p>
+            <w:pPr>
+              <w:spacing w:before="0" w:after="20" w:line="240" w:lineRule="auto"/>
+              <w:ind w:left="202" w:hanging="173"/>
+            </w:pPr>
+            <w:r>
+              <w:rPr>
+                <w:color w:val="0A5C48"/>
+                <w:sz w:val="17"/>
+              </w:rPr>
+              <w:t xml:space="preserve">• </w:t>
+            </w:r>
+            <w:r>
+              <w:rPr>
+                <w:color w:val="18201F"/>
+                <w:sz w:val="17"/>
+              </w:rPr>
+              <w:t>Developed a deployed password manager with authentication, validated private credential CRUD, PBKDF2-SHA256 password hashing, and user-bound routing.</w:t>
+            </w:r>
+          </w:p>
+          <w:p>
+            <w:pPr>
+              <w:keepNext/>
+              <w:spacing w:before="70" w:after="0" w:line="240" w:lineRule="auto"/>
+            </w:pPr>
+            <w:r>
+              <w:rPr>
+                <w:b/>
+                <w:color w:val="18201F"/>
+                <w:sz w:val="20"/>
+              </w:rPr>
+              <w:t>Flask URL Shortener</w:t>
+            </w:r>
+            <w:r>
+              <w:rPr>
+                <w:i/>
+                <w:color w:val="545B5A"/>
+                <w:sz w:val="17"/>
+              </w:rPr>
+              <w:t xml:space="preserve">  |  Python, Flask, SQLAlchemy, SQLite</w:t>
+            </w:r>
+          </w:p>
+          <w:p>
+            <w:pPr>
+              <w:spacing w:before="0" w:after="10" w:line="240" w:lineRule="auto"/>
+            </w:pPr>
+            <w:r>
+              <w:rPr>
+                <w:color w:val="0A5C48"/>
+                <w:sz w:val="17"/>
+              </w:rPr>
+              <w:t>Live: flask-url-shortener-1-aof3.onrender.com  ·  GitHub: github.com/bharathrajp14/flask-url-shortener</w:t>
+            </w:r>
+          </w:p>
+          <w:p>
+            <w:pPr>
+              <w:spacing w:before="0" w:after="20" w:line="240" w:lineRule="auto"/>
+              <w:ind w:left="202" w:hanging="173"/>
+            </w:pPr>
+            <w:r>
+              <w:rPr>
+                <w:color w:val="0A5C48"/>
+                <w:sz w:val="17"/>
+              </w:rPr>
+              <w:t xml:space="preserve">• </w:t>
+            </w:r>
+            <w:r>
+              <w:rPr>
+                <w:color w:val="18201F"/>
+                <w:sz w:val="17"/>
+              </w:rPr>
+              <w:t>Built a deployed utility that creates and persists unique short-URL mappings with SQLite-backed storage, API-style retrieval, and environment-aware configuration.</w:t>
             </w:r>
           </w:p>
         </w:tc>
       </w:tr>
     </w:tbl>
-    <w:p>
-      <w:pPr>
-        <w:keepNext/>
-        <w:spacing w:before="80" w:after="20" w:line="240" w:lineRule="auto"/>
-        <w:pBdr>
-          <w:bottom w:val="single" w:sz="6" w:space="2" w:color="0A5C48"/>
-        </w:pBdr>
-      </w:pPr>
-      <w:r>
-        <w:rPr>
-          <w:rFonts w:ascii="Aptos Display" w:hAnsi="Aptos Display"/>
-          <w:b/>
-          <w:color w:val="0A5C48"/>
-          <w:sz w:val="19"/>
-        </w:rPr>
-        <w:t>CERTIFICATIONS &amp; PROGRAMMING PRACTICE</w:t>
-      </w:r>
-    </w:p>
-    <w:p>
-      <w:pPr>
-        <w:pStyle w:val="ResumeBullet"/>
-        <w:spacing w:before="0" w:after="5" w:line="226" w:lineRule="auto"/>
-      </w:pPr>
-      <w:r>
-        <w:t>Cloud Security Fundamentals — Palo Alto Networks Cybersecurity Academy, Feb 2025.</w:t>
-      </w:r>
-    </w:p>
-    <w:p>
-      <w:pPr>
-        <w:pStyle w:val="ResumeBullet"/>
-        <w:spacing w:before="0" w:after="5" w:line="226" w:lineRule="auto"/>
-      </w:pPr>
-      <w:r>
-        <w:t>Introduction to IoT and Digital Transformation — Cisco Networking Academy, Apr 2025.</w:t>
-      </w:r>
-    </w:p>
-    <w:p>
-      <w:pPr>
-        <w:pStyle w:val="ResumeBullet"/>
-        <w:spacing w:before="0" w:after="5" w:line="226" w:lineRule="auto"/>
-      </w:pPr>
-      <w:r>
-        <w:t>Git Training — EduPyramids, SINE, IIT Bombay, Nov 2025; 1 credit, 76.67% score.</w:t>
-      </w:r>
-    </w:p>
-    <w:p>
-      <w:pPr>
-        <w:pStyle w:val="ResumeBullet"/>
-        <w:spacing w:before="0" w:after="5" w:line="226" w:lineRule="auto"/>
-      </w:pPr>
-      <w:r>
-        <w:t>Database Programming with SQL — Oracle Academy, Jun 2024.</w:t>
-      </w:r>
-    </w:p>
-    <w:p>
-      <w:pPr>
-        <w:pStyle w:val="ResumeBullet"/>
-        <w:spacing w:before="0" w:after="5" w:line="226" w:lineRule="auto"/>
-      </w:pPr>
-      <w:r>
-        <w:t>Digilabs Python Basic and Java Basic programs, May 2024; Skillrack: 116 programs solved, including 77 in C and 39 in Python3, with 19 bronze badges.</w:t>
-      </w:r>
-    </w:p>
     <w:sectPr>
-      <w:pgSz w:w="12240" w:h="15840"/>
-      <w:pgMar w:top="490" w:right="792" w:bottom="490" w:left="792" w:header="720" w:footer="720" w:gutter="0"/>
+      <w:pgSz w:w="11909" w:h="16834"/>
+      <w:pgMar w:top="619" w:right="662" w:bottom="619" w:left="662" w:header="720" w:footer="720" w:gutter="0"/>
       <w:cols w:space="720"/>
       <w:docGrid w:linePitch="360"/>
     </w:sectPr>
@@ -1247,7 +1238,7 @@
     <w:rsid w:val="00FC693F"/>
     <w:rPr>
       <w:rFonts w:ascii="Aptos" w:hAnsi="Aptos"/>
-      <w:sz w:val="17"/>
+      <w:sz w:val="18"/>
     </w:rPr>
   </w:style>
   <w:style w:type="paragraph" w:styleId="Header">
@@ -12931,28 +12922,6 @@
         <w:shd w:val="clear" w:color="auto" w:fill="FBCAA2" w:themeFill="accent6" w:themeFillTint="7F"/>
       </w:tcPr>
     </w:tblStylePr>
-  </w:style>
-  <w:style w:type="paragraph" w:customStyle="1" w:styleId="ResumeBody">
-    <w:name w:val="Resume Body"/>
-    <w:basedOn w:val="Normal"/>
-    <w:rPr>
-      <w:rFonts w:ascii="Aptos" w:hAnsi="Aptos"/>
-      <w:sz w:val="17"/>
-    </w:rPr>
-  </w:style>
-  <w:style w:type="paragraph" w:customStyle="1" w:styleId="ResumeBullet">
-    <w:name w:val="Resume Bullet"/>
-    <w:basedOn w:val="Normal"/>
-    <w:pPr>
-      <w:tabs>
-        <w:tab w:pos="216" w:val="left"/>
-      </w:tabs>
-      <w:ind w:left="216" w:hanging="173"/>
-    </w:pPr>
-    <w:rPr>
-      <w:rFonts w:ascii="Aptos" w:hAnsi="Aptos"/>
-      <w:sz w:val="16"/>
-    </w:rPr>
   </w:style>
 </w:styles>
 </file>

</xml_diff>

<commit_message>
docs: publish ATS-friendly resume
</commit_message>
<xml_diff>
--- a/client/public/portfolio-assets/Bharath_Raj_P_Resume.docx
+++ b/client/public/portfolio-assets/Bharath_Raj_P_Resume.docx
@@ -11,24 +11,24 @@
         <w:rPr>
           <w:rFonts w:ascii="Aptos Display" w:hAnsi="Aptos Display"/>
           <w:b/>
-          <w:color w:val="18201F"/>
-          <w:sz w:val="44"/>
+          <w:color w:val="181D1C"/>
+          <w:sz w:val="42"/>
         </w:rPr>
         <w:t>BHARATH RAJ P</w:t>
       </w:r>
     </w:p>
     <w:p>
       <w:pPr>
-        <w:spacing w:before="0" w:after="20" w:line="240" w:lineRule="auto"/>
+        <w:spacing w:before="0" w:after="16" w:line="240" w:lineRule="auto"/>
         <w:jc w:val="center"/>
       </w:pPr>
       <w:r>
         <w:rPr>
           <w:b/>
-          <w:color w:val="0A5C48"/>
+          <w:color w:val="125846"/>
           <w:sz w:val="20"/>
         </w:rPr>
-        <w:t>Software Development Intern  |  Backend, Full-Stack &amp; AI Systems</w:t>
+        <w:t>Software Development Intern | Backend, Full-Stack &amp; AI Systems</w:t>
       </w:r>
     </w:p>
     <w:p>
@@ -38,834 +38,594 @@
       </w:pPr>
       <w:r>
         <w:rPr>
-          <w:color w:val="18201F"/>
+          <w:color w:val="181D1C"/>
           <w:sz w:val="18"/>
         </w:rPr>
-        <w:t>Tamil Nadu, India  |  +91 93445 18573  |  bharathraj14120@gmail.com</w:t>
+        <w:t>Tamil Nadu, India | +91 93445 18573 | bharathraj14120@gmail.com</w:t>
       </w:r>
     </w:p>
     <w:p>
       <w:pPr>
-        <w:spacing w:before="0" w:after="40" w:line="240" w:lineRule="auto"/>
+        <w:spacing w:before="0" w:after="60" w:line="240" w:lineRule="auto"/>
         <w:jc w:val="center"/>
       </w:pPr>
       <w:r>
         <w:rPr>
-          <w:color w:val="0A5C48"/>
+          <w:color w:val="125846"/>
           <w:sz w:val="16"/>
         </w:rPr>
-        <w:t>linkedin.com/in/bharathrajp14  |  github.com/bharathrajp14  |  portfolio-ten-teal-25.vercel.app  |  Skillrack</w:t>
+        <w:t>linkedin.com/in/bharathrajp14 | github.com/bharathrajp14 | portfolio-ten-teal-25.vercel.app | Skillrack</w:t>
       </w:r>
     </w:p>
-    <w:tbl>
-      <w:tblPr>
-        <w:tblW w:type="auto" w:w="0"/>
-        <w:tblLayout w:type="fixed"/>
-        <w:tblLook w:firstColumn="1" w:firstRow="1" w:lastColumn="0" w:lastRow="0" w:noHBand="0" w:noVBand="1" w:val="04A0"/>
-        <w:tblBorders>
-          <w:top w:val="nil"/>
-          <w:left w:val="nil"/>
-          <w:bottom w:val="nil"/>
-          <w:right w:val="nil"/>
-          <w:insideH w:val="nil"/>
-          <w:insideV w:val="nil"/>
-        </w:tblBorders>
-      </w:tblPr>
-      <w:tblGrid>
-        <w:gridCol w:w="5292"/>
-        <w:gridCol w:w="5292"/>
-      </w:tblGrid>
-      <w:tr>
-        <w:tc>
-          <w:tcPr>
-            <w:tcW w:type="dxa" w:w="3211"/>
-            <w:vAlign w:val="top"/>
-            <w:tcMar>
-              <w:top w:w="0" w:type="dxa"/>
-              <w:start w:w="60" w:type="dxa"/>
-              <w:bottom w:w="0" w:type="dxa"/>
-              <w:end w:w="60" w:type="dxa"/>
-            </w:tcMar>
-          </w:tcPr>
-          <w:p>
-            <w:pPr>
-              <w:keepNext/>
-              <w:spacing w:before="0" w:after="40" w:line="240" w:lineRule="auto"/>
-              <w:pBdr>
-                <w:bottom w:val="single" w:sz="6" w:space="2" w:color="0A5C48"/>
-              </w:pBdr>
-            </w:pPr>
-            <w:r>
-              <w:rPr>
-                <w:rFonts w:ascii="Aptos Display" w:hAnsi="Aptos Display"/>
-                <w:b/>
-                <w:color w:val="0A5C48"/>
-                <w:sz w:val="20"/>
-              </w:rPr>
-              <w:t>TECHNICAL SKILLS</w:t>
-            </w:r>
-          </w:p>
-          <w:p>
-            <w:pPr>
-              <w:spacing w:before="0" w:after="28" w:line="240" w:lineRule="auto"/>
-            </w:pPr>
-            <w:r>
-              <w:rPr>
-                <w:b/>
-                <w:color w:val="0A5C48"/>
-                <w:sz w:val="17"/>
-              </w:rPr>
-              <w:t xml:space="preserve">Languages: </w:t>
-            </w:r>
-            <w:r>
-              <w:rPr>
-                <w:color w:val="18201F"/>
-                <w:sz w:val="17"/>
-              </w:rPr>
-              <w:t>Python, JavaScript, C, Java, SQL</w:t>
-            </w:r>
-          </w:p>
-          <w:p>
-            <w:pPr>
-              <w:spacing w:before="0" w:after="28" w:line="240" w:lineRule="auto"/>
-            </w:pPr>
-            <w:r>
-              <w:rPr>
-                <w:b/>
-                <w:color w:val="0A5C48"/>
-                <w:sz w:val="17"/>
-              </w:rPr>
-              <w:t xml:space="preserve">Frontend: </w:t>
-            </w:r>
-            <w:r>
-              <w:rPr>
-                <w:color w:val="18201F"/>
-                <w:sz w:val="17"/>
-              </w:rPr>
-              <w:t>React, HTML5, CSS3</w:t>
-            </w:r>
-          </w:p>
-          <w:p>
-            <w:pPr>
-              <w:spacing w:before="0" w:after="28" w:line="240" w:lineRule="auto"/>
-            </w:pPr>
-            <w:r>
-              <w:rPr>
-                <w:b/>
-                <w:color w:val="0A5C48"/>
-                <w:sz w:val="17"/>
-              </w:rPr>
-              <w:t xml:space="preserve">Backend: </w:t>
-            </w:r>
-            <w:r>
-              <w:rPr>
-                <w:color w:val="18201F"/>
-                <w:sz w:val="17"/>
-              </w:rPr>
-              <w:t>REST APIs, Express.js, Node.js</w:t>
-            </w:r>
-          </w:p>
-          <w:p>
-            <w:pPr>
-              <w:spacing w:before="0" w:after="28" w:line="240" w:lineRule="auto"/>
-            </w:pPr>
-            <w:r>
-              <w:rPr>
-                <w:b/>
-                <w:color w:val="0A5C48"/>
-                <w:sz w:val="17"/>
-              </w:rPr>
-              <w:t xml:space="preserve">Database: </w:t>
-            </w:r>
-            <w:r>
-              <w:rPr>
-                <w:color w:val="18201F"/>
-                <w:sz w:val="17"/>
-              </w:rPr>
-              <w:t>MongoDB, DBMS</w:t>
-            </w:r>
-          </w:p>
-          <w:p>
-            <w:pPr>
-              <w:spacing w:before="0" w:after="28" w:line="240" w:lineRule="auto"/>
-            </w:pPr>
-            <w:r>
-              <w:rPr>
-                <w:b/>
-                <w:color w:val="0A5C48"/>
-                <w:sz w:val="17"/>
-              </w:rPr>
-              <w:t xml:space="preserve">Tools: </w:t>
-            </w:r>
-            <w:r>
-              <w:rPr>
-                <w:color w:val="18201F"/>
-                <w:sz w:val="17"/>
-              </w:rPr>
-              <w:t>Git, GitHub, Postman, VS Code, Claude, Linux/Unix</w:t>
-            </w:r>
-          </w:p>
-          <w:p>
-            <w:pPr>
-              <w:spacing w:before="0" w:after="28" w:line="240" w:lineRule="auto"/>
-            </w:pPr>
-            <w:r>
-              <w:rPr>
-                <w:b/>
-                <w:color w:val="0A5C48"/>
-                <w:sz w:val="17"/>
-              </w:rPr>
-              <w:t xml:space="preserve">Soft Skills: </w:t>
-            </w:r>
-            <w:r>
-              <w:rPr>
-                <w:color w:val="18201F"/>
-                <w:sz w:val="17"/>
-              </w:rPr>
-              <w:t>Problem solving, quick learning, team collaboration, responsible AI tool usage</w:t>
-            </w:r>
-          </w:p>
-          <w:p>
-            <w:pPr>
-              <w:keepNext/>
-              <w:spacing w:before="140" w:after="40" w:line="240" w:lineRule="auto"/>
-              <w:pBdr>
-                <w:bottom w:val="single" w:sz="6" w:space="2" w:color="0A5C48"/>
-              </w:pBdr>
-            </w:pPr>
-            <w:r>
-              <w:rPr>
-                <w:rFonts w:ascii="Aptos Display" w:hAnsi="Aptos Display"/>
-                <w:b/>
-                <w:color w:val="0A5C48"/>
-                <w:sz w:val="20"/>
-              </w:rPr>
-              <w:t>EDUCATION</w:t>
-            </w:r>
-          </w:p>
-          <w:p>
-            <w:pPr>
-              <w:spacing w:before="0" w:after="24" w:line="247" w:lineRule="auto"/>
-            </w:pPr>
-            <w:r>
-              <w:rPr>
-                <w:b/>
-                <w:color w:val="18201F"/>
-                <w:sz w:val="18"/>
-              </w:rPr>
-              <w:t>B.E. Computer Science &amp; Engineering</w:t>
-            </w:r>
-            <w:r>
-              <w:rPr>
-                <w:color w:val="18201F"/>
-                <w:sz w:val="18"/>
-              </w:rPr>
-            </w:r>
-          </w:p>
-          <w:p>
-            <w:pPr>
-              <w:spacing w:before="0" w:after="30" w:line="247" w:lineRule="auto"/>
-            </w:pPr>
-            <w:r>
-              <w:rPr>
-                <w:color w:val="545B5A"/>
-                <w:sz w:val="17"/>
-              </w:rPr>
-              <w:t>PSNA College of Engineering and Technology</w:t>
-              <w:br/>
-              <w:t>CGPA: 7.0 / 10.0</w:t>
-            </w:r>
-          </w:p>
-          <w:p>
-            <w:pPr>
-              <w:keepNext/>
-              <w:spacing w:before="140" w:after="40" w:line="240" w:lineRule="auto"/>
-              <w:pBdr>
-                <w:bottom w:val="single" w:sz="6" w:space="2" w:color="0A5C48"/>
-              </w:pBdr>
-            </w:pPr>
-            <w:r>
-              <w:rPr>
-                <w:rFonts w:ascii="Aptos Display" w:hAnsi="Aptos Display"/>
-                <w:b/>
-                <w:color w:val="0A5C48"/>
-                <w:sz w:val="20"/>
-              </w:rPr>
-              <w:t>CERTIFICATIONS</w:t>
-            </w:r>
-          </w:p>
-          <w:p>
-            <w:pPr>
-              <w:spacing w:before="0" w:after="20" w:line="240" w:lineRule="auto"/>
-              <w:ind w:left="202" w:hanging="173"/>
-            </w:pPr>
-            <w:r>
-              <w:rPr>
-                <w:color w:val="0A5C48"/>
-                <w:sz w:val="17"/>
-              </w:rPr>
-              <w:t xml:space="preserve">• </w:t>
-            </w:r>
-            <w:r>
-              <w:rPr>
-                <w:color w:val="18201F"/>
-                <w:sz w:val="17"/>
-              </w:rPr>
-              <w:t>Cloud Security Fundamentals — Palo Alto Networks Cybersecurity Academy, Feb 2025.</w:t>
-            </w:r>
-          </w:p>
-          <w:p>
-            <w:pPr>
-              <w:spacing w:before="0" w:after="20" w:line="240" w:lineRule="auto"/>
-              <w:ind w:left="202" w:hanging="173"/>
-            </w:pPr>
-            <w:r>
-              <w:rPr>
-                <w:color w:val="0A5C48"/>
-                <w:sz w:val="17"/>
-              </w:rPr>
-              <w:t xml:space="preserve">• </w:t>
-            </w:r>
-            <w:r>
-              <w:rPr>
-                <w:color w:val="18201F"/>
-                <w:sz w:val="17"/>
-              </w:rPr>
-              <w:t>Introduction to IoT and Digital Transformation — Cisco Networking Academy, Apr 2025.</w:t>
-            </w:r>
-          </w:p>
-          <w:p>
-            <w:pPr>
-              <w:spacing w:before="0" w:after="20" w:line="240" w:lineRule="auto"/>
-              <w:ind w:left="202" w:hanging="173"/>
-            </w:pPr>
-            <w:r>
-              <w:rPr>
-                <w:color w:val="0A5C48"/>
-                <w:sz w:val="17"/>
-              </w:rPr>
-              <w:t xml:space="preserve">• </w:t>
-            </w:r>
-            <w:r>
-              <w:rPr>
-                <w:color w:val="18201F"/>
-                <w:sz w:val="17"/>
-              </w:rPr>
-              <w:t>Git Training — EduPyramids, SINE, IIT Bombay, Nov 2025; 1 credit, 76.67%.</w:t>
-            </w:r>
-          </w:p>
-          <w:p>
-            <w:pPr>
-              <w:spacing w:before="0" w:after="20" w:line="240" w:lineRule="auto"/>
-              <w:ind w:left="202" w:hanging="173"/>
-            </w:pPr>
-            <w:r>
-              <w:rPr>
-                <w:color w:val="0A5C48"/>
-                <w:sz w:val="17"/>
-              </w:rPr>
-              <w:t xml:space="preserve">• </w:t>
-            </w:r>
-            <w:r>
-              <w:rPr>
-                <w:color w:val="18201F"/>
-                <w:sz w:val="17"/>
-              </w:rPr>
-              <w:t>Database Programming with SQL — Oracle Academy, Jun 2024.</w:t>
-            </w:r>
-          </w:p>
-          <w:p>
-            <w:pPr>
-              <w:spacing w:before="0" w:after="20" w:line="240" w:lineRule="auto"/>
-              <w:ind w:left="202" w:hanging="173"/>
-            </w:pPr>
-            <w:r>
-              <w:rPr>
-                <w:color w:val="0A5C48"/>
-                <w:sz w:val="17"/>
-              </w:rPr>
-              <w:t xml:space="preserve">• </w:t>
-            </w:r>
-            <w:r>
-              <w:rPr>
-                <w:color w:val="18201F"/>
-                <w:sz w:val="17"/>
-              </w:rPr>
-              <w:t>Python Basic and Java Basic — Digilabs, May 2024.</w:t>
-            </w:r>
-          </w:p>
-          <w:p>
-            <w:pPr>
-              <w:spacing w:before="0" w:after="20" w:line="240" w:lineRule="auto"/>
-              <w:ind w:left="202" w:hanging="173"/>
-            </w:pPr>
-            <w:r>
-              <w:rPr>
-                <w:color w:val="0A5C48"/>
-                <w:sz w:val="17"/>
-              </w:rPr>
-              <w:t xml:space="preserve">• </w:t>
-            </w:r>
-            <w:r>
-              <w:rPr>
-                <w:color w:val="18201F"/>
-                <w:sz w:val="17"/>
-              </w:rPr>
-              <w:t>CyberFreaks: Live Demo Session on Real Life Cyber Threats, Jul 2023.</w:t>
-            </w:r>
-          </w:p>
-          <w:p>
-            <w:pPr>
-              <w:keepNext/>
-              <w:spacing w:before="140" w:after="40" w:line="240" w:lineRule="auto"/>
-              <w:pBdr>
-                <w:bottom w:val="single" w:sz="6" w:space="2" w:color="0A5C48"/>
-              </w:pBdr>
-            </w:pPr>
-            <w:r>
-              <w:rPr>
-                <w:rFonts w:ascii="Aptos Display" w:hAnsi="Aptos Display"/>
-                <w:b/>
-                <w:color w:val="0A5C48"/>
-                <w:sz w:val="20"/>
-              </w:rPr>
-              <w:t>PROGRAMMING PRACTICE</w:t>
-            </w:r>
-          </w:p>
-          <w:p>
-            <w:pPr>
-              <w:spacing w:before="0" w:after="0" w:line="247" w:lineRule="auto"/>
-            </w:pPr>
-            <w:r>
-              <w:rPr>
-                <w:color w:val="18201F"/>
-                <w:sz w:val="17"/>
-              </w:rPr>
-              <w:t>Skillrack: 116 programs solved, including 77 in C and 39 in Python3; 19 bronze badges.</w:t>
-            </w:r>
-          </w:p>
-        </w:tc>
-        <w:tc>
-          <w:tcPr>
-            <w:tcW w:type="dxa" w:w="7214"/>
-            <w:vAlign w:val="top"/>
-            <w:tcMar>
-              <w:top w:w="0" w:type="dxa"/>
-              <w:start w:w="60" w:type="dxa"/>
-              <w:bottom w:w="0" w:type="dxa"/>
-              <w:end w:w="60" w:type="dxa"/>
-            </w:tcMar>
-          </w:tcPr>
-          <w:p>
-            <w:pPr>
-              <w:keepNext/>
-              <w:spacing w:before="0" w:after="40" w:line="240" w:lineRule="auto"/>
-              <w:pBdr>
-                <w:bottom w:val="single" w:sz="6" w:space="2" w:color="0A5C48"/>
-              </w:pBdr>
-            </w:pPr>
-            <w:r>
-              <w:rPr>
-                <w:rFonts w:ascii="Aptos Display" w:hAnsi="Aptos Display"/>
-                <w:b/>
-                <w:color w:val="0A5C48"/>
-                <w:sz w:val="20"/>
-              </w:rPr>
-              <w:t>PROFESSIONAL SUMMARY</w:t>
-            </w:r>
-          </w:p>
-          <w:p>
-            <w:pPr>
-              <w:spacing w:before="0" w:after="30" w:line="247" w:lineRule="auto"/>
-            </w:pPr>
-            <w:r>
-              <w:rPr>
-                <w:color w:val="18201F"/>
-                <w:sz w:val="18"/>
-              </w:rPr>
-              <w:t>Software Development Intern with hands-on experience building React modules and REST API–driven workflows. Develops backend, full-stack, and AI-enabled applications using Python, JavaScript, FastAPI, Node.js, Express.js, SQL, and SQLite, with a security-conscious approach to authentication, data handling, and deployed web applications.</w:t>
-            </w:r>
-          </w:p>
-          <w:p>
-            <w:pPr>
-              <w:keepNext/>
-              <w:spacing w:before="140" w:after="40" w:line="240" w:lineRule="auto"/>
-              <w:pBdr>
-                <w:bottom w:val="single" w:sz="6" w:space="2" w:color="0A5C48"/>
-              </w:pBdr>
-            </w:pPr>
-            <w:r>
-              <w:rPr>
-                <w:rFonts w:ascii="Aptos Display" w:hAnsi="Aptos Display"/>
-                <w:b/>
-                <w:color w:val="0A5C48"/>
-                <w:sz w:val="20"/>
-              </w:rPr>
-              <w:t>EXPERIENCE</w:t>
-            </w:r>
-          </w:p>
-          <w:p>
-            <w:pPr>
-              <w:keepNext/>
-              <w:spacing w:before="60" w:after="10" w:line="240" w:lineRule="auto"/>
-            </w:pPr>
-            <w:r>
-              <w:rPr>
-                <w:b/>
-                <w:color w:val="18201F"/>
-                <w:sz w:val="21"/>
-              </w:rPr>
-              <w:t>Software Development Intern</w:t>
-            </w:r>
-            <w:r>
-              <w:rPr>
-                <w:color w:val="545B5A"/>
-                <w:sz w:val="17"/>
-              </w:rPr>
-              <w:t xml:space="preserve">  |  Kevell Corp  |  Present</w:t>
-            </w:r>
-          </w:p>
-          <w:p>
-            <w:pPr>
-              <w:spacing w:before="0" w:after="20" w:line="240" w:lineRule="auto"/>
-              <w:ind w:left="202" w:hanging="173"/>
-            </w:pPr>
-            <w:r>
-              <w:rPr>
-                <w:color w:val="0A5C48"/>
-                <w:sz w:val="18"/>
-              </w:rPr>
-              <w:t xml:space="preserve">• </w:t>
-            </w:r>
-            <w:r>
-              <w:rPr>
-                <w:color w:val="18201F"/>
-                <w:sz w:val="18"/>
-              </w:rPr>
-              <w:t>Develop React modules and integrate REST API workflows across authentication, vendor management, notifications, payments, and wallet functionality.</w:t>
-            </w:r>
-          </w:p>
-          <w:p>
-            <w:pPr>
-              <w:spacing w:before="0" w:after="20" w:line="240" w:lineRule="auto"/>
-              <w:ind w:left="202" w:hanging="173"/>
-            </w:pPr>
-            <w:r>
-              <w:rPr>
-                <w:color w:val="0A5C48"/>
-                <w:sz w:val="18"/>
-              </w:rPr>
-              <w:t xml:space="preserve">• </w:t>
-            </w:r>
-            <w:r>
-              <w:rPr>
-                <w:color w:val="18201F"/>
-                <w:sz w:val="18"/>
-              </w:rPr>
-              <w:t>Collaborate with backend developers to validate API-driven user journeys, debug full-stack workflows, and manage changes through Git-based team practices.</w:t>
-            </w:r>
-          </w:p>
-          <w:p>
-            <w:pPr>
-              <w:keepNext/>
-              <w:spacing w:before="60" w:after="10" w:line="240" w:lineRule="auto"/>
-            </w:pPr>
-            <w:r>
-              <w:rPr>
-                <w:b/>
-                <w:color w:val="18201F"/>
-                <w:sz w:val="21"/>
-              </w:rPr>
-              <w:t>Cybersecurity Intern</w:t>
-            </w:r>
-            <w:r>
-              <w:rPr>
-                <w:color w:val="545B5A"/>
-                <w:sz w:val="17"/>
-              </w:rPr>
-              <w:t xml:space="preserve">  |  NullClass  |  Jun 2025 – Jul 2025</w:t>
-            </w:r>
-          </w:p>
-          <w:p>
-            <w:pPr>
-              <w:spacing w:before="0" w:after="20" w:line="240" w:lineRule="auto"/>
-              <w:ind w:left="202" w:hanging="173"/>
-            </w:pPr>
-            <w:r>
-              <w:rPr>
-                <w:color w:val="0A5C48"/>
-                <w:sz w:val="18"/>
-              </w:rPr>
-              <w:t xml:space="preserve">• </w:t>
-            </w:r>
-            <w:r>
-              <w:rPr>
-                <w:color w:val="18201F"/>
-                <w:sz w:val="18"/>
-              </w:rPr>
-              <w:t>Completed controlled training in ethical-hacking fundamentals, SQL injection, cross-site scripting, cross-site request forgery, and vulnerability reporting concepts.</w:t>
-            </w:r>
-          </w:p>
-          <w:p>
-            <w:pPr>
-              <w:spacing w:before="0" w:after="20" w:line="240" w:lineRule="auto"/>
-              <w:ind w:left="202" w:hanging="173"/>
-            </w:pPr>
-            <w:r>
-              <w:rPr>
-                <w:color w:val="0A5C48"/>
-                <w:sz w:val="18"/>
-              </w:rPr>
-              <w:t xml:space="preserve">• </w:t>
-            </w:r>
-            <w:r>
-              <w:rPr>
-                <w:color w:val="18201F"/>
-                <w:sz w:val="18"/>
-              </w:rPr>
-              <w:t>Applied web-security concepts through structured lab practice and documented foundational observations for safer application development.</w:t>
-            </w:r>
-          </w:p>
-          <w:p>
-            <w:pPr>
-              <w:keepNext/>
-              <w:spacing w:before="140" w:after="40" w:line="240" w:lineRule="auto"/>
-              <w:pBdr>
-                <w:bottom w:val="single" w:sz="6" w:space="2" w:color="0A5C48"/>
-              </w:pBdr>
-            </w:pPr>
-            <w:r>
-              <w:rPr>
-                <w:rFonts w:ascii="Aptos Display" w:hAnsi="Aptos Display"/>
-                <w:b/>
-                <w:color w:val="0A5C48"/>
-                <w:sz w:val="20"/>
-              </w:rPr>
-              <w:t>SELECTED PROJECTS</w:t>
-            </w:r>
-          </w:p>
-          <w:p>
-            <w:pPr>
-              <w:keepNext/>
-              <w:spacing w:before="70" w:after="0" w:line="240" w:lineRule="auto"/>
-            </w:pPr>
-            <w:r>
-              <w:rPr>
-                <w:b/>
-                <w:color w:val="18201F"/>
-                <w:sz w:val="20"/>
-              </w:rPr>
-              <w:t>NEXORA</w:t>
-            </w:r>
-            <w:r>
-              <w:rPr>
-                <w:i/>
-                <w:color w:val="545B5A"/>
-                <w:sz w:val="17"/>
-              </w:rPr>
-              <w:t xml:space="preserve">  |  React, TypeScript, FastAPI, PostgreSQL</w:t>
-            </w:r>
-          </w:p>
-          <w:p>
-            <w:pPr>
-              <w:spacing w:before="0" w:after="10" w:line="240" w:lineRule="auto"/>
-            </w:pPr>
-            <w:r>
-              <w:rPr>
-                <w:color w:val="0A5C48"/>
-                <w:sz w:val="17"/>
-              </w:rPr>
-              <w:t>Live: nexora-sb16.onrender.com  ·  GitHub: github.com/bharathrajp14/nexora</w:t>
-            </w:r>
-          </w:p>
-          <w:p>
-            <w:pPr>
-              <w:spacing w:before="0" w:after="20" w:line="240" w:lineRule="auto"/>
-              <w:ind w:left="202" w:hanging="173"/>
-            </w:pPr>
-            <w:r>
-              <w:rPr>
-                <w:color w:val="0A5C48"/>
-                <w:sz w:val="17"/>
-              </w:rPr>
-              <w:t xml:space="preserve">• </w:t>
-            </w:r>
-            <w:r>
-              <w:rPr>
-                <w:color w:val="18201F"/>
-                <w:sz w:val="17"/>
-              </w:rPr>
-              <w:t>Built a multi-user React and FastAPI workspace for imports, auditability, and workflow building, with OTP/Google OAuth, JWT refresh-token rotation, rate controls, and audit logging.</w:t>
-            </w:r>
-          </w:p>
-          <w:p>
-            <w:pPr>
-              <w:keepNext/>
-              <w:spacing w:before="70" w:after="0" w:line="240" w:lineRule="auto"/>
-            </w:pPr>
-            <w:r>
-              <w:rPr>
-                <w:b/>
-                <w:color w:val="18201F"/>
-                <w:sz w:val="20"/>
-              </w:rPr>
-              <w:t>BR JARVIS</w:t>
-            </w:r>
-            <w:r>
-              <w:rPr>
-                <w:i/>
-                <w:color w:val="545B5A"/>
-                <w:sz w:val="17"/>
-              </w:rPr>
-              <w:t xml:space="preserve">  |  Python, FastAPI, SQLite, LLM Routing</w:t>
-            </w:r>
-          </w:p>
-          <w:p>
-            <w:pPr>
-              <w:spacing w:before="0" w:after="10" w:line="240" w:lineRule="auto"/>
-            </w:pPr>
-            <w:r>
-              <w:rPr>
-                <w:color w:val="0A5C48"/>
-                <w:sz w:val="17"/>
-              </w:rPr>
-              <w:t>GitHub: github.com/bharathrajp14/BrJarvis</w:t>
-            </w:r>
-          </w:p>
-          <w:p>
-            <w:pPr>
-              <w:spacing w:before="0" w:after="20" w:line="240" w:lineRule="auto"/>
-              <w:ind w:left="202" w:hanging="173"/>
-            </w:pPr>
-            <w:r>
-              <w:rPr>
-                <w:color w:val="0A5C48"/>
-                <w:sz w:val="17"/>
-              </w:rPr>
-              <w:t xml:space="preserve">• </w:t>
-            </w:r>
-            <w:r>
-              <w:rPr>
-                <w:color w:val="18201F"/>
-                <w:sz w:val="17"/>
-              </w:rPr>
-              <w:t>Engineered a local-first AI operating runtime with provider-neutral routing, capability filtering, tool authorization, persistent memory, and post-condition verification across CLI, web, voice, and automation interfaces.</w:t>
-            </w:r>
-          </w:p>
-          <w:p>
-            <w:pPr>
-              <w:keepNext/>
-              <w:spacing w:before="70" w:after="0" w:line="240" w:lineRule="auto"/>
-            </w:pPr>
-            <w:r>
-              <w:rPr>
-                <w:b/>
-                <w:color w:val="18201F"/>
-                <w:sz w:val="20"/>
-              </w:rPr>
-              <w:t>XSECQRE Password Manager</w:t>
-            </w:r>
-            <w:r>
-              <w:rPr>
-                <w:i/>
-                <w:color w:val="545B5A"/>
-                <w:sz w:val="17"/>
-              </w:rPr>
-              <w:t xml:space="preserve">  |  Python, Flask, SQLite</w:t>
-            </w:r>
-          </w:p>
-          <w:p>
-            <w:pPr>
-              <w:spacing w:before="0" w:after="10" w:line="240" w:lineRule="auto"/>
-            </w:pPr>
-            <w:r>
-              <w:rPr>
-                <w:color w:val="0A5C48"/>
-                <w:sz w:val="17"/>
-              </w:rPr>
-              <w:t>Live: xsecqre.onrender.com  ·  GitHub: github.com/bharathrajp14/XSECQRE-Password-Manager-Web-App</w:t>
-            </w:r>
-          </w:p>
-          <w:p>
-            <w:pPr>
-              <w:spacing w:before="0" w:after="20" w:line="240" w:lineRule="auto"/>
-              <w:ind w:left="202" w:hanging="173"/>
-            </w:pPr>
-            <w:r>
-              <w:rPr>
-                <w:color w:val="0A5C48"/>
-                <w:sz w:val="17"/>
-              </w:rPr>
-              <w:t xml:space="preserve">• </w:t>
-            </w:r>
-            <w:r>
-              <w:rPr>
-                <w:color w:val="18201F"/>
-                <w:sz w:val="17"/>
-              </w:rPr>
-              <w:t>Developed a deployed password manager with authentication, validated private credential CRUD, PBKDF2-SHA256 password hashing, and user-bound routing.</w:t>
-            </w:r>
-          </w:p>
-          <w:p>
-            <w:pPr>
-              <w:keepNext/>
-              <w:spacing w:before="70" w:after="0" w:line="240" w:lineRule="auto"/>
-            </w:pPr>
-            <w:r>
-              <w:rPr>
-                <w:b/>
-                <w:color w:val="18201F"/>
-                <w:sz w:val="20"/>
-              </w:rPr>
-              <w:t>Flask URL Shortener</w:t>
-            </w:r>
-            <w:r>
-              <w:rPr>
-                <w:i/>
-                <w:color w:val="545B5A"/>
-                <w:sz w:val="17"/>
-              </w:rPr>
-              <w:t xml:space="preserve">  |  Python, Flask, SQLAlchemy, SQLite</w:t>
-            </w:r>
-          </w:p>
-          <w:p>
-            <w:pPr>
-              <w:spacing w:before="0" w:after="10" w:line="240" w:lineRule="auto"/>
-            </w:pPr>
-            <w:r>
-              <w:rPr>
-                <w:color w:val="0A5C48"/>
-                <w:sz w:val="17"/>
-              </w:rPr>
-              <w:t>Live: flask-url-shortener-1-aof3.onrender.com  ·  GitHub: github.com/bharathrajp14/flask-url-shortener</w:t>
-            </w:r>
-          </w:p>
-          <w:p>
-            <w:pPr>
-              <w:spacing w:before="0" w:after="20" w:line="240" w:lineRule="auto"/>
-              <w:ind w:left="202" w:hanging="173"/>
-            </w:pPr>
-            <w:r>
-              <w:rPr>
-                <w:color w:val="0A5C48"/>
-                <w:sz w:val="17"/>
-              </w:rPr>
-              <w:t xml:space="preserve">• </w:t>
-            </w:r>
-            <w:r>
-              <w:rPr>
-                <w:color w:val="18201F"/>
-                <w:sz w:val="17"/>
-              </w:rPr>
-              <w:t>Built a deployed utility that creates and persists unique short-URL mappings with SQLite-backed storage, API-style retrieval, and environment-aware configuration.</w:t>
-            </w:r>
-          </w:p>
-        </w:tc>
-      </w:tr>
-    </w:tbl>
+    <w:p>
+      <w:pPr>
+        <w:keepNext/>
+        <w:spacing w:before="0" w:after="40" w:line="240" w:lineRule="auto"/>
+        <w:pBdr>
+          <w:bottom w:val="single" w:sz="6" w:space="2" w:color="125846"/>
+        </w:pBdr>
+      </w:pPr>
+      <w:r>
+        <w:rPr>
+          <w:rFonts w:ascii="Aptos Display" w:hAnsi="Aptos Display"/>
+          <w:b/>
+          <w:color w:val="125846"/>
+          <w:sz w:val="20"/>
+        </w:rPr>
+        <w:t>PROFESSIONAL SUMMARY</w:t>
+      </w:r>
+    </w:p>
+    <w:p>
+      <w:pPr>
+        <w:spacing w:before="0" w:after="28" w:line="247" w:lineRule="auto"/>
+      </w:pPr>
+      <w:r>
+        <w:rPr>
+          <w:color w:val="181D1C"/>
+          <w:sz w:val="18"/>
+        </w:rPr>
+        <w:t>Software Development Intern with hands-on experience building React modules and REST API–driven workflows. Develops backend, full-stack, and AI-enabled applications using Python, JavaScript, FastAPI, Node.js, Express.js, SQL, and SQLite, with a security-conscious approach to authentication, data handling, automation, and deployed web applications.</w:t>
+      </w:r>
+    </w:p>
+    <w:p>
+      <w:pPr>
+        <w:keepNext/>
+        <w:spacing w:before="80" w:after="40" w:line="240" w:lineRule="auto"/>
+        <w:pBdr>
+          <w:bottom w:val="single" w:sz="6" w:space="2" w:color="125846"/>
+        </w:pBdr>
+      </w:pPr>
+      <w:r>
+        <w:rPr>
+          <w:rFonts w:ascii="Aptos Display" w:hAnsi="Aptos Display"/>
+          <w:b/>
+          <w:color w:val="125846"/>
+          <w:sz w:val="20"/>
+        </w:rPr>
+        <w:t>TECHNICAL SKILLS</w:t>
+      </w:r>
+    </w:p>
+    <w:p>
+      <w:pPr>
+        <w:spacing w:before="0" w:after="16" w:line="247" w:lineRule="auto"/>
+      </w:pPr>
+      <w:r>
+        <w:rPr>
+          <w:color w:val="181D1C"/>
+          <w:sz w:val="18"/>
+        </w:rPr>
+        <w:t>Languages: Python, JavaScript, C, Java, SQL | Frontend: React, HTML5, CSS3 | Backend: REST APIs, Express.js, Node.js</w:t>
+      </w:r>
+    </w:p>
+    <w:p>
+      <w:pPr>
+        <w:spacing w:before="0" w:after="20" w:line="247" w:lineRule="auto"/>
+      </w:pPr>
+      <w:r>
+        <w:rPr>
+          <w:color w:val="181D1C"/>
+          <w:sz w:val="18"/>
+        </w:rPr>
+        <w:t>Database: MongoDB, DBMS | Tools &amp; Platforms: Git, GitHub, Postman, VS Code, Claude, Linux/Unix | Soft Skills: Problem Solving, Quick Learner, Team Collaboration, Responsible AI Tool Usage</w:t>
+      </w:r>
+    </w:p>
+    <w:p>
+      <w:pPr>
+        <w:keepNext/>
+        <w:spacing w:before="80" w:after="40" w:line="240" w:lineRule="auto"/>
+        <w:pBdr>
+          <w:bottom w:val="single" w:sz="6" w:space="2" w:color="125846"/>
+        </w:pBdr>
+      </w:pPr>
+      <w:r>
+        <w:rPr>
+          <w:rFonts w:ascii="Aptos Display" w:hAnsi="Aptos Display"/>
+          <w:b/>
+          <w:color w:val="125846"/>
+          <w:sz w:val="20"/>
+        </w:rPr>
+        <w:t>PROFESSIONAL EXPERIENCE</w:t>
+      </w:r>
+    </w:p>
+    <w:p>
+      <w:pPr>
+        <w:keepNext/>
+        <w:spacing w:before="60" w:after="10" w:line="240" w:lineRule="auto"/>
+      </w:pPr>
+      <w:r>
+        <w:rPr>
+          <w:b/>
+          <w:color w:val="181D1C"/>
+          <w:sz w:val="21"/>
+        </w:rPr>
+        <w:t>Software Development Intern</w:t>
+      </w:r>
+      <w:r>
+        <w:rPr>
+          <w:color w:val="505554"/>
+          <w:sz w:val="18"/>
+        </w:rPr>
+        <w:t xml:space="preserve">  |  Kevell Corp  |  Present</w:t>
+      </w:r>
+    </w:p>
+    <w:p>
+      <w:pPr>
+        <w:spacing w:before="0" w:after="18" w:line="240" w:lineRule="auto"/>
+        <w:ind w:left="245" w:hanging="187"/>
+      </w:pPr>
+      <w:r>
+        <w:rPr>
+          <w:color w:val="125846"/>
+          <w:sz w:val="18"/>
+        </w:rPr>
+        <w:t xml:space="preserve">• </w:t>
+      </w:r>
+      <w:r>
+        <w:rPr>
+          <w:color w:val="181D1C"/>
+          <w:sz w:val="18"/>
+        </w:rPr>
+        <w:t>Develop React modules and integrate REST API workflows across authentication, vendor management, notifications, payments, and wallet functionality.</w:t>
+      </w:r>
+    </w:p>
+    <w:p>
+      <w:pPr>
+        <w:spacing w:before="0" w:after="18" w:line="240" w:lineRule="auto"/>
+        <w:ind w:left="245" w:hanging="187"/>
+      </w:pPr>
+      <w:r>
+        <w:rPr>
+          <w:color w:val="125846"/>
+          <w:sz w:val="18"/>
+        </w:rPr>
+        <w:t xml:space="preserve">• </w:t>
+      </w:r>
+      <w:r>
+        <w:rPr>
+          <w:color w:val="181D1C"/>
+          <w:sz w:val="18"/>
+        </w:rPr>
+        <w:t>Collaborate with backend developers to validate API-driven user journeys, debug full-stack workflows, and manage changes through Git-based team practices.</w:t>
+      </w:r>
+    </w:p>
+    <w:p>
+      <w:pPr>
+        <w:spacing w:before="0" w:after="18" w:line="240" w:lineRule="auto"/>
+        <w:ind w:left="245" w:hanging="187"/>
+      </w:pPr>
+      <w:r>
+        <w:rPr>
+          <w:color w:val="125846"/>
+          <w:sz w:val="18"/>
+        </w:rPr>
+        <w:t xml:space="preserve">• </w:t>
+      </w:r>
+      <w:r>
+        <w:rPr>
+          <w:color w:val="181D1C"/>
+          <w:sz w:val="18"/>
+        </w:rPr>
+        <w:t>Support feature delivery across connected frontend and backend modules with attention to reliable user-facing behavior and maintainable integration patterns.</w:t>
+      </w:r>
+    </w:p>
+    <w:p>
+      <w:pPr>
+        <w:keepNext/>
+        <w:spacing w:before="60" w:after="10" w:line="240" w:lineRule="auto"/>
+      </w:pPr>
+      <w:r>
+        <w:rPr>
+          <w:b/>
+          <w:color w:val="181D1C"/>
+          <w:sz w:val="21"/>
+        </w:rPr>
+        <w:t>Cybersecurity Intern</w:t>
+      </w:r>
+      <w:r>
+        <w:rPr>
+          <w:color w:val="505554"/>
+          <w:sz w:val="18"/>
+        </w:rPr>
+        <w:t xml:space="preserve">  |  NullClass  |  Jun 2025 – Jul 2025</w:t>
+      </w:r>
+    </w:p>
+    <w:p>
+      <w:pPr>
+        <w:spacing w:before="0" w:after="18" w:line="240" w:lineRule="auto"/>
+        <w:ind w:left="245" w:hanging="187"/>
+      </w:pPr>
+      <w:r>
+        <w:rPr>
+          <w:color w:val="125846"/>
+          <w:sz w:val="18"/>
+        </w:rPr>
+        <w:t xml:space="preserve">• </w:t>
+      </w:r>
+      <w:r>
+        <w:rPr>
+          <w:color w:val="181D1C"/>
+          <w:sz w:val="18"/>
+        </w:rPr>
+        <w:t>Completed controlled training in ethical-hacking fundamentals, SQL injection, cross-site scripting, cross-site request forgery, and vulnerability reporting concepts.</w:t>
+      </w:r>
+    </w:p>
+    <w:p>
+      <w:pPr>
+        <w:spacing w:before="0" w:after="18" w:line="240" w:lineRule="auto"/>
+        <w:ind w:left="245" w:hanging="187"/>
+      </w:pPr>
+      <w:r>
+        <w:rPr>
+          <w:color w:val="125846"/>
+          <w:sz w:val="18"/>
+        </w:rPr>
+        <w:t xml:space="preserve">• </w:t>
+      </w:r>
+      <w:r>
+        <w:rPr>
+          <w:color w:val="181D1C"/>
+          <w:sz w:val="18"/>
+        </w:rPr>
+        <w:t>Applied web-security concepts through structured lab practice and documented foundational observations for safer application development.</w:t>
+      </w:r>
+    </w:p>
+    <w:p>
+      <w:pPr>
+        <w:keepNext/>
+        <w:spacing w:before="80" w:after="40" w:line="240" w:lineRule="auto"/>
+        <w:pBdr>
+          <w:bottom w:val="single" w:sz="6" w:space="2" w:color="125846"/>
+        </w:pBdr>
+      </w:pPr>
+      <w:r>
+        <w:rPr>
+          <w:rFonts w:ascii="Aptos Display" w:hAnsi="Aptos Display"/>
+          <w:b/>
+          <w:color w:val="125846"/>
+          <w:sz w:val="20"/>
+        </w:rPr>
+        <w:t>SELECTED PROJECTS</w:t>
+      </w:r>
+    </w:p>
+    <w:p>
+      <w:pPr>
+        <w:keepNext/>
+        <w:spacing w:before="64" w:after="0" w:line="240" w:lineRule="auto"/>
+      </w:pPr>
+      <w:r>
+        <w:rPr>
+          <w:b/>
+          <w:color w:val="181D1C"/>
+          <w:sz w:val="20"/>
+        </w:rPr>
+        <w:t>NEXORA</w:t>
+      </w:r>
+      <w:r>
+        <w:rPr>
+          <w:i/>
+          <w:color w:val="505554"/>
+          <w:sz w:val="17"/>
+        </w:rPr>
+        <w:t xml:space="preserve">  |  React, TypeScript, FastAPI, PostgreSQL, SQLAlchemy</w:t>
+      </w:r>
+    </w:p>
+    <w:p>
+      <w:pPr>
+        <w:spacing w:before="0" w:after="8" w:line="240" w:lineRule="auto"/>
+      </w:pPr>
+      <w:r>
+        <w:rPr>
+          <w:color w:val="125846"/>
+          <w:sz w:val="17"/>
+        </w:rPr>
+        <w:t>Live: nexora-sb16.onrender.com | GitHub: github.com/bharathrajp14/nexora</w:t>
+      </w:r>
+    </w:p>
+    <w:p>
+      <w:pPr>
+        <w:spacing w:before="0" w:after="18" w:line="240" w:lineRule="auto"/>
+        <w:ind w:left="245" w:hanging="187"/>
+      </w:pPr>
+      <w:r>
+        <w:rPr>
+          <w:color w:val="125846"/>
+          <w:sz w:val="18"/>
+        </w:rPr>
+        <w:t xml:space="preserve">• </w:t>
+      </w:r>
+      <w:r>
+        <w:rPr>
+          <w:color w:val="181D1C"/>
+          <w:sz w:val="18"/>
+        </w:rPr>
+        <w:t>Built a multi-user workspace for collections, file imports, auditability, and workflow building with a React interface and asynchronous FastAPI backend.</w:t>
+      </w:r>
+    </w:p>
+    <w:p>
+      <w:pPr>
+        <w:spacing w:before="0" w:after="18" w:line="240" w:lineRule="auto"/>
+        <w:ind w:left="245" w:hanging="187"/>
+      </w:pPr>
+      <w:r>
+        <w:rPr>
+          <w:color w:val="125846"/>
+          <w:sz w:val="18"/>
+        </w:rPr>
+        <w:t xml:space="preserve">• </w:t>
+      </w:r>
+      <w:r>
+        <w:rPr>
+          <w:color w:val="181D1C"/>
+          <w:sz w:val="18"/>
+        </w:rPr>
+        <w:t>Implemented OTP and Google OAuth flows, JWT refresh-token rotation, rate controls, and audit logging to support secure data operations.</w:t>
+      </w:r>
+    </w:p>
+    <w:p>
+      <w:pPr>
+        <w:keepNext/>
+        <w:spacing w:before="64" w:after="0" w:line="240" w:lineRule="auto"/>
+      </w:pPr>
+      <w:r>
+        <w:rPr>
+          <w:b/>
+          <w:color w:val="181D1C"/>
+          <w:sz w:val="20"/>
+        </w:rPr>
+        <w:t>BR JARVIS</w:t>
+      </w:r>
+      <w:r>
+        <w:rPr>
+          <w:i/>
+          <w:color w:val="505554"/>
+          <w:sz w:val="17"/>
+        </w:rPr>
+        <w:t xml:space="preserve">  |  Python, FastAPI, SQLite, LLM Routing</w:t>
+      </w:r>
+    </w:p>
+    <w:p>
+      <w:pPr>
+        <w:spacing w:before="0" w:after="8" w:line="240" w:lineRule="auto"/>
+      </w:pPr>
+      <w:r>
+        <w:rPr>
+          <w:color w:val="125846"/>
+          <w:sz w:val="17"/>
+        </w:rPr>
+        <w:t>GitHub: github.com/bharathrajp14/BrJarvis</w:t>
+      </w:r>
+    </w:p>
+    <w:p>
+      <w:pPr>
+        <w:spacing w:before="0" w:after="18" w:line="240" w:lineRule="auto"/>
+        <w:ind w:left="245" w:hanging="187"/>
+      </w:pPr>
+      <w:r>
+        <w:rPr>
+          <w:color w:val="125846"/>
+          <w:sz w:val="18"/>
+        </w:rPr>
+        <w:t xml:space="preserve">• </w:t>
+      </w:r>
+      <w:r>
+        <w:rPr>
+          <w:color w:val="181D1C"/>
+          <w:sz w:val="18"/>
+        </w:rPr>
+        <w:t>Engineered a local-first AI runtime with provider-neutral routing, capability filtering, tool authorization, persistent memory, and post-condition verification across CLI, web, voice, and automation interfaces for inspectable, bounded automation.</w:t>
+      </w:r>
+    </w:p>
+    <w:p>
+      <w:pPr>
+        <w:keepNext/>
+        <w:spacing w:before="64" w:after="0" w:line="240" w:lineRule="auto"/>
+      </w:pPr>
+      <w:r>
+        <w:rPr>
+          <w:b/>
+          <w:color w:val="181D1C"/>
+          <w:sz w:val="20"/>
+        </w:rPr>
+        <w:t>XSECQRE Password Manager</w:t>
+      </w:r>
+      <w:r>
+        <w:rPr>
+          <w:i/>
+          <w:color w:val="505554"/>
+          <w:sz w:val="17"/>
+        </w:rPr>
+        <w:t xml:space="preserve">  |  Python, Flask, SQLite</w:t>
+      </w:r>
+    </w:p>
+    <w:p>
+      <w:pPr>
+        <w:spacing w:before="0" w:after="8" w:line="240" w:lineRule="auto"/>
+      </w:pPr>
+      <w:r>
+        <w:rPr>
+          <w:color w:val="125846"/>
+          <w:sz w:val="17"/>
+        </w:rPr>
+        <w:t>Live: xsecqre.onrender.com | GitHub: github.com/bharathrajp14/XSECQRE-Password-Manager-Web-App</w:t>
+      </w:r>
+    </w:p>
+    <w:p>
+      <w:pPr>
+        <w:spacing w:before="0" w:after="18" w:line="240" w:lineRule="auto"/>
+        <w:ind w:left="245" w:hanging="187"/>
+      </w:pPr>
+      <w:r>
+        <w:rPr>
+          <w:color w:val="125846"/>
+          <w:sz w:val="18"/>
+        </w:rPr>
+        <w:t xml:space="preserve">• </w:t>
+      </w:r>
+      <w:r>
+        <w:rPr>
+          <w:color w:val="181D1C"/>
+          <w:sz w:val="18"/>
+        </w:rPr>
+        <w:t>Developed a deployed password manager with authentication, validated private credential CRUD, PBKDF2-SHA256 password hashing, and user-bound routing.</w:t>
+      </w:r>
+    </w:p>
+    <w:p>
+      <w:pPr>
+        <w:keepNext/>
+        <w:spacing w:before="64" w:after="0" w:line="240" w:lineRule="auto"/>
+      </w:pPr>
+      <w:r>
+        <w:rPr>
+          <w:b/>
+          <w:color w:val="181D1C"/>
+          <w:sz w:val="20"/>
+        </w:rPr>
+        <w:t>Flask URL Shortener</w:t>
+      </w:r>
+      <w:r>
+        <w:rPr>
+          <w:i/>
+          <w:color w:val="505554"/>
+          <w:sz w:val="17"/>
+        </w:rPr>
+        <w:t xml:space="preserve">  |  Python, Flask, SQLAlchemy, SQLite</w:t>
+      </w:r>
+    </w:p>
+    <w:p>
+      <w:pPr>
+        <w:spacing w:before="0" w:after="8" w:line="240" w:lineRule="auto"/>
+      </w:pPr>
+      <w:r>
+        <w:rPr>
+          <w:color w:val="125846"/>
+          <w:sz w:val="17"/>
+        </w:rPr>
+        <w:t>Live: flask-url-shortener-1-aof3.onrender.com | GitHub: github.com/bharathrajp14/flask-url-shortener</w:t>
+      </w:r>
+    </w:p>
+    <w:p>
+      <w:pPr>
+        <w:spacing w:before="0" w:after="18" w:line="240" w:lineRule="auto"/>
+        <w:ind w:left="245" w:hanging="187"/>
+      </w:pPr>
+      <w:r>
+        <w:rPr>
+          <w:color w:val="125846"/>
+          <w:sz w:val="18"/>
+        </w:rPr>
+        <w:t xml:space="preserve">• </w:t>
+      </w:r>
+      <w:r>
+        <w:rPr>
+          <w:color w:val="181D1C"/>
+          <w:sz w:val="18"/>
+        </w:rPr>
+        <w:t>Built a deployed URL shortener that creates and persists unique short-URL mappings with SQLite-backed storage, retrieval workflows, and environment-aware configuration.</w:t>
+      </w:r>
+    </w:p>
+    <w:p>
+      <w:pPr>
+        <w:keepNext/>
+        <w:spacing w:before="80" w:after="40" w:line="240" w:lineRule="auto"/>
+        <w:pBdr>
+          <w:bottom w:val="single" w:sz="6" w:space="2" w:color="125846"/>
+        </w:pBdr>
+      </w:pPr>
+      <w:r>
+        <w:rPr>
+          <w:rFonts w:ascii="Aptos Display" w:hAnsi="Aptos Display"/>
+          <w:b/>
+          <w:color w:val="125846"/>
+          <w:sz w:val="20"/>
+        </w:rPr>
+        <w:t>EDUCATION</w:t>
+      </w:r>
+    </w:p>
+    <w:p>
+      <w:pPr>
+        <w:spacing w:before="0" w:after="24" w:line="247" w:lineRule="auto"/>
+      </w:pPr>
+      <w:r>
+        <w:rPr>
+          <w:b/>
+          <w:color w:val="181D1C"/>
+          <w:sz w:val="18"/>
+        </w:rPr>
+        <w:t>B.E. Computer Science &amp; Engineering</w:t>
+      </w:r>
+      <w:r>
+        <w:rPr>
+          <w:color w:val="181D1C"/>
+          <w:sz w:val="18"/>
+        </w:rPr>
+        <w:t xml:space="preserve"> | PSNA College of Engineering and Technology | CGPA: 7.0 / 10.0</w:t>
+      </w:r>
+    </w:p>
+    <w:p>
+      <w:pPr>
+        <w:keepNext/>
+        <w:spacing w:before="80" w:after="40" w:line="240" w:lineRule="auto"/>
+        <w:pBdr>
+          <w:bottom w:val="single" w:sz="6" w:space="2" w:color="125846"/>
+        </w:pBdr>
+      </w:pPr>
+      <w:r>
+        <w:rPr>
+          <w:rFonts w:ascii="Aptos Display" w:hAnsi="Aptos Display"/>
+          <w:b/>
+          <w:color w:val="125846"/>
+          <w:sz w:val="20"/>
+        </w:rPr>
+        <w:t>CERTIFICATIONS AND PROGRAMMING PRACTICE</w:t>
+      </w:r>
+    </w:p>
+    <w:p>
+      <w:pPr>
+        <w:spacing w:before="0" w:after="14" w:line="240" w:lineRule="auto"/>
+      </w:pPr>
+      <w:r>
+        <w:rPr>
+          <w:color w:val="181D1C"/>
+          <w:sz w:val="17"/>
+        </w:rPr>
+        <w:t>Cloud Security Fundamentals — Palo Alto Networks Cybersecurity Academy (2025) | Introduction to IoT and Digital Transformation — Cisco Networking Academy (2025) | Git Training — EduPyramids, SINE, IIT Bombay (2025; 1 credit, 76.67%) | Database Programming with SQL — Oracle Academy (2024) | Python Basic and Java Basic — Digilabs (2024).</w:t>
+      </w:r>
+    </w:p>
+    <w:p>
+      <w:pPr>
+        <w:spacing w:before="0" w:after="0" w:line="240" w:lineRule="auto"/>
+      </w:pPr>
+      <w:r>
+        <w:rPr>
+          <w:color w:val="181D1C"/>
+          <w:sz w:val="17"/>
+        </w:rPr>
+        <w:t>Skillrack: 116 programs solved, including 77 in C and 39 in Python3, with 19 bronze badges. CyberFreaks: Live Demo Session on Real Life Cyber Threats (2023).</w:t>
+      </w:r>
+    </w:p>
     <w:sectPr>
       <w:pgSz w:w="11909" w:h="16834"/>
-      <w:pgMar w:top="619" w:right="662" w:bottom="619" w:left="662" w:header="720" w:footer="720" w:gutter="0"/>
+      <w:pgMar w:top="518" w:right="749" w:bottom="518" w:left="749" w:header="720" w:footer="720" w:gutter="0"/>
       <w:cols w:space="720"/>
       <w:docGrid w:linePitch="360"/>
     </w:sectPr>
@@ -1238,7 +998,7 @@
     <w:rsid w:val="00FC693F"/>
     <w:rPr>
       <w:rFonts w:ascii="Aptos" w:hAnsi="Aptos"/>
-      <w:sz w:val="18"/>
+      <w:sz w:val="19"/>
     </w:rPr>
   </w:style>
   <w:style w:type="paragraph" w:styleId="Header">

</xml_diff>

<commit_message>
docs: revise resume certifications and portfolio domain
</commit_message>
<xml_diff>
--- a/client/public/portfolio-assets/Bharath_Raj_P_Resume.docx
+++ b/client/public/portfolio-assets/Bharath_Raj_P_Resume.docx
@@ -54,7 +54,7 @@
           <w:color w:val="125846"/>
           <w:sz w:val="16"/>
         </w:rPr>
-        <w:t>linkedin.com/in/bharathrajp14 | github.com/bharathrajp14 | portfolio-ten-teal-25.vercel.app | Skillrack</w:t>
+        <w:t>linkedin.com/in/bharathrajp14 | github.com/bharathrajp14 | www.bharathrajdev.me | Skillrack</w:t>
       </w:r>
     </w:p>
     <w:p>
@@ -608,7 +608,7 @@
           <w:color w:val="181D1C"/>
           <w:sz w:val="17"/>
         </w:rPr>
-        <w:t>Cloud Security Fundamentals — Palo Alto Networks Cybersecurity Academy (2025) | Introduction to IoT and Digital Transformation — Cisco Networking Academy (2025) | Git Training — EduPyramids, SINE, IIT Bombay (2025; 1 credit, 76.67%) | Database Programming with SQL — Oracle Academy (2024) | Python Basic and Java Basic — Digilabs (2024).</w:t>
+        <w:t>Cloud Security Fundamentals — Palo Alto Networks Cybersecurity Academy (2025) | Introduction to IoT and Digital Transformation — Cisco Networking Academy (2025) | Git Training — EduPyramids, SINE, IIT Bombay (2025) | Database Programming with SQL — Oracle Academy (2024) | Python Basic and Java Basic — Digilabs (2024).</w:t>
       </w:r>
     </w:p>
     <w:p>
@@ -620,7 +620,7 @@
           <w:color w:val="181D1C"/>
           <w:sz w:val="17"/>
         </w:rPr>
-        <w:t>Skillrack: 116 programs solved, including 77 in C and 39 in Python3, with 19 bronze badges. CyberFreaks: Live Demo Session on Real Life Cyber Threats (2023).</w:t>
+        <w:t>Skillrack: 116 programs solved, including 77 in C and 39 in Python3, with 19 bronze badges.</w:t>
       </w:r>
     </w:p>
     <w:sectPr>

</xml_diff>

<commit_message>
docs: expand education in ATS resume
</commit_message>
<xml_diff>
--- a/client/public/portfolio-assets/Bharath_Raj_P_Resume.docx
+++ b/client/public/portfolio-assets/Bharath_Raj_P_Resume.docx
@@ -46,7 +46,7 @@
     </w:p>
     <w:p>
       <w:pPr>
-        <w:spacing w:before="0" w:after="60" w:line="240" w:lineRule="auto"/>
+        <w:spacing w:before="0" w:after="30" w:line="240" w:lineRule="auto"/>
         <w:jc w:val="center"/>
       </w:pPr>
       <w:r>
@@ -90,7 +90,7 @@
     <w:p>
       <w:pPr>
         <w:keepNext/>
-        <w:spacing w:before="80" w:after="40" w:line="240" w:lineRule="auto"/>
+        <w:spacing w:before="60" w:after="40" w:line="240" w:lineRule="auto"/>
         <w:pBdr>
           <w:bottom w:val="single" w:sz="6" w:space="2" w:color="125846"/>
         </w:pBdr>
@@ -132,7 +132,7 @@
     <w:p>
       <w:pPr>
         <w:keepNext/>
-        <w:spacing w:before="80" w:after="40" w:line="240" w:lineRule="auto"/>
+        <w:spacing w:before="60" w:after="40" w:line="240" w:lineRule="auto"/>
         <w:pBdr>
           <w:bottom w:val="single" w:sz="6" w:space="2" w:color="125846"/>
         </w:pBdr>
@@ -292,7 +292,7 @@
     <w:p>
       <w:pPr>
         <w:keepNext/>
-        <w:spacing w:before="80" w:after="40" w:line="240" w:lineRule="auto"/>
+        <w:spacing w:before="60" w:after="40" w:line="240" w:lineRule="auto"/>
         <w:pBdr>
           <w:bottom w:val="single" w:sz="6" w:space="2" w:color="125846"/>
         </w:pBdr>
@@ -546,7 +546,7 @@
     <w:p>
       <w:pPr>
         <w:keepNext/>
-        <w:spacing w:before="80" w:after="40" w:line="240" w:lineRule="auto"/>
+        <w:spacing w:before="60" w:after="40" w:line="240" w:lineRule="auto"/>
         <w:pBdr>
           <w:bottom w:val="single" w:sz="6" w:space="2" w:color="125846"/>
         </w:pBdr>
@@ -563,7 +563,7 @@
     </w:p>
     <w:p>
       <w:pPr>
-        <w:spacing w:before="0" w:after="24" w:line="247" w:lineRule="auto"/>
+        <w:spacing w:before="0" w:after="6" w:line="247" w:lineRule="auto"/>
       </w:pPr>
       <w:r>
         <w:rPr>
@@ -578,13 +578,37 @@
           <w:color w:val="181D1C"/>
           <w:sz w:val="18"/>
         </w:rPr>
-        <w:t xml:space="preserve"> | PSNA College of Engineering and Technology | CGPA: 7.0 / 10.0</w:t>
+        <w:t xml:space="preserve"> | Expected May 2026 | CGPA: 7.0 / 10.0 | PSNA College of Engineering and Technology</w:t>
+      </w:r>
+    </w:p>
+    <w:p>
+      <w:pPr>
+        <w:spacing w:before="0" w:after="6" w:line="247" w:lineRule="auto"/>
+      </w:pPr>
+      <w:r>
+        <w:rPr>
+          <w:color w:val="181D1C"/>
+          <w:sz w:val="18"/>
+        </w:rPr>
+        <w:t>HSC (Class XII) | 60% | R.C. Matric Hr. Sec. School, Natham</w:t>
+      </w:r>
+    </w:p>
+    <w:p>
+      <w:pPr>
+        <w:spacing w:before="0" w:after="8" w:line="247" w:lineRule="auto"/>
+      </w:pPr>
+      <w:r>
+        <w:rPr>
+          <w:color w:val="181D1C"/>
+          <w:sz w:val="18"/>
+        </w:rPr>
+        <w:t>SSLC (Class X) | 64% | R.C. Matric Hr. Sec. School, Natham</w:t>
       </w:r>
     </w:p>
     <w:p>
       <w:pPr>
         <w:keepNext/>
-        <w:spacing w:before="80" w:after="40" w:line="240" w:lineRule="auto"/>
+        <w:spacing w:before="60" w:after="40" w:line="240" w:lineRule="auto"/>
         <w:pBdr>
           <w:bottom w:val="single" w:sz="6" w:space="2" w:color="125846"/>
         </w:pBdr>
@@ -613,19 +637,19 @@
     </w:p>
     <w:p>
       <w:pPr>
-        <w:spacing w:before="0" w:after="0" w:line="240" w:lineRule="auto"/>
+        <w:spacing w:before="0" w:after="0" w:line="235" w:lineRule="auto"/>
       </w:pPr>
       <w:r>
         <w:rPr>
           <w:color w:val="181D1C"/>
           <w:sz w:val="17"/>
         </w:rPr>
-        <w:t>Skillrack: 116 programs solved, including 77 in C and 39 in Python3, with 19 bronze badges.</w:t>
+        <w:t>Skillrack programming practice profile | Certificate folder: drive.google.com/drive/folders/1inKzukOlo8xewOLeHHCarF2VwW01aRCH</w:t>
       </w:r>
     </w:p>
     <w:sectPr>
       <w:pgSz w:w="11909" w:h="16834"/>
-      <w:pgMar w:top="518" w:right="749" w:bottom="518" w:left="749" w:header="720" w:footer="720" w:gutter="0"/>
+      <w:pgMar w:top="518" w:right="749" w:bottom="317" w:left="749" w:header="720" w:footer="720" w:gutter="0"/>
       <w:cols w:space="720"/>
       <w:docGrid w:linePitch="360"/>
     </w:sectPr>

</xml_diff>

<commit_message>
docs: rework resume project narratives
</commit_message>
<xml_diff>
--- a/client/public/portfolio-assets/Bharath_Raj_P_Resume.docx
+++ b/client/public/portfolio-assets/Bharath_Raj_P_Resume.docx
@@ -358,7 +358,7 @@
           <w:color w:val="181D1C"/>
           <w:sz w:val="18"/>
         </w:rPr>
-        <w:t>Built a multi-user workspace for collections, file imports, auditability, and workflow building with a React interface and asynchronous FastAPI backend.</w:t>
+        <w:t>Built a React and FastAPI workspace for user-scoped collections and CSV/Excel imports, including schema previews, asynchronous 1,000-record batch ingestion, and activity logging.</w:t>
       </w:r>
     </w:p>
     <w:p>
@@ -378,7 +378,7 @@
           <w:color w:val="181D1C"/>
           <w:sz w:val="18"/>
         </w:rPr>
-        <w:t>Implemented OTP and Google OAuth flows, JWT refresh-token rotation, rate controls, and audit logging to support secure data operations.</w:t>
+        <w:t>Implemented OTP, password, and Google OAuth flows with validation, rate controls, HTTP-only refresh-token cookies, and session rotation for secure account access.</w:t>
       </w:r>
     </w:p>
     <w:p>
@@ -432,7 +432,7 @@
           <w:color w:val="181D1C"/>
           <w:sz w:val="18"/>
         </w:rPr>
-        <w:t>Engineered a local-first AI runtime with provider-neutral routing, capability filtering, tool authorization, persistent memory, and post-condition verification across CLI, web, voice, and automation interfaces for inspectable, bounded automation.</w:t>
+        <w:t>Developed a provider-neutral AI gateway for local and cloud LLMs with policy routing, capability filtering, bounded fallback, cooldown and attempt tracking, AgentRouter delegation, and behavioral tests for deterministic selection and recovery.</w:t>
       </w:r>
     </w:p>
     <w:p>
@@ -486,7 +486,7 @@
           <w:color w:val="181D1C"/>
           <w:sz w:val="18"/>
         </w:rPr>
-        <w:t>Developed a deployed password manager with authentication, validated private credential CRUD, PBKDF2-SHA256 password hashing, and user-bound routing.</w:t>
+        <w:t>Developed and deployed a Flask and SQLite password manager with validated sign-up, Flask-Login sessions, PBKDF2-SHA256 account-password hashing, and user-scoped credential CRUD.</w:t>
       </w:r>
     </w:p>
     <w:p>
@@ -540,7 +540,7 @@
           <w:color w:val="181D1C"/>
           <w:sz w:val="18"/>
         </w:rPr>
-        <w:t>Built a deployed URL shortener that creates and persists unique short-URL mappings with SQLite-backed storage, retrieval workflows, and environment-aware configuration.</w:t>
+        <w:t>Built and deployed a Flask URL shortener that generates six-character links, persists URL mappings with SQLAlchemy and SQLite, resolves stored links for redirects, and supports environment-aware database configuration.</w:t>
       </w:r>
     </w:p>
     <w:p>

</xml_diff>

<commit_message>
docs: reselect resume projects and update location
</commit_message>
<xml_diff>
--- a/client/public/portfolio-assets/Bharath_Raj_P_Resume.docx
+++ b/client/public/portfolio-assets/Bharath_Raj_P_Resume.docx
@@ -39,9 +39,9 @@
       <w:r>
         <w:rPr>
           <w:color w:val="181D1C"/>
-          <w:sz w:val="18"/>
+          <w:sz w:val="17"/>
         </w:rPr>
-        <w:t>Tamil Nadu, India | +91 93445 18573 | bharathraj14120@gmail.com</w:t>
+        <w:t>Natham, Dindigul, Tamil Nadu, India | +91 93445 18573 | bharathraj14120@gmail.com</w:t>
       </w:r>
     </w:p>
     <w:p>
@@ -358,27 +358,7 @@
           <w:color w:val="181D1C"/>
           <w:sz w:val="18"/>
         </w:rPr>
-        <w:t>Built a React and FastAPI workspace for user-scoped collections and CSV/Excel imports, including schema previews, asynchronous 1,000-record batch ingestion, and activity logging.</w:t>
-      </w:r>
-    </w:p>
-    <w:p>
-      <w:pPr>
-        <w:spacing w:before="0" w:after="18" w:line="240" w:lineRule="auto"/>
-        <w:ind w:left="245" w:hanging="187"/>
-      </w:pPr>
-      <w:r>
-        <w:rPr>
-          <w:color w:val="125846"/>
-          <w:sz w:val="18"/>
-        </w:rPr>
-        <w:t xml:space="preserve">• </w:t>
-      </w:r>
-      <w:r>
-        <w:rPr>
-          <w:color w:val="181D1C"/>
-          <w:sz w:val="18"/>
-        </w:rPr>
-        <w:t>Implemented OTP, password, and Google OAuth flows with validation, rate controls, HTTP-only refresh-token cookies, and session rotation for secure account access.</w:t>
+        <w:t>Built a React and FastAPI workspace for user-scoped CSV/Excel import with schema previews, asynchronous 1,000-record batch ingestion, activity logs, and OTP/Google OAuth account flows.</w:t>
       </w:r>
     </w:p>
     <w:p>
@@ -446,7 +426,7 @@
           <w:color w:val="181D1C"/>
           <w:sz w:val="20"/>
         </w:rPr>
-        <w:t>XSECQRE Password Manager</w:t>
+        <w:t>Farmaa</w:t>
       </w:r>
       <w:r>
         <w:rPr>
@@ -454,7 +434,7 @@
           <w:color w:val="505554"/>
           <w:sz w:val="17"/>
         </w:rPr>
-        <w:t xml:space="preserve">  |  Python, Flask, SQLite</w:t>
+        <w:t xml:space="preserve">  |  Flutter, FastAPI, PostgreSQL, SQLAlchemy</w:t>
       </w:r>
     </w:p>
     <w:p>
@@ -466,7 +446,7 @@
           <w:color w:val="125846"/>
           <w:sz w:val="17"/>
         </w:rPr>
-        <w:t>Live: xsecqre.onrender.com | GitHub: github.com/bharathrajp14/XSECQRE-Password-Manager-Web-App</w:t>
+        <w:t>GitHub: github.com/bharathrajp14/farmaa</w:t>
       </w:r>
     </w:p>
     <w:p>
@@ -486,7 +466,7 @@
           <w:color w:val="181D1C"/>
           <w:sz w:val="18"/>
         </w:rPr>
-        <w:t>Developed and deployed a Flask and SQLite password manager with validated sign-up, Flask-Login sessions, PBKDF2-SHA256 account-password hashing, and user-scoped credential CRUD.</w:t>
+        <w:t>Built a Flutter and FastAPI agriculture marketplace with farmer/buyer onboarding, phone OTP and Google authentication, five-minute expiry, phone/IP rate controls, profile flows, and JWT token issuance.</w:t>
       </w:r>
     </w:p>
     <w:p>
@@ -500,7 +480,7 @@
           <w:color w:val="181D1C"/>
           <w:sz w:val="20"/>
         </w:rPr>
-        <w:t>Flask URL Shortener</w:t>
+        <w:t>JobBoard Pro</w:t>
       </w:r>
       <w:r>
         <w:rPr>
@@ -508,7 +488,7 @@
           <w:color w:val="505554"/>
           <w:sz w:val="17"/>
         </w:rPr>
-        <w:t xml:space="preserve">  |  Python, Flask, SQLAlchemy, SQLite</w:t>
+        <w:t xml:space="preserve">  |  React, Supabase, Recharts, AI APIs</w:t>
       </w:r>
     </w:p>
     <w:p>
@@ -520,7 +500,7 @@
           <w:color w:val="125846"/>
           <w:sz w:val="17"/>
         </w:rPr>
-        <w:t>Live: flask-url-shortener-1-aof3.onrender.com | GitHub: github.com/bharathrajp14/flask-url-shortener</w:t>
+        <w:t>GitHub: github.com/bharathrajp14/job_manager</w:t>
       </w:r>
     </w:p>
     <w:p>
@@ -540,7 +520,7 @@
           <w:color w:val="181D1C"/>
           <w:sz w:val="18"/>
         </w:rPr>
-        <w:t>Built and deployed a Flask URL shortener that generates six-character links, persists URL mappings with SQLAlchemy and SQLite, resolves stored links for redirects, and supports environment-aware database configuration.</w:t>
+        <w:t>Built a React and Supabase job tracker with application stages, Excel import/export, funnel analytics, experience-level filters, Adzuna categories, and reusable AI request workflows.</w:t>
       </w:r>
     </w:p>
     <w:p>

</xml_diff>

<commit_message>
docs: add clickable resume references
</commit_message>
<xml_diff>
--- a/client/public/portfolio-assets/Bharath_Raj_P_Resume.docx
+++ b/client/public/portfolio-assets/Bharath_Raj_P_Resume.docx
@@ -49,13 +49,67 @@
         <w:spacing w:before="0" w:after="30" w:line="240" w:lineRule="auto"/>
         <w:jc w:val="center"/>
       </w:pPr>
+      <w:hyperlink r:id="rId9">
+        <w:r>
+          <w:rPr>
+            <w:color w:val="125846"/>
+            <w:u w:val="single"/>
+            <w:sz w:val="16"/>
+          </w:rPr>
+          <w:t>linkedin.com/in/bharathrajp14</w:t>
+        </w:r>
+      </w:hyperlink>
       <w:r>
         <w:rPr>
-          <w:color w:val="125846"/>
+          <w:color w:val="505554"/>
           <w:sz w:val="16"/>
         </w:rPr>
-        <w:t>linkedin.com/in/bharathrajp14 | github.com/bharathrajp14 | www.bharathrajdev.me | Skillrack</w:t>
+        <w:t xml:space="preserve"> | </w:t>
       </w:r>
+      <w:hyperlink r:id="rId10">
+        <w:r>
+          <w:rPr>
+            <w:color w:val="125846"/>
+            <w:u w:val="single"/>
+            <w:sz w:val="16"/>
+          </w:rPr>
+          <w:t>github.com/bharathrajp14</w:t>
+        </w:r>
+      </w:hyperlink>
+      <w:r>
+        <w:rPr>
+          <w:color w:val="505554"/>
+          <w:sz w:val="16"/>
+        </w:rPr>
+        <w:t xml:space="preserve"> | </w:t>
+      </w:r>
+      <w:hyperlink r:id="rId11">
+        <w:r>
+          <w:rPr>
+            <w:color w:val="125846"/>
+            <w:u w:val="single"/>
+            <w:sz w:val="16"/>
+          </w:rPr>
+          <w:t>www.bharathrajdev.me</w:t>
+        </w:r>
+      </w:hyperlink>
+      <w:r>
+        <w:rPr>
+          <w:color w:val="505554"/>
+          <w:sz w:val="16"/>
+        </w:rPr>
+        <w:t xml:space="preserve"> | </w:t>
+      </w:r>
+      <w:hyperlink r:id="rId12">
+        <w:r>
+          <w:rPr>
+            <w:color w:val="125846"/>
+            <w:u w:val="single"/>
+            <w:sz w:val="16"/>
+          </w:rPr>
+          <w:t>skillrack.com/resume</w:t>
+        </w:r>
+      </w:hyperlink>
     </w:p>
     <w:p>
       <w:pPr>
@@ -333,13 +387,16 @@
       <w:pPr>
         <w:spacing w:before="0" w:after="8" w:line="240" w:lineRule="auto"/>
       </w:pPr>
-      <w:r>
-        <w:rPr>
-          <w:color w:val="125846"/>
-          <w:sz w:val="17"/>
-        </w:rPr>
-        <w:t>Live: nexora-sb16.onrender.com | GitHub: github.com/bharathrajp14/nexora</w:t>
-      </w:r>
+      <w:hyperlink r:id="rId13">
+        <w:r>
+          <w:rPr>
+            <w:color w:val="125846"/>
+            <w:u w:val="single"/>
+            <w:sz w:val="17"/>
+          </w:rPr>
+          <w:t>github.com/bharathrajp14/nexora</w:t>
+        </w:r>
+      </w:hyperlink>
     </w:p>
     <w:p>
       <w:pPr>
@@ -387,13 +444,16 @@
       <w:pPr>
         <w:spacing w:before="0" w:after="8" w:line="240" w:lineRule="auto"/>
       </w:pPr>
-      <w:r>
-        <w:rPr>
-          <w:color w:val="125846"/>
-          <w:sz w:val="17"/>
-        </w:rPr>
-        <w:t>GitHub: github.com/bharathrajp14/BrJarvis</w:t>
-      </w:r>
+      <w:hyperlink r:id="rId14">
+        <w:r>
+          <w:rPr>
+            <w:color w:val="125846"/>
+            <w:u w:val="single"/>
+            <w:sz w:val="17"/>
+          </w:rPr>
+          <w:t>github.com/bharathrajp14/BrJarvis</w:t>
+        </w:r>
+      </w:hyperlink>
     </w:p>
     <w:p>
       <w:pPr>
@@ -441,13 +501,16 @@
       <w:pPr>
         <w:spacing w:before="0" w:after="8" w:line="240" w:lineRule="auto"/>
       </w:pPr>
-      <w:r>
-        <w:rPr>
-          <w:color w:val="125846"/>
-          <w:sz w:val="17"/>
-        </w:rPr>
-        <w:t>GitHub: github.com/bharathrajp14/farmaa</w:t>
-      </w:r>
+      <w:hyperlink r:id="rId15">
+        <w:r>
+          <w:rPr>
+            <w:color w:val="125846"/>
+            <w:u w:val="single"/>
+            <w:sz w:val="17"/>
+          </w:rPr>
+          <w:t>github.com/bharathrajp14/farmaa</w:t>
+        </w:r>
+      </w:hyperlink>
     </w:p>
     <w:p>
       <w:pPr>
@@ -495,13 +558,16 @@
       <w:pPr>
         <w:spacing w:before="0" w:after="8" w:line="240" w:lineRule="auto"/>
       </w:pPr>
-      <w:r>
-        <w:rPr>
-          <w:color w:val="125846"/>
-          <w:sz w:val="17"/>
-        </w:rPr>
-        <w:t>GitHub: github.com/bharathrajp14/job_manager</w:t>
-      </w:r>
+      <w:hyperlink r:id="rId16">
+        <w:r>
+          <w:rPr>
+            <w:color w:val="125846"/>
+            <w:u w:val="single"/>
+            <w:sz w:val="17"/>
+          </w:rPr>
+          <w:t>github.com/bharathrajp14/job_manager</w:t>
+        </w:r>
+      </w:hyperlink>
     </w:p>
     <w:p>
       <w:pPr>
@@ -624,8 +690,18 @@
           <w:color w:val="181D1C"/>
           <w:sz w:val="17"/>
         </w:rPr>
-        <w:t>Skillrack programming practice profile | Certificate folder: drive.google.com/drive/folders/1inKzukOlo8xewOLeHHCarF2VwW01aRCH</w:t>
+        <w:t xml:space="preserve">Skillrack programming practice profile | Certificate folder: </w:t>
       </w:r>
+      <w:hyperlink r:id="rId17">
+        <w:r>
+          <w:rPr>
+            <w:color w:val="125846"/>
+            <w:u w:val="single"/>
+            <w:sz w:val="17"/>
+          </w:rPr>
+          <w:t>drive.google.com/drive/folders/1inKzukOlo8xewOLeHHCarF2VwW01aRCH</w:t>
+        </w:r>
+      </w:hyperlink>
     </w:p>
     <w:sectPr>
       <w:pgSz w:w="11909" w:h="16834"/>

</xml_diff>

<commit_message>
docs: improve resume readability and A4 fit
</commit_message>
<xml_diff>
--- a/client/public/portfolio-assets/Bharath_Raj_P_Resume.docx
+++ b/client/public/portfolio-assets/Bharath_Raj_P_Resume.docx
@@ -12,23 +12,9 @@
           <w:rFonts w:ascii="Aptos Display" w:hAnsi="Aptos Display"/>
           <w:b/>
           <w:color w:val="181D1C"/>
-          <w:sz w:val="42"/>
+          <w:sz w:val="43"/>
         </w:rPr>
         <w:t>BHARATH RAJ P</w:t>
-      </w:r>
-    </w:p>
-    <w:p>
-      <w:pPr>
-        <w:spacing w:before="0" w:after="16" w:line="240" w:lineRule="auto"/>
-        <w:jc w:val="center"/>
-      </w:pPr>
-      <w:r>
-        <w:rPr>
-          <w:b/>
-          <w:color w:val="125846"/>
-          <w:sz w:val="20"/>
-        </w:rPr>
-        <w:t>Software Development Intern | Backend, Full-Stack &amp; AI Systems</w:t>
       </w:r>
     </w:p>
     <w:p>
@@ -38,15 +24,29 @@
       </w:pPr>
       <w:r>
         <w:rPr>
+          <w:b/>
+          <w:color w:val="125846"/>
+          <w:sz w:val="21"/>
+        </w:rPr>
+        <w:t>Software Development Intern | Backend, Full-Stack &amp; AI Systems</w:t>
+      </w:r>
+    </w:p>
+    <w:p>
+      <w:pPr>
+        <w:spacing w:before="0" w:after="6" w:line="240" w:lineRule="auto"/>
+        <w:jc w:val="center"/>
+      </w:pPr>
+      <w:r>
+        <w:rPr>
           <w:color w:val="181D1C"/>
-          <w:sz w:val="17"/>
+          <w:sz w:val="18"/>
         </w:rPr>
         <w:t>Natham, Dindigul, Tamil Nadu, India | +91 93445 18573 | bharathraj14120@gmail.com</w:t>
       </w:r>
     </w:p>
     <w:p>
       <w:pPr>
-        <w:spacing w:before="0" w:after="30" w:line="240" w:lineRule="auto"/>
+        <w:spacing w:before="0" w:after="18" w:line="240" w:lineRule="auto"/>
         <w:jc w:val="center"/>
       </w:pPr>
       <w:hyperlink r:id="rId9">
@@ -54,7 +54,7 @@
           <w:rPr>
             <w:color w:val="125846"/>
             <w:u w:val="single"/>
-            <w:sz w:val="16"/>
+            <w:sz w:val="17"/>
           </w:rPr>
           <w:t>linkedin.com/in/bharathrajp14</w:t>
         </w:r>
@@ -62,7 +62,7 @@
       <w:r>
         <w:rPr>
           <w:color w:val="505554"/>
-          <w:sz w:val="16"/>
+          <w:sz w:val="17"/>
         </w:rPr>
         <w:t xml:space="preserve"> | </w:t>
       </w:r>
@@ -71,7 +71,7 @@
           <w:rPr>
             <w:color w:val="125846"/>
             <w:u w:val="single"/>
-            <w:sz w:val="16"/>
+            <w:sz w:val="17"/>
           </w:rPr>
           <w:t>github.com/bharathrajp14</w:t>
         </w:r>
@@ -79,7 +79,7 @@
       <w:r>
         <w:rPr>
           <w:color w:val="505554"/>
-          <w:sz w:val="16"/>
+          <w:sz w:val="17"/>
         </w:rPr>
         <w:t xml:space="preserve"> | </w:t>
       </w:r>
@@ -88,7 +88,7 @@
           <w:rPr>
             <w:color w:val="125846"/>
             <w:u w:val="single"/>
-            <w:sz w:val="16"/>
+            <w:sz w:val="17"/>
           </w:rPr>
           <w:t>www.bharathrajdev.me</w:t>
         </w:r>
@@ -96,7 +96,7 @@
       <w:r>
         <w:rPr>
           <w:color w:val="505554"/>
-          <w:sz w:val="16"/>
+          <w:sz w:val="17"/>
         </w:rPr>
         <w:t xml:space="preserve"> | </w:t>
       </w:r>
@@ -105,7 +105,7 @@
           <w:rPr>
             <w:color w:val="125846"/>
             <w:u w:val="single"/>
-            <w:sz w:val="16"/>
+            <w:sz w:val="17"/>
           </w:rPr>
           <w:t>skillrack.com/resume</w:t>
         </w:r>
@@ -114,7 +114,7 @@
     <w:p>
       <w:pPr>
         <w:keepNext/>
-        <w:spacing w:before="0" w:after="40" w:line="240" w:lineRule="auto"/>
+        <w:spacing w:before="0" w:after="22" w:line="240" w:lineRule="auto"/>
         <w:pBdr>
           <w:bottom w:val="single" w:sz="6" w:space="2" w:color="125846"/>
         </w:pBdr>
@@ -124,27 +124,27 @@
           <w:rFonts w:ascii="Aptos Display" w:hAnsi="Aptos Display"/>
           <w:b/>
           <w:color w:val="125846"/>
-          <w:sz w:val="20"/>
+          <w:sz w:val="21"/>
         </w:rPr>
         <w:t>PROFESSIONAL SUMMARY</w:t>
       </w:r>
     </w:p>
     <w:p>
       <w:pPr>
-        <w:spacing w:before="0" w:after="28" w:line="247" w:lineRule="auto"/>
+        <w:spacing w:before="0" w:after="14" w:line="240" w:lineRule="auto"/>
       </w:pPr>
       <w:r>
         <w:rPr>
           <w:color w:val="181D1C"/>
-          <w:sz w:val="18"/>
+          <w:sz w:val="19"/>
         </w:rPr>
-        <w:t>Software Development Intern with hands-on experience building React modules and REST API–driven workflows. Develops backend, full-stack, and AI-enabled applications using Python, JavaScript, FastAPI, Node.js, Express.js, SQL, and SQLite, with a security-conscious approach to authentication, data handling, automation, and deployed web applications.</w:t>
+        <w:t>Software Development Intern experienced in React modules and REST API–driven workflows. Builds backend, full-stack, and AI-enabled applications using Python, JavaScript, FastAPI, Node.js, Express.js, SQL, and SQLite with a security-conscious approach to authentication, data handling, automation, and deployed web applications.</w:t>
       </w:r>
     </w:p>
     <w:p>
       <w:pPr>
         <w:keepNext/>
-        <w:spacing w:before="60" w:after="40" w:line="240" w:lineRule="auto"/>
+        <w:spacing w:before="48" w:after="22" w:line="240" w:lineRule="auto"/>
         <w:pBdr>
           <w:bottom w:val="single" w:sz="6" w:space="2" w:color="125846"/>
         </w:pBdr>
@@ -154,31 +154,31 @@
           <w:rFonts w:ascii="Aptos Display" w:hAnsi="Aptos Display"/>
           <w:b/>
           <w:color w:val="125846"/>
-          <w:sz w:val="20"/>
+          <w:sz w:val="21"/>
         </w:rPr>
         <w:t>TECHNICAL SKILLS</w:t>
       </w:r>
     </w:p>
     <w:p>
       <w:pPr>
-        <w:spacing w:before="0" w:after="16" w:line="247" w:lineRule="auto"/>
+        <w:spacing w:before="0" w:after="9" w:line="240" w:lineRule="auto"/>
       </w:pPr>
       <w:r>
         <w:rPr>
           <w:color w:val="181D1C"/>
-          <w:sz w:val="18"/>
+          <w:sz w:val="19"/>
         </w:rPr>
         <w:t>Languages: Python, JavaScript, C, Java, SQL | Frontend: React, HTML5, CSS3 | Backend: REST APIs, Express.js, Node.js</w:t>
       </w:r>
     </w:p>
     <w:p>
       <w:pPr>
-        <w:spacing w:before="0" w:after="20" w:line="247" w:lineRule="auto"/>
+        <w:spacing w:before="0" w:after="11" w:line="240" w:lineRule="auto"/>
       </w:pPr>
       <w:r>
         <w:rPr>
           <w:color w:val="181D1C"/>
-          <w:sz w:val="18"/>
+          <w:sz w:val="19"/>
         </w:rPr>
         <w:t>Database: MongoDB, DBMS | Tools &amp; Platforms: Git, GitHub, Postman, VS Code, Claude, Linux/Unix | Soft Skills: Problem Solving, Quick Learner, Team Collaboration, Responsible AI Tool Usage</w:t>
       </w:r>
@@ -186,7 +186,7 @@
     <w:p>
       <w:pPr>
         <w:keepNext/>
-        <w:spacing w:before="60" w:after="40" w:line="240" w:lineRule="auto"/>
+        <w:spacing w:before="48" w:after="22" w:line="240" w:lineRule="auto"/>
         <w:pBdr>
           <w:bottom w:val="single" w:sz="6" w:space="2" w:color="125846"/>
         </w:pBdr>
@@ -196,7 +196,7 @@
           <w:rFonts w:ascii="Aptos Display" w:hAnsi="Aptos Display"/>
           <w:b/>
           <w:color w:val="125846"/>
-          <w:sz w:val="20"/>
+          <w:sz w:val="21"/>
         </w:rPr>
         <w:t>PROFESSIONAL EXPERIENCE</w:t>
       </w:r>
@@ -204,7 +204,7 @@
     <w:p>
       <w:pPr>
         <w:keepNext/>
-        <w:spacing w:before="60" w:after="10" w:line="240" w:lineRule="auto"/>
+        <w:spacing w:before="48" w:after="5" w:line="240" w:lineRule="auto"/>
       </w:pPr>
       <w:r>
         <w:rPr>
@@ -224,68 +224,48 @@
     </w:p>
     <w:p>
       <w:pPr>
-        <w:spacing w:before="0" w:after="18" w:line="240" w:lineRule="auto"/>
+        <w:spacing w:before="0" w:after="9" w:line="238" w:lineRule="auto"/>
         <w:ind w:left="245" w:hanging="187"/>
       </w:pPr>
       <w:r>
         <w:rPr>
           <w:color w:val="125846"/>
-          <w:sz w:val="18"/>
+          <w:sz w:val="19"/>
         </w:rPr>
         <w:t xml:space="preserve">• </w:t>
       </w:r>
       <w:r>
         <w:rPr>
           <w:color w:val="181D1C"/>
-          <w:sz w:val="18"/>
+          <w:sz w:val="19"/>
         </w:rPr>
-        <w:t>Develop React modules and integrate REST API workflows across authentication, vendor management, notifications, payments, and wallet functionality.</w:t>
+        <w:t>Build React modules and integrate REST API workflows across authentication, vendor management, notifications, payments, and wallet features.</w:t>
       </w:r>
     </w:p>
     <w:p>
       <w:pPr>
-        <w:spacing w:before="0" w:after="18" w:line="240" w:lineRule="auto"/>
+        <w:spacing w:before="0" w:after="9" w:line="238" w:lineRule="auto"/>
         <w:ind w:left="245" w:hanging="187"/>
       </w:pPr>
       <w:r>
         <w:rPr>
           <w:color w:val="125846"/>
-          <w:sz w:val="18"/>
+          <w:sz w:val="19"/>
         </w:rPr>
         <w:t xml:space="preserve">• </w:t>
       </w:r>
       <w:r>
         <w:rPr>
           <w:color w:val="181D1C"/>
-          <w:sz w:val="18"/>
+          <w:sz w:val="19"/>
         </w:rPr>
-        <w:t>Collaborate with backend developers to validate API-driven user journeys, debug full-stack workflows, and manage changes through Git-based team practices.</w:t>
-      </w:r>
-    </w:p>
-    <w:p>
-      <w:pPr>
-        <w:spacing w:before="0" w:after="18" w:line="240" w:lineRule="auto"/>
-        <w:ind w:left="245" w:hanging="187"/>
-      </w:pPr>
-      <w:r>
-        <w:rPr>
-          <w:color w:val="125846"/>
-          <w:sz w:val="18"/>
-        </w:rPr>
-        <w:t xml:space="preserve">• </w:t>
-      </w:r>
-      <w:r>
-        <w:rPr>
-          <w:color w:val="181D1C"/>
-          <w:sz w:val="18"/>
-        </w:rPr>
-        <w:t>Support feature delivery across connected frontend and backend modules with attention to reliable user-facing behavior and maintainable integration patterns.</w:t>
+        <w:t>Collaborate with backend developers to validate API journeys, debug full-stack behavior, and ship maintainable changes through Git-based team workflows.</w:t>
       </w:r>
     </w:p>
     <w:p>
       <w:pPr>
         <w:keepNext/>
-        <w:spacing w:before="60" w:after="10" w:line="240" w:lineRule="auto"/>
+        <w:spacing w:before="48" w:after="5" w:line="240" w:lineRule="auto"/>
       </w:pPr>
       <w:r>
         <w:rPr>
@@ -305,48 +285,48 @@
     </w:p>
     <w:p>
       <w:pPr>
-        <w:spacing w:before="0" w:after="18" w:line="240" w:lineRule="auto"/>
+        <w:spacing w:before="0" w:after="9" w:line="238" w:lineRule="auto"/>
         <w:ind w:left="245" w:hanging="187"/>
       </w:pPr>
       <w:r>
         <w:rPr>
           <w:color w:val="125846"/>
-          <w:sz w:val="18"/>
+          <w:sz w:val="19"/>
         </w:rPr>
         <w:t xml:space="preserve">• </w:t>
       </w:r>
       <w:r>
         <w:rPr>
           <w:color w:val="181D1C"/>
-          <w:sz w:val="18"/>
+          <w:sz w:val="19"/>
         </w:rPr>
-        <w:t>Completed controlled training in ethical-hacking fundamentals, SQL injection, cross-site scripting, cross-site request forgery, and vulnerability reporting concepts.</w:t>
+        <w:t>Completed controlled training in ethical-hacking fundamentals, SQL injection, cross-site scripting, cross-site request forgery, and vulnerability reporting.</w:t>
       </w:r>
     </w:p>
     <w:p>
       <w:pPr>
-        <w:spacing w:before="0" w:after="18" w:line="240" w:lineRule="auto"/>
+        <w:spacing w:before="0" w:after="9" w:line="238" w:lineRule="auto"/>
         <w:ind w:left="245" w:hanging="187"/>
       </w:pPr>
       <w:r>
         <w:rPr>
           <w:color w:val="125846"/>
-          <w:sz w:val="18"/>
+          <w:sz w:val="19"/>
         </w:rPr>
         <w:t xml:space="preserve">• </w:t>
       </w:r>
       <w:r>
         <w:rPr>
           <w:color w:val="181D1C"/>
-          <w:sz w:val="18"/>
+          <w:sz w:val="19"/>
         </w:rPr>
-        <w:t>Applied web-security concepts through structured lab practice and documented foundational observations for safer application development.</w:t>
+        <w:t>Applied web-security concepts in structured labs and documented observations for safer application development.</w:t>
       </w:r>
     </w:p>
     <w:p>
       <w:pPr>
         <w:keepNext/>
-        <w:spacing w:before="60" w:after="40" w:line="240" w:lineRule="auto"/>
+        <w:spacing w:before="48" w:after="22" w:line="240" w:lineRule="auto"/>
         <w:pBdr>
           <w:bottom w:val="single" w:sz="6" w:space="2" w:color="125846"/>
         </w:pBdr>
@@ -356,7 +336,7 @@
           <w:rFonts w:ascii="Aptos Display" w:hAnsi="Aptos Display"/>
           <w:b/>
           <w:color w:val="125846"/>
-          <w:sz w:val="20"/>
+          <w:sz w:val="21"/>
         </w:rPr>
         <w:t>SELECTED PROJECTS</w:t>
       </w:r>
@@ -364,13 +344,13 @@
     <w:p>
       <w:pPr>
         <w:keepNext/>
-        <w:spacing w:before="64" w:after="0" w:line="240" w:lineRule="auto"/>
+        <w:spacing w:before="50" w:after="0" w:line="240" w:lineRule="auto"/>
       </w:pPr>
       <w:r>
         <w:rPr>
           <w:b/>
           <w:color w:val="181D1C"/>
-          <w:sz w:val="20"/>
+          <w:sz w:val="21"/>
         </w:rPr>
         <w:t>NEXORA</w:t>
       </w:r>
@@ -378,14 +358,14 @@
         <w:rPr>
           <w:i/>
           <w:color w:val="505554"/>
-          <w:sz w:val="17"/>
+          <w:sz w:val="18"/>
         </w:rPr>
         <w:t xml:space="preserve">  |  React, TypeScript, FastAPI, PostgreSQL, SQLAlchemy</w:t>
       </w:r>
     </w:p>
     <w:p>
       <w:pPr>
-        <w:spacing w:before="0" w:after="8" w:line="240" w:lineRule="auto"/>
+        <w:spacing w:before="0" w:after="4" w:line="240" w:lineRule="auto"/>
       </w:pPr>
       <w:hyperlink r:id="rId13">
         <w:r>
@@ -400,34 +380,34 @@
     </w:p>
     <w:p>
       <w:pPr>
-        <w:spacing w:before="0" w:after="18" w:line="240" w:lineRule="auto"/>
+        <w:spacing w:before="0" w:after="9" w:line="238" w:lineRule="auto"/>
         <w:ind w:left="245" w:hanging="187"/>
       </w:pPr>
       <w:r>
         <w:rPr>
           <w:color w:val="125846"/>
-          <w:sz w:val="18"/>
+          <w:sz w:val="19"/>
         </w:rPr>
         <w:t xml:space="preserve">• </w:t>
       </w:r>
       <w:r>
         <w:rPr>
           <w:color w:val="181D1C"/>
-          <w:sz w:val="18"/>
+          <w:sz w:val="19"/>
         </w:rPr>
-        <w:t>Built a React and FastAPI workspace for user-scoped CSV/Excel import with schema previews, asynchronous 1,000-record batch ingestion, activity logs, and OTP/Google OAuth account flows.</w:t>
+        <w:t>Built a React and FastAPI workspace for user-scoped CSV/Excel imports, schema previews, 1,000-record batch ingestion, activity logs, and OTP/Google OAuth.</w:t>
       </w:r>
     </w:p>
     <w:p>
       <w:pPr>
         <w:keepNext/>
-        <w:spacing w:before="64" w:after="0" w:line="240" w:lineRule="auto"/>
+        <w:spacing w:before="50" w:after="0" w:line="240" w:lineRule="auto"/>
       </w:pPr>
       <w:r>
         <w:rPr>
           <w:b/>
           <w:color w:val="181D1C"/>
-          <w:sz w:val="20"/>
+          <w:sz w:val="21"/>
         </w:rPr>
         <w:t>BR JARVIS</w:t>
       </w:r>
@@ -435,14 +415,14 @@
         <w:rPr>
           <w:i/>
           <w:color w:val="505554"/>
-          <w:sz w:val="17"/>
+          <w:sz w:val="18"/>
         </w:rPr>
         <w:t xml:space="preserve">  |  Python, FastAPI, SQLite, LLM Routing</w:t>
       </w:r>
     </w:p>
     <w:p>
       <w:pPr>
-        <w:spacing w:before="0" w:after="8" w:line="240" w:lineRule="auto"/>
+        <w:spacing w:before="0" w:after="4" w:line="240" w:lineRule="auto"/>
       </w:pPr>
       <w:hyperlink r:id="rId14">
         <w:r>
@@ -457,34 +437,34 @@
     </w:p>
     <w:p>
       <w:pPr>
-        <w:spacing w:before="0" w:after="18" w:line="240" w:lineRule="auto"/>
+        <w:spacing w:before="0" w:after="9" w:line="238" w:lineRule="auto"/>
         <w:ind w:left="245" w:hanging="187"/>
       </w:pPr>
       <w:r>
         <w:rPr>
           <w:color w:val="125846"/>
-          <w:sz w:val="18"/>
+          <w:sz w:val="19"/>
         </w:rPr>
         <w:t xml:space="preserve">• </w:t>
       </w:r>
       <w:r>
         <w:rPr>
           <w:color w:val="181D1C"/>
-          <w:sz w:val="18"/>
+          <w:sz w:val="19"/>
         </w:rPr>
-        <w:t>Developed a provider-neutral AI gateway for local and cloud LLMs with policy routing, capability filtering, bounded fallback, cooldown and attempt tracking, AgentRouter delegation, and behavioral tests for deterministic selection and recovery.</w:t>
+        <w:t>Built a provider-neutral AI gateway for local and cloud LLMs with policy routing, capability filtering, fallback and cooldown tracking, AgentRouter delegation, and behavioral tests.</w:t>
       </w:r>
     </w:p>
     <w:p>
       <w:pPr>
         <w:keepNext/>
-        <w:spacing w:before="64" w:after="0" w:line="240" w:lineRule="auto"/>
+        <w:spacing w:before="50" w:after="0" w:line="240" w:lineRule="auto"/>
       </w:pPr>
       <w:r>
         <w:rPr>
           <w:b/>
           <w:color w:val="181D1C"/>
-          <w:sz w:val="20"/>
+          <w:sz w:val="21"/>
         </w:rPr>
         <w:t>Farmaa</w:t>
       </w:r>
@@ -492,14 +472,14 @@
         <w:rPr>
           <w:i/>
           <w:color w:val="505554"/>
-          <w:sz w:val="17"/>
+          <w:sz w:val="18"/>
         </w:rPr>
         <w:t xml:space="preserve">  |  Flutter, FastAPI, PostgreSQL, SQLAlchemy</w:t>
       </w:r>
     </w:p>
     <w:p>
       <w:pPr>
-        <w:spacing w:before="0" w:after="8" w:line="240" w:lineRule="auto"/>
+        <w:spacing w:before="0" w:after="4" w:line="240" w:lineRule="auto"/>
       </w:pPr>
       <w:hyperlink r:id="rId15">
         <w:r>
@@ -514,34 +494,34 @@
     </w:p>
     <w:p>
       <w:pPr>
-        <w:spacing w:before="0" w:after="18" w:line="240" w:lineRule="auto"/>
+        <w:spacing w:before="0" w:after="9" w:line="238" w:lineRule="auto"/>
         <w:ind w:left="245" w:hanging="187"/>
       </w:pPr>
       <w:r>
         <w:rPr>
           <w:color w:val="125846"/>
-          <w:sz w:val="18"/>
+          <w:sz w:val="19"/>
         </w:rPr>
         <w:t xml:space="preserve">• </w:t>
       </w:r>
       <w:r>
         <w:rPr>
           <w:color w:val="181D1C"/>
-          <w:sz w:val="18"/>
+          <w:sz w:val="19"/>
         </w:rPr>
-        <w:t>Built a Flutter and FastAPI agriculture marketplace with farmer/buyer onboarding, phone OTP and Google authentication, five-minute expiry, phone/IP rate controls, profile flows, and JWT token issuance.</w:t>
+        <w:t>Built a Flutter and FastAPI agriculture marketplace with farmer/buyer onboarding, phone OTP and Google authentication, expiry and rate controls, profiles, and JWT issuance.</w:t>
       </w:r>
     </w:p>
     <w:p>
       <w:pPr>
         <w:keepNext/>
-        <w:spacing w:before="64" w:after="0" w:line="240" w:lineRule="auto"/>
+        <w:spacing w:before="50" w:after="0" w:line="240" w:lineRule="auto"/>
       </w:pPr>
       <w:r>
         <w:rPr>
           <w:b/>
           <w:color w:val="181D1C"/>
-          <w:sz w:val="20"/>
+          <w:sz w:val="21"/>
         </w:rPr>
         <w:t>JobBoard Pro</w:t>
       </w:r>
@@ -549,14 +529,14 @@
         <w:rPr>
           <w:i/>
           <w:color w:val="505554"/>
-          <w:sz w:val="17"/>
+          <w:sz w:val="18"/>
         </w:rPr>
         <w:t xml:space="preserve">  |  React, Supabase, Recharts, AI APIs</w:t>
       </w:r>
     </w:p>
     <w:p>
       <w:pPr>
-        <w:spacing w:before="0" w:after="8" w:line="240" w:lineRule="auto"/>
+        <w:spacing w:before="0" w:after="4" w:line="240" w:lineRule="auto"/>
       </w:pPr>
       <w:hyperlink r:id="rId16">
         <w:r>
@@ -571,28 +551,28 @@
     </w:p>
     <w:p>
       <w:pPr>
-        <w:spacing w:before="0" w:after="18" w:line="240" w:lineRule="auto"/>
+        <w:spacing w:before="0" w:after="9" w:line="238" w:lineRule="auto"/>
         <w:ind w:left="245" w:hanging="187"/>
       </w:pPr>
       <w:r>
         <w:rPr>
           <w:color w:val="125846"/>
-          <w:sz w:val="18"/>
+          <w:sz w:val="19"/>
         </w:rPr>
         <w:t xml:space="preserve">• </w:t>
       </w:r>
       <w:r>
         <w:rPr>
           <w:color w:val="181D1C"/>
-          <w:sz w:val="18"/>
+          <w:sz w:val="19"/>
         </w:rPr>
-        <w:t>Built a React and Supabase job tracker with application stages, Excel import/export, funnel analytics, experience-level filters, Adzuna categories, and reusable AI request workflows.</w:t>
+        <w:t>Built a React and Supabase job tracker with application stages, Excel import/export, funnel analytics, filters, Adzuna categories, and reusable AI workflows.</w:t>
       </w:r>
     </w:p>
     <w:p>
       <w:pPr>
         <w:keepNext/>
-        <w:spacing w:before="60" w:after="40" w:line="240" w:lineRule="auto"/>
+        <w:spacing w:before="48" w:after="22" w:line="240" w:lineRule="auto"/>
         <w:pBdr>
           <w:bottom w:val="single" w:sz="6" w:space="2" w:color="125846"/>
         </w:pBdr>
@@ -602,34 +582,34 @@
           <w:rFonts w:ascii="Aptos Display" w:hAnsi="Aptos Display"/>
           <w:b/>
           <w:color w:val="125846"/>
-          <w:sz w:val="20"/>
+          <w:sz w:val="21"/>
         </w:rPr>
         <w:t>EDUCATION</w:t>
       </w:r>
     </w:p>
     <w:p>
       <w:pPr>
-        <w:spacing w:before="0" w:after="6" w:line="247" w:lineRule="auto"/>
+        <w:spacing w:before="0" w:after="3" w:line="240" w:lineRule="auto"/>
       </w:pPr>
       <w:r>
         <w:rPr>
           <w:b/>
           <w:color w:val="181D1C"/>
-          <w:sz w:val="18"/>
+          <w:sz w:val="19"/>
         </w:rPr>
         <w:t>B.E. Computer Science &amp; Engineering</w:t>
       </w:r>
       <w:r>
         <w:rPr>
           <w:color w:val="181D1C"/>
-          <w:sz w:val="18"/>
+          <w:sz w:val="19"/>
         </w:rPr>
         <w:t xml:space="preserve"> | Expected May 2026 | CGPA: 7.0 / 10.0 | PSNA College of Engineering and Technology</w:t>
       </w:r>
     </w:p>
     <w:p>
       <w:pPr>
-        <w:spacing w:before="0" w:after="6" w:line="247" w:lineRule="auto"/>
+        <w:spacing w:before="0" w:after="3" w:line="240" w:lineRule="auto"/>
       </w:pPr>
       <w:r>
         <w:rPr>
@@ -641,7 +621,7 @@
     </w:p>
     <w:p>
       <w:pPr>
-        <w:spacing w:before="0" w:after="8" w:line="247" w:lineRule="auto"/>
+        <w:spacing w:before="0" w:after="4" w:line="240" w:lineRule="auto"/>
       </w:pPr>
       <w:r>
         <w:rPr>
@@ -654,7 +634,7 @@
     <w:p>
       <w:pPr>
         <w:keepNext/>
-        <w:spacing w:before="60" w:after="40" w:line="240" w:lineRule="auto"/>
+        <w:spacing w:before="48" w:after="22" w:line="240" w:lineRule="auto"/>
         <w:pBdr>
           <w:bottom w:val="single" w:sz="6" w:space="2" w:color="125846"/>
         </w:pBdr>
@@ -664,19 +644,19 @@
           <w:rFonts w:ascii="Aptos Display" w:hAnsi="Aptos Display"/>
           <w:b/>
           <w:color w:val="125846"/>
-          <w:sz w:val="20"/>
+          <w:sz w:val="21"/>
         </w:rPr>
         <w:t>CERTIFICATIONS AND PROGRAMMING PRACTICE</w:t>
       </w:r>
     </w:p>
     <w:p>
       <w:pPr>
-        <w:spacing w:before="0" w:after="14" w:line="240" w:lineRule="auto"/>
+        <w:spacing w:before="0" w:after="7" w:line="238" w:lineRule="auto"/>
       </w:pPr>
       <w:r>
         <w:rPr>
           <w:color w:val="181D1C"/>
-          <w:sz w:val="17"/>
+          <w:sz w:val="18"/>
         </w:rPr>
         <w:t>Cloud Security Fundamentals — Palo Alto Networks Cybersecurity Academy (2025) | Introduction to IoT and Digital Transformation — Cisco Networking Academy (2025) | Git Training — EduPyramids, SINE, IIT Bombay (2025) | Database Programming with SQL — Oracle Academy (2024) | Python Basic and Java Basic — Digilabs (2024).</w:t>
       </w:r>
@@ -688,7 +668,7 @@
       <w:r>
         <w:rPr>
           <w:color w:val="181D1C"/>
-          <w:sz w:val="17"/>
+          <w:sz w:val="18"/>
         </w:rPr>
         <w:t xml:space="preserve">Skillrack programming practice profile | Certificate folder: </w:t>
       </w:r>
@@ -697,7 +677,7 @@
           <w:rPr>
             <w:color w:val="125846"/>
             <w:u w:val="single"/>
-            <w:sz w:val="17"/>
+            <w:sz w:val="18"/>
           </w:rPr>
           <w:t>drive.google.com/drive/folders/1inKzukOlo8xewOLeHHCarF2VwW01aRCH</w:t>
         </w:r>
@@ -705,7 +685,7 @@
     </w:p>
     <w:sectPr>
       <w:pgSz w:w="11909" w:h="16834"/>
-      <w:pgMar w:top="518" w:right="749" w:bottom="317" w:left="749" w:header="720" w:footer="720" w:gutter="0"/>
+      <w:pgMar w:top="518" w:right="677" w:bottom="317" w:left="677" w:header="720" w:footer="720" w:gutter="0"/>
       <w:cols w:space="720"/>
       <w:docGrid w:linePitch="360"/>
     </w:sectPr>

</xml_diff>